<commit_message>
Corrige el manual de AWS para que abra en Microsoft Word
</commit_message>
<xml_diff>
--- a/docs/Manual_Despliegue_AWS_TubeYou.docx
+++ b/docs/Manual_Despliegue_AWS_TubeYou.docx
@@ -3670,8 +3670,97 @@
         <w:t xml:space="preserve">0. LIMPIEZA DE INFRAESTRUCTURA PREVIA (TEARDOWN)</w:t>
       </w:r>
     </w:p>
-    <rootKey>w:tbl</rootKey>
-    <rootKey>w:p</rootKey>
+    <w:tbl>
+      <w:tblPr>
+        <w:tblW w:type="dxa" w:w="9360"/>
+        <w:tblBorders>
+          <w:top w:val="single" w:color="auto" w:sz="4"/>
+          <w:left w:val="single" w:color="auto" w:sz="4"/>
+          <w:bottom w:val="single" w:color="auto" w:sz="4"/>
+          <w:right w:val="single" w:color="auto" w:sz="4"/>
+          <w:insideH w:val="single" w:color="auto" w:sz="4"/>
+          <w:insideV w:val="single" w:color="auto" w:sz="4"/>
+        </w:tblBorders>
+      </w:tblPr>
+      <w:tblGrid>
+        <w:gridCol w:w="9360"/>
+      </w:tblGrid>
+      <w:tr>
+        <w:trPr>
+          <w:cantSplit/>
+        </w:trPr>
+        <w:tc>
+          <w:tcPr>
+            <w:tcW w:type="dxa" w:w="9360"/>
+            <w:tcBorders>
+              <w:top w:val="single" w:color="EFF6FF" w:sz="4"/>
+              <w:left w:val="single" w:color="2563EB" w:sz="24"/>
+              <w:bottom w:val="single" w:color="EFF6FF" w:sz="4"/>
+              <w:right w:val="single" w:color="EFF6FF" w:sz="4"/>
+            </w:tcBorders>
+            <w:shd w:fill="EFF6FF" w:color="auto" w:val="clear"/>
+            <w:tcMar>
+              <w:top w:type="dxa" w:w="100"/>
+              <w:left w:type="dxa" w:w="160"/>
+              <w:bottom w:type="dxa" w:w="100"/>
+              <w:right w:type="dxa" w:w="140"/>
+            </w:tcMar>
+          </w:tcPr>
+          <w:p>
+            <w:pPr>
+              <w:spacing w:after="60"/>
+            </w:pPr>
+            <w:r>
+              <w:rPr>
+                <w:rFonts w:ascii="Calibri" w:cs="Calibri" w:eastAsia="Calibri" w:hAnsi="Calibri"/>
+                <w:b/>
+                <w:bCs/>
+                <w:color w:val="2563EB"/>
+                <w:sz w:val="21"/>
+                <w:szCs w:val="21"/>
+              </w:rPr>
+              <w:t xml:space="preserve">INFO: ¿Necesitas este bloque?</w:t>
+            </w:r>
+          </w:p>
+          <w:p>
+            <w:pPr>
+              <w:spacing w:after="50" w:line="264"/>
+            </w:pPr>
+            <w:r>
+              <w:rPr>
+                <w:rFonts w:ascii="Calibri" w:cs="Calibri" w:eastAsia="Calibri" w:hAnsi="Calibri"/>
+                <w:sz w:val="21"/>
+                <w:szCs w:val="21"/>
+              </w:rPr>
+              <w:t xml:space="preserve">Solo si ya creaste recursos en AWS en un intento anterior. Si tu cuenta está limpia, </w:t>
+            </w:r>
+            <w:r>
+              <w:rPr>
+                <w:rFonts w:ascii="Calibri" w:cs="Calibri" w:eastAsia="Calibri" w:hAnsi="Calibri"/>
+                <w:b/>
+                <w:bCs/>
+                <w:sz w:val="21"/>
+                <w:szCs w:val="21"/>
+              </w:rPr>
+              <w:t xml:space="preserve">salta al Capítulo 1</w:t>
+            </w:r>
+            <w:r>
+              <w:rPr>
+                <w:rFonts w:ascii="Calibri" w:cs="Calibri" w:eastAsia="Calibri" w:hAnsi="Calibri"/>
+                <w:sz w:val="21"/>
+                <w:szCs w:val="21"/>
+              </w:rPr>
+              <w:t xml:space="preserve">.</w:t>
+            </w:r>
+          </w:p>
+        </w:tc>
+      </w:tr>
+    </w:tbl>
+    <w:p>
+      <w:pPr>
+        <w:spacing w:after="100"/>
+      </w:pPr>
+    </w:p>
     <w:p>
       <w:pPr>
         <w:spacing w:after="120" w:line="276"/>
@@ -4606,8 +4695,151 @@
         <w:t xml:space="preserve">Paso 0.4 · Eliminar los Security Groups</w:t>
       </w:r>
     </w:p>
-    <rootKey>w:tbl</rootKey>
-    <rootKey>w:p</rootKey>
+    <w:tbl>
+      <w:tblPr>
+        <w:tblW w:type="dxa" w:w="9360"/>
+        <w:tblBorders>
+          <w:top w:val="single" w:color="auto" w:sz="4"/>
+          <w:left w:val="single" w:color="auto" w:sz="4"/>
+          <w:bottom w:val="single" w:color="auto" w:sz="4"/>
+          <w:right w:val="single" w:color="auto" w:sz="4"/>
+          <w:insideH w:val="single" w:color="auto" w:sz="4"/>
+          <w:insideV w:val="single" w:color="auto" w:sz="4"/>
+        </w:tblBorders>
+      </w:tblPr>
+      <w:tblGrid>
+        <w:gridCol w:w="9360"/>
+      </w:tblGrid>
+      <w:tr>
+        <w:trPr>
+          <w:cantSplit/>
+        </w:trPr>
+        <w:tc>
+          <w:tcPr>
+            <w:tcW w:type="dxa" w:w="9360"/>
+            <w:tcBorders>
+              <w:top w:val="single" w:color="FFFBEB" w:sz="4"/>
+              <w:left w:val="single" w:color="D97706" w:sz="24"/>
+              <w:bottom w:val="single" w:color="FFFBEB" w:sz="4"/>
+              <w:right w:val="single" w:color="FFFBEB" w:sz="4"/>
+            </w:tcBorders>
+            <w:shd w:fill="FFFBEB" w:color="auto" w:val="clear"/>
+            <w:tcMar>
+              <w:top w:type="dxa" w:w="100"/>
+              <w:left w:type="dxa" w:w="160"/>
+              <w:bottom w:type="dxa" w:w="100"/>
+              <w:right w:type="dxa" w:w="140"/>
+            </w:tcMar>
+          </w:tcPr>
+          <w:p>
+            <w:pPr>
+              <w:spacing w:after="60"/>
+            </w:pPr>
+            <w:r>
+              <w:rPr>
+                <w:rFonts w:ascii="Calibri" w:cs="Calibri" w:eastAsia="Calibri" w:hAnsi="Calibri"/>
+                <w:b/>
+                <w:bCs/>
+                <w:color w:val="D97706"/>
+                <w:sz w:val="21"/>
+                <w:szCs w:val="21"/>
+              </w:rPr>
+              <w:t xml:space="preserve">ATENCION: Por qué falla borrar un Security Group</w:t>
+            </w:r>
+          </w:p>
+          <w:p>
+            <w:pPr>
+              <w:spacing w:after="50" w:line="264"/>
+            </w:pPr>
+            <w:r>
+              <w:rPr>
+                <w:rFonts w:ascii="Calibri" w:cs="Calibri" w:eastAsia="Calibri" w:hAnsi="Calibri"/>
+                <w:sz w:val="21"/>
+                <w:szCs w:val="21"/>
+              </w:rPr>
+              <w:t xml:space="preserve">Si intentas borrar </w:t>
+            </w:r>
+            <w:r>
+              <w:rPr>
+                <w:rFonts w:ascii="Consolas" w:cs="Consolas" w:eastAsia="Consolas" w:hAnsi="Consolas"/>
+                <w:color w:val="9F1239"/>
+                <w:sz w:val="19"/>
+                <w:szCs w:val="19"/>
+                <w:shd w:fill="F3F4F6" w:color="auto" w:val="clear"/>
+              </w:rPr>
+              <w:t xml:space="preserve">ec2-backend-sg</w:t>
+            </w:r>
+            <w:r>
+              <w:rPr>
+                <w:rFonts w:ascii="Calibri" w:cs="Calibri" w:eastAsia="Calibri" w:hAnsi="Calibri"/>
+                <w:sz w:val="21"/>
+                <w:szCs w:val="21"/>
+              </w:rPr>
+              <w:t xml:space="preserve"> y AWS dice </w:t>
+            </w:r>
+            <w:r>
+              <w:rPr>
+                <w:rFonts w:ascii="Calibri" w:cs="Calibri" w:eastAsia="Calibri" w:hAnsi="Calibri"/>
+                <w:i/>
+                <w:iCs/>
+                <w:sz w:val="21"/>
+                <w:szCs w:val="21"/>
+              </w:rPr>
+              <w:t xml:space="preserve">Cannot delete security group: It is referenced by other security groups</w:t>
+            </w:r>
+            <w:r>
+              <w:rPr>
+                <w:rFonts w:ascii="Calibri" w:cs="Calibri" w:eastAsia="Calibri" w:hAnsi="Calibri"/>
+                <w:sz w:val="21"/>
+                <w:szCs w:val="21"/>
+              </w:rPr>
+              <w:t xml:space="preserve">, es porque la regla de entrada de </w:t>
+            </w:r>
+            <w:r>
+              <w:rPr>
+                <w:rFonts w:ascii="Consolas" w:cs="Consolas" w:eastAsia="Consolas" w:hAnsi="Consolas"/>
+                <w:color w:val="9F1239"/>
+                <w:sz w:val="19"/>
+                <w:szCs w:val="19"/>
+                <w:shd w:fill="F3F4F6" w:color="auto" w:val="clear"/>
+              </w:rPr>
+              <w:t xml:space="preserve">rds-postgres-sg</w:t>
+            </w:r>
+            <w:r>
+              <w:rPr>
+                <w:rFonts w:ascii="Calibri" w:cs="Calibri" w:eastAsia="Calibri" w:hAnsi="Calibri"/>
+                <w:sz w:val="21"/>
+                <w:szCs w:val="21"/>
+              </w:rPr>
+              <w:t xml:space="preserve"> tiene a </w:t>
+            </w:r>
+            <w:r>
+              <w:rPr>
+                <w:rFonts w:ascii="Consolas" w:cs="Consolas" w:eastAsia="Consolas" w:hAnsi="Consolas"/>
+                <w:color w:val="9F1239"/>
+                <w:sz w:val="19"/>
+                <w:szCs w:val="19"/>
+                <w:shd w:fill="F3F4F6" w:color="auto" w:val="clear"/>
+              </w:rPr>
+              <w:t xml:space="preserve">ec2-backend-sg</w:t>
+            </w:r>
+            <w:r>
+              <w:rPr>
+                <w:rFonts w:ascii="Calibri" w:cs="Calibri" w:eastAsia="Calibri" w:hAnsi="Calibri"/>
+                <w:sz w:val="21"/>
+                <w:szCs w:val="21"/>
+              </w:rPr>
+              <w:t xml:space="preserve"> como origen. Hay que romper ese enlace primero.</w:t>
+            </w:r>
+          </w:p>
+        </w:tc>
+      </w:tr>
+    </w:tbl>
+    <w:p>
+      <w:pPr>
+        <w:spacing w:after="100"/>
+      </w:pPr>
+    </w:p>
     <w:p>
       <w:pPr>
         <w:pStyle w:val="ListParagraph"/>
@@ -13062,8 +13294,223 @@
         <w:t xml:space="preserve">BLOQUE 3: POLÍTICAS Y ROLES IAM PARA LA EC2</w:t>
       </w:r>
     </w:p>
-    <rootKey>w:tbl</rootKey>
-    <rootKey>w:p</rootKey>
+    <w:tbl>
+      <w:tblPr>
+        <w:tblW w:type="dxa" w:w="9360"/>
+        <w:tblBorders>
+          <w:top w:val="single" w:color="auto" w:sz="4"/>
+          <w:left w:val="single" w:color="auto" w:sz="4"/>
+          <w:bottom w:val="single" w:color="auto" w:sz="4"/>
+          <w:right w:val="single" w:color="auto" w:sz="4"/>
+          <w:insideH w:val="single" w:color="auto" w:sz="4"/>
+          <w:insideV w:val="single" w:color="auto" w:sz="4"/>
+        </w:tblBorders>
+      </w:tblPr>
+      <w:tblGrid>
+        <w:gridCol w:w="9360"/>
+      </w:tblGrid>
+      <w:tr>
+        <w:trPr>
+          <w:cantSplit/>
+        </w:trPr>
+        <w:tc>
+          <w:tcPr>
+            <w:tcW w:type="dxa" w:w="9360"/>
+            <w:tcBorders>
+              <w:top w:val="single" w:color="EFF6FF" w:sz="4"/>
+              <w:left w:val="single" w:color="2563EB" w:sz="24"/>
+              <w:bottom w:val="single" w:color="EFF6FF" w:sz="4"/>
+              <w:right w:val="single" w:color="EFF6FF" w:sz="4"/>
+            </w:tcBorders>
+            <w:shd w:fill="EFF6FF" w:color="auto" w:val="clear"/>
+            <w:tcMar>
+              <w:top w:type="dxa" w:w="100"/>
+              <w:left w:type="dxa" w:w="160"/>
+              <w:bottom w:type="dxa" w:w="100"/>
+              <w:right w:type="dxa" w:w="140"/>
+            </w:tcMar>
+          </w:tcPr>
+          <w:p>
+            <w:pPr>
+              <w:spacing w:after="60"/>
+            </w:pPr>
+            <w:r>
+              <w:rPr>
+                <w:rFonts w:ascii="Calibri" w:cs="Calibri" w:eastAsia="Calibri" w:hAnsi="Calibri"/>
+                <w:b/>
+                <w:bCs/>
+                <w:color w:val="2563EB"/>
+                <w:sz w:val="21"/>
+                <w:szCs w:val="21"/>
+              </w:rPr>
+              <w:t xml:space="preserve">INFO: Cómo funciona la seguridad con roles</w:t>
+            </w:r>
+          </w:p>
+          <w:p>
+            <w:pPr>
+              <w:spacing w:after="50" w:line="264"/>
+            </w:pPr>
+            <w:r>
+              <w:rPr>
+                <w:rFonts w:ascii="Calibri" w:cs="Calibri" w:eastAsia="Calibri" w:hAnsi="Calibri"/>
+                <w:sz w:val="21"/>
+                <w:szCs w:val="21"/>
+              </w:rPr>
+              <w:t xml:space="preserve">La librería </w:t>
+            </w:r>
+            <w:r>
+              <w:rPr>
+                <w:rFonts w:ascii="Consolas" w:cs="Consolas" w:eastAsia="Consolas" w:hAnsi="Consolas"/>
+                <w:color w:val="9F1239"/>
+                <w:sz w:val="19"/>
+                <w:szCs w:val="19"/>
+                <w:shd w:fill="F3F4F6" w:color="auto" w:val="clear"/>
+              </w:rPr>
+              <w:t xml:space="preserve">boto3</w:t>
+            </w:r>
+            <w:r>
+              <w:rPr>
+                <w:rFonts w:ascii="Calibri" w:cs="Calibri" w:eastAsia="Calibri" w:hAnsi="Calibri"/>
+                <w:sz w:val="21"/>
+                <w:szCs w:val="21"/>
+              </w:rPr>
+              <w:t xml:space="preserve"> (Python) </w:t>
+            </w:r>
+            <w:r>
+              <w:rPr>
+                <w:rFonts w:ascii="Calibri" w:cs="Calibri" w:eastAsia="Calibri" w:hAnsi="Calibri"/>
+                <w:b/>
+                <w:bCs/>
+                <w:sz w:val="21"/>
+                <w:szCs w:val="21"/>
+              </w:rPr>
+              <w:t xml:space="preserve">no necesita</w:t>
+            </w:r>
+            <w:r>
+              <w:rPr>
+                <w:rFonts w:ascii="Calibri" w:cs="Calibri" w:eastAsia="Calibri" w:hAnsi="Calibri"/>
+                <w:sz w:val="21"/>
+                <w:szCs w:val="21"/>
+              </w:rPr>
+              <w:t xml:space="preserve"> que escribas claves de AWS en el servidor. Al asignar un </w:t>
+            </w:r>
+            <w:r>
+              <w:rPr>
+                <w:rFonts w:ascii="Calibri" w:cs="Calibri" w:eastAsia="Calibri" w:hAnsi="Calibri"/>
+                <w:b/>
+                <w:bCs/>
+                <w:sz w:val="21"/>
+                <w:szCs w:val="21"/>
+              </w:rPr>
+              <w:t xml:space="preserve">rol IAM</w:t>
+            </w:r>
+            <w:r>
+              <w:rPr>
+                <w:rFonts w:ascii="Calibri" w:cs="Calibri" w:eastAsia="Calibri" w:hAnsi="Calibri"/>
+                <w:sz w:val="21"/>
+                <w:szCs w:val="21"/>
+              </w:rPr>
+              <w:t xml:space="preserve"> a la EC2, </w:t>
+            </w:r>
+            <w:r>
+              <w:rPr>
+                <w:rFonts w:ascii="Consolas" w:cs="Consolas" w:eastAsia="Consolas" w:hAnsi="Consolas"/>
+                <w:color w:val="9F1239"/>
+                <w:sz w:val="19"/>
+                <w:szCs w:val="19"/>
+                <w:shd w:fill="F3F4F6" w:color="auto" w:val="clear"/>
+              </w:rPr>
+              <w:t xml:space="preserve">boto3</w:t>
+            </w:r>
+            <w:r>
+              <w:rPr>
+                <w:rFonts w:ascii="Calibri" w:cs="Calibri" w:eastAsia="Calibri" w:hAnsi="Calibri"/>
+                <w:sz w:val="21"/>
+                <w:szCs w:val="21"/>
+              </w:rPr>
+              <w:t xml:space="preserve"> consulta el servicio interno de metadatos de la instancia y obtiene credenciales </w:t>
+            </w:r>
+            <w:r>
+              <w:rPr>
+                <w:rFonts w:ascii="Calibri" w:cs="Calibri" w:eastAsia="Calibri" w:hAnsi="Calibri"/>
+                <w:b/>
+                <w:bCs/>
+                <w:sz w:val="21"/>
+                <w:szCs w:val="21"/>
+              </w:rPr>
+              <w:t xml:space="preserve">temporales</w:t>
+            </w:r>
+            <w:r>
+              <w:rPr>
+                <w:rFonts w:ascii="Calibri" w:cs="Calibri" w:eastAsia="Calibri" w:hAnsi="Calibri"/>
+                <w:sz w:val="21"/>
+                <w:szCs w:val="21"/>
+              </w:rPr>
+              <w:t xml:space="preserve"> que se renuevan solas. Por eso en el </w:t>
+            </w:r>
+            <w:r>
+              <w:rPr>
+                <w:rFonts w:ascii="Consolas" w:cs="Consolas" w:eastAsia="Consolas" w:hAnsi="Consolas"/>
+                <w:color w:val="9F1239"/>
+                <w:sz w:val="19"/>
+                <w:szCs w:val="19"/>
+                <w:shd w:fill="F3F4F6" w:color="auto" w:val="clear"/>
+              </w:rPr>
+              <w:t xml:space="preserve">.env</w:t>
+            </w:r>
+            <w:r>
+              <w:rPr>
+                <w:rFonts w:ascii="Calibri" w:cs="Calibri" w:eastAsia="Calibri" w:hAnsi="Calibri"/>
+                <w:sz w:val="21"/>
+                <w:szCs w:val="21"/>
+              </w:rPr>
+              <w:t xml:space="preserve"> no existirán </w:t>
+            </w:r>
+            <w:r>
+              <w:rPr>
+                <w:rFonts w:ascii="Consolas" w:cs="Consolas" w:eastAsia="Consolas" w:hAnsi="Consolas"/>
+                <w:color w:val="9F1239"/>
+                <w:sz w:val="19"/>
+                <w:szCs w:val="19"/>
+                <w:shd w:fill="F3F4F6" w:color="auto" w:val="clear"/>
+              </w:rPr>
+              <w:t xml:space="preserve">AWS_ACCESS_KEY_ID</w:t>
+            </w:r>
+            <w:r>
+              <w:rPr>
+                <w:rFonts w:ascii="Calibri" w:cs="Calibri" w:eastAsia="Calibri" w:hAnsi="Calibri"/>
+                <w:sz w:val="21"/>
+                <w:szCs w:val="21"/>
+              </w:rPr>
+              <w:t xml:space="preserve"> ni </w:t>
+            </w:r>
+            <w:r>
+              <w:rPr>
+                <w:rFonts w:ascii="Consolas" w:cs="Consolas" w:eastAsia="Consolas" w:hAnsi="Consolas"/>
+                <w:color w:val="9F1239"/>
+                <w:sz w:val="19"/>
+                <w:szCs w:val="19"/>
+                <w:shd w:fill="F3F4F6" w:color="auto" w:val="clear"/>
+              </w:rPr>
+              <w:t xml:space="preserve">AWS_SECRET_ACCESS_KEY</w:t>
+            </w:r>
+            <w:r>
+              <w:rPr>
+                <w:rFonts w:ascii="Calibri" w:cs="Calibri" w:eastAsia="Calibri" w:hAnsi="Calibri"/>
+                <w:sz w:val="21"/>
+                <w:szCs w:val="21"/>
+              </w:rPr>
+              <w:t xml:space="preserve">.</w:t>
+            </w:r>
+          </w:p>
+        </w:tc>
+      </w:tr>
+    </w:tbl>
+    <w:p>
+      <w:pPr>
+        <w:spacing w:after="100"/>
+      </w:pPr>
+    </w:p>
     <w:p>
       <w:pPr>
         <w:pStyle w:val="Heading2"/>
@@ -21874,8 +22321,220 @@
         <w:t xml:space="preserve">. GitHub le presenta a AWS un token temporal (OIDC) y AWS le entrega un rol por unos minutos.</w:t>
       </w:r>
     </w:p>
-    <rootKey>w:tbl</rootKey>
-    <rootKey>w:p</rootKey>
+    <w:tbl>
+      <w:tblPr>
+        <w:tblW w:type="dxa" w:w="9360"/>
+        <w:tblBorders>
+          <w:top w:val="single" w:color="auto" w:sz="4"/>
+          <w:left w:val="single" w:color="auto" w:sz="4"/>
+          <w:bottom w:val="single" w:color="auto" w:sz="4"/>
+          <w:right w:val="single" w:color="auto" w:sz="4"/>
+          <w:insideH w:val="single" w:color="auto" w:sz="4"/>
+          <w:insideV w:val="single" w:color="auto" w:sz="4"/>
+        </w:tblBorders>
+      </w:tblPr>
+      <w:tblGrid>
+        <w:gridCol w:w="9360"/>
+      </w:tblGrid>
+      <w:tr>
+        <w:trPr>
+          <w:cantSplit/>
+        </w:trPr>
+        <w:tc>
+          <w:tcPr>
+            <w:tcW w:type="dxa" w:w="9360"/>
+            <w:tcBorders>
+              <w:top w:val="single" w:color="EFF6FF" w:sz="4"/>
+              <w:left w:val="single" w:color="2563EB" w:sz="24"/>
+              <w:bottom w:val="single" w:color="EFF6FF" w:sz="4"/>
+              <w:right w:val="single" w:color="EFF6FF" w:sz="4"/>
+            </w:tcBorders>
+            <w:shd w:fill="EFF6FF" w:color="auto" w:val="clear"/>
+            <w:tcMar>
+              <w:top w:type="dxa" w:w="100"/>
+              <w:left w:type="dxa" w:w="160"/>
+              <w:bottom w:type="dxa" w:w="100"/>
+              <w:right w:type="dxa" w:w="140"/>
+            </w:tcMar>
+          </w:tcPr>
+          <w:p>
+            <w:pPr>
+              <w:spacing w:after="60"/>
+            </w:pPr>
+            <w:r>
+              <w:rPr>
+                <w:rFonts w:ascii="Calibri" w:cs="Calibri" w:eastAsia="Calibri" w:hAnsi="Calibri"/>
+                <w:b/>
+                <w:bCs/>
+                <w:color w:val="2563EB"/>
+                <w:sz w:val="21"/>
+                <w:szCs w:val="21"/>
+              </w:rPr>
+              <w:t xml:space="preserve">INFO: Qué es automático y qué no</w:t>
+            </w:r>
+          </w:p>
+          <w:p>
+            <w:pPr>
+              <w:spacing w:after="50" w:line="264"/>
+            </w:pPr>
+            <w:r>
+              <w:rPr>
+                <w:rFonts w:ascii="Calibri" w:cs="Calibri" w:eastAsia="Calibri" w:hAnsi="Calibri"/>
+                <w:b/>
+                <w:bCs/>
+                <w:sz w:val="21"/>
+                <w:szCs w:val="21"/>
+              </w:rPr>
+              <w:t xml:space="preserve">Automático:</w:t>
+            </w:r>
+            <w:r>
+              <w:rPr>
+                <w:rFonts w:ascii="Calibri" w:cs="Calibri" w:eastAsia="Calibri" w:hAnsi="Calibri"/>
+                <w:sz w:val="21"/>
+                <w:szCs w:val="21"/>
+              </w:rPr>
+              <w:t xml:space="preserve"> cada vez que se hace </w:t>
+            </w:r>
+            <w:r>
+              <w:rPr>
+                <w:rFonts w:ascii="Calibri" w:cs="Calibri" w:eastAsia="Calibri" w:hAnsi="Calibri"/>
+                <w:i/>
+                <w:iCs/>
+                <w:sz w:val="21"/>
+                <w:szCs w:val="21"/>
+              </w:rPr>
+              <w:t xml:space="preserve">merge</w:t>
+            </w:r>
+            <w:r>
+              <w:rPr>
+                <w:rFonts w:ascii="Calibri" w:cs="Calibri" w:eastAsia="Calibri" w:hAnsi="Calibri"/>
+                <w:sz w:val="21"/>
+                <w:szCs w:val="21"/>
+              </w:rPr>
+              <w:t xml:space="preserve"> a </w:t>
+            </w:r>
+            <w:r>
+              <w:rPr>
+                <w:rFonts w:ascii="Consolas" w:cs="Consolas" w:eastAsia="Consolas" w:hAnsi="Consolas"/>
+                <w:color w:val="9F1239"/>
+                <w:sz w:val="19"/>
+                <w:szCs w:val="19"/>
+                <w:shd w:fill="F3F4F6" w:color="auto" w:val="clear"/>
+              </w:rPr>
+              <w:t xml:space="preserve">main</w:t>
+            </w:r>
+            <w:r>
+              <w:rPr>
+                <w:rFonts w:ascii="Calibri" w:cs="Calibri" w:eastAsia="Calibri" w:hAnsi="Calibri"/>
+                <w:sz w:val="21"/>
+                <w:szCs w:val="21"/>
+              </w:rPr>
+              <w:t xml:space="preserve"> con cambios en </w:t>
+            </w:r>
+            <w:r>
+              <w:rPr>
+                <w:rFonts w:ascii="Consolas" w:cs="Consolas" w:eastAsia="Consolas" w:hAnsi="Consolas"/>
+                <w:color w:val="9F1239"/>
+                <w:sz w:val="19"/>
+                <w:szCs w:val="19"/>
+                <w:shd w:fill="F3F4F6" w:color="auto" w:val="clear"/>
+              </w:rPr>
+              <w:t xml:space="preserve">frontend/</w:t>
+            </w:r>
+            <w:r>
+              <w:rPr>
+                <w:rFonts w:ascii="Calibri" w:cs="Calibri" w:eastAsia="Calibri" w:hAnsi="Calibri"/>
+                <w:sz w:val="21"/>
+                <w:szCs w:val="21"/>
+              </w:rPr>
+              <w:t xml:space="preserve">, el workflow compila y sube </w:t>
+            </w:r>
+            <w:r>
+              <w:rPr>
+                <w:rFonts w:ascii="Consolas" w:cs="Consolas" w:eastAsia="Consolas" w:hAnsi="Consolas"/>
+                <w:color w:val="9F1239"/>
+                <w:sz w:val="19"/>
+                <w:szCs w:val="19"/>
+                <w:shd w:fill="F3F4F6" w:color="auto" w:val="clear"/>
+              </w:rPr>
+              <w:t xml:space="preserve">dist/</w:t>
+            </w:r>
+            <w:r>
+              <w:rPr>
+                <w:rFonts w:ascii="Calibri" w:cs="Calibri" w:eastAsia="Calibri" w:hAnsi="Calibri"/>
+                <w:sz w:val="21"/>
+                <w:szCs w:val="21"/>
+              </w:rPr>
+              <w:t xml:space="preserve"> a S3.</w:t>
+            </w:r>
+          </w:p>
+          <w:p>
+            <w:pPr>
+              <w:spacing w:after="50" w:line="264"/>
+            </w:pPr>
+            <w:r>
+              <w:rPr>
+                <w:rFonts w:ascii="Calibri" w:cs="Calibri" w:eastAsia="Calibri" w:hAnsi="Calibri"/>
+                <w:b/>
+                <w:bCs/>
+                <w:sz w:val="21"/>
+                <w:szCs w:val="21"/>
+              </w:rPr>
+              <w:t xml:space="preserve">Manual:</w:t>
+            </w:r>
+            <w:r>
+              <w:rPr>
+                <w:rFonts w:ascii="Calibri" w:cs="Calibri" w:eastAsia="Calibri" w:hAnsi="Calibri"/>
+                <w:sz w:val="21"/>
+                <w:szCs w:val="21"/>
+              </w:rPr>
+              <w:t xml:space="preserve"> el backend (EC2) se actualiza con </w:t>
+            </w:r>
+            <w:r>
+              <w:rPr>
+                <w:rFonts w:ascii="Consolas" w:cs="Consolas" w:eastAsia="Consolas" w:hAnsi="Consolas"/>
+                <w:color w:val="9F1239"/>
+                <w:sz w:val="19"/>
+                <w:szCs w:val="19"/>
+                <w:shd w:fill="F3F4F6" w:color="auto" w:val="clear"/>
+              </w:rPr>
+              <w:t xml:space="preserve">git pull</w:t>
+            </w:r>
+            <w:r>
+              <w:rPr>
+                <w:rFonts w:ascii="Calibri" w:cs="Calibri" w:eastAsia="Calibri" w:hAnsi="Calibri"/>
+                <w:sz w:val="21"/>
+                <w:szCs w:val="21"/>
+              </w:rPr>
+              <w:t xml:space="preserve"> y </w:t>
+            </w:r>
+            <w:r>
+              <w:rPr>
+                <w:rFonts w:ascii="Consolas" w:cs="Consolas" w:eastAsia="Consolas" w:hAnsi="Consolas"/>
+                <w:color w:val="9F1239"/>
+                <w:sz w:val="19"/>
+                <w:szCs w:val="19"/>
+                <w:shd w:fill="F3F4F6" w:color="auto" w:val="clear"/>
+              </w:rPr>
+              <w:t xml:space="preserve">pm2 restart</w:t>
+            </w:r>
+            <w:r>
+              <w:rPr>
+                <w:rFonts w:ascii="Calibri" w:cs="Calibri" w:eastAsia="Calibri" w:hAnsi="Calibri"/>
+                <w:sz w:val="21"/>
+                <w:szCs w:val="21"/>
+              </w:rPr>
+              <w:t xml:space="preserve"> (ver Anexo B).</w:t>
+            </w:r>
+          </w:p>
+        </w:tc>
+      </w:tr>
+    </w:tbl>
+    <w:p>
+      <w:pPr>
+        <w:spacing w:after="100"/>
+      </w:pPr>
+    </w:p>
     <w:p>
       <w:pPr>
         <w:pStyle w:val="Heading2"/>

</xml_diff>

<commit_message>
Manual de AWS con el sufijo y el ID de cuenta ya incluidos
</commit_message>
<xml_diff>
--- a/docs/Manual_Despliegue_AWS_TubeYou.docx
+++ b/docs/Manual_Despliegue_AWS_TubeYou.docx
@@ -1020,7 +1020,7 @@
                 <w:sz w:val="20"/>
                 <w:szCs w:val="20"/>
               </w:rPr>
-              <w:t xml:space="preserve">TUSUFIJO</w:t>
+              <w:t xml:space="preserve">kattysirel</w:t>
             </w:r>
           </w:p>
         </w:tc>
@@ -1050,25 +1050,72 @@
                 <w:sz w:val="20"/>
                 <w:szCs w:val="20"/>
               </w:rPr>
-              <w:t xml:space="preserve">Una palabra tuya, en minúsculas y sin espacios (ejemplo: </w:t>
-            </w:r>
-            <w:r>
-              <w:rPr>
-                <w:rFonts w:ascii="Consolas" w:cs="Consolas" w:eastAsia="Consolas" w:hAnsi="Consolas"/>
-                <w:color w:val="9F1239"/>
-                <w:sz w:val="18"/>
-                <w:szCs w:val="18"/>
-                <w:shd w:fill="F3F4F6" w:color="auto" w:val="clear"/>
-              </w:rPr>
-              <w:t xml:space="preserve">katty</w:t>
-            </w:r>
+              <w:t xml:space="preserve">Tu sufijo: ya está puesto en todos los nombres de este manual para que los buckets sean únicos en el mundo.</w:t>
+            </w:r>
+          </w:p>
+        </w:tc>
+      </w:tr>
+      <w:tr>
+        <w:trPr>
+          <w:cantSplit/>
+        </w:trPr>
+        <w:tc>
+          <w:tcPr>
+            <w:tcW w:type="dxa" w:w="2800"/>
+            <w:tcBorders>
+              <w:top w:val="single" w:color="D1D5DB" w:sz="4"/>
+              <w:left w:val="single" w:color="D1D5DB" w:sz="4"/>
+              <w:bottom w:val="single" w:color="D1D5DB" w:sz="4"/>
+              <w:right w:val="single" w:color="D1D5DB" w:sz="4"/>
+            </w:tcBorders>
+            <w:tcMar>
+              <w:top w:type="dxa" w:w="70"/>
+              <w:left w:type="dxa" w:w="110"/>
+              <w:bottom w:type="dxa" w:w="70"/>
+              <w:right w:type="dxa" w:w="110"/>
+            </w:tcMar>
+          </w:tcPr>
+          <w:p>
+            <w:pPr>
+              <w:spacing w:after="30"/>
+            </w:pPr>
             <w:r>
               <w:rPr>
                 <w:rFonts w:ascii="Calibri" w:cs="Calibri" w:eastAsia="Calibri" w:hAnsi="Calibri"/>
                 <w:sz w:val="20"/>
                 <w:szCs w:val="20"/>
               </w:rPr>
-              <w:t xml:space="preserve">). Se usa para que los nombres de bucket sean únicos en todo el mundo.</w:t>
+              <w:t xml:space="preserve">614315078836</w:t>
+            </w:r>
+          </w:p>
+        </w:tc>
+        <w:tc>
+          <w:tcPr>
+            <w:tcW w:type="dxa" w:w="6560"/>
+            <w:tcBorders>
+              <w:top w:val="single" w:color="D1D5DB" w:sz="4"/>
+              <w:left w:val="single" w:color="D1D5DB" w:sz="4"/>
+              <w:bottom w:val="single" w:color="D1D5DB" w:sz="4"/>
+              <w:right w:val="single" w:color="D1D5DB" w:sz="4"/>
+            </w:tcBorders>
+            <w:tcMar>
+              <w:top w:type="dxa" w:w="70"/>
+              <w:left w:type="dxa" w:w="110"/>
+              <w:bottom w:type="dxa" w:w="70"/>
+              <w:right w:type="dxa" w:w="110"/>
+            </w:tcMar>
+          </w:tcPr>
+          <w:p>
+            <w:pPr>
+              <w:spacing w:after="30"/>
+            </w:pPr>
+            <w:r>
+              <w:rPr>
+                <w:rFonts w:ascii="Calibri" w:cs="Calibri" w:eastAsia="Calibri" w:hAnsi="Calibri"/>
+                <w:sz w:val="20"/>
+                <w:szCs w:val="20"/>
+              </w:rPr>
+              <w:t xml:space="preserve">El ID de tu cuenta de AWS: ya está puesto en las políticas que lo necesitan.</w:t>
             </w:r>
           </w:p>
         </w:tc>
@@ -1342,7 +1389,7 @@
                 <w:szCs w:val="18"/>
                 <w:shd w:fill="F3F4F6" w:color="auto" w:val="clear"/>
               </w:rPr>
-              <w:t xml:space="preserve">tubeyou-frontend-TUSUFIJO</w:t>
+              <w:t xml:space="preserve">tubeyou-frontend-kattysirel</w:t>
             </w:r>
           </w:p>
         </w:tc>
@@ -1409,7 +1456,7 @@
                 <w:szCs w:val="18"/>
                 <w:shd w:fill="F3F4F6" w:color="auto" w:val="clear"/>
               </w:rPr>
-              <w:t xml:space="preserve">tubeyou-videos-TUSUFIJO</w:t>
+              <w:t xml:space="preserve">tubeyou-videos-kattysirel</w:t>
             </w:r>
           </w:p>
         </w:tc>
@@ -1476,7 +1523,7 @@
                 <w:szCs w:val="18"/>
                 <w:shd w:fill="F3F4F6" w:color="auto" w:val="clear"/>
               </w:rPr>
-              <w:t xml:space="preserve">tubeyou-miniaturas-TUSUFIJO</w:t>
+              <w:t xml:space="preserve">tubeyou-miniaturas-kattysirel</w:t>
             </w:r>
           </w:p>
         </w:tc>
@@ -2608,7 +2655,7 @@
                 <w:sz w:val="20"/>
                 <w:szCs w:val="20"/>
               </w:rPr>
-              <w:t xml:space="preserve">Mi sufijo (TUSUFIJO)</w:t>
+              <w:t xml:space="preserve">Mi sufijo</w:t>
             </w:r>
           </w:p>
         </w:tc>
@@ -2638,7 +2685,7 @@
                 <w:sz w:val="20"/>
                 <w:szCs w:val="20"/>
               </w:rPr>
-              <w:t xml:space="preserve">Lo eliges tú</w:t>
+              <w:t xml:space="preserve">Ya definido</w:t>
             </w:r>
           </w:p>
         </w:tc>
@@ -2662,6 +2709,14 @@
             <w:pPr>
               <w:spacing w:after="30"/>
             </w:pPr>
+            <w:r>
+              <w:rPr>
+                <w:rFonts w:ascii="Calibri" w:cs="Calibri" w:eastAsia="Calibri" w:hAnsi="Calibri"/>
+                <w:sz w:val="20"/>
+                <w:szCs w:val="20"/>
+              </w:rPr>
+              <w:t xml:space="preserve">kattysirel</w:t>
+            </w:r>
           </w:p>
         </w:tc>
       </w:tr>
@@ -2725,7 +2780,7 @@
                 <w:sz w:val="20"/>
                 <w:szCs w:val="20"/>
               </w:rPr>
-              <w:t xml:space="preserve">Esquina superior derecha de la consola</w:t>
+              <w:t xml:space="preserve">Ya definido</w:t>
             </w:r>
           </w:p>
         </w:tc>
@@ -2749,6 +2804,14 @@
             <w:pPr>
               <w:spacing w:after="30"/>
             </w:pPr>
+            <w:r>
+              <w:rPr>
+                <w:rFonts w:ascii="Calibri" w:cs="Calibri" w:eastAsia="Calibri" w:hAnsi="Calibri"/>
+                <w:sz w:val="20"/>
+                <w:szCs w:val="20"/>
+              </w:rPr>
+              <w:t xml:space="preserve">614315078836</w:t>
+            </w:r>
           </w:p>
         </w:tc>
       </w:tr>
@@ -5179,7 +5242,7 @@
           <w:szCs w:val="20"/>
           <w:shd w:fill="F3F4F6" w:color="auto" w:val="clear"/>
         </w:rPr>
-        <w:t xml:space="preserve">tubeyou-frontend-TUSUFIJO</w:t>
+        <w:t xml:space="preserve">tubeyou-frontend-kattysirel</w:t>
       </w:r>
       <w:r>
         <w:rPr>
@@ -7505,7 +7568,7 @@
                 <w:szCs w:val="18"/>
                 <w:shd w:fill="F3F4F6" w:color="auto" w:val="clear"/>
               </w:rPr>
-              <w:t xml:space="preserve">tubeyou-frontend-TUSUFIJO</w:t>
+              <w:t xml:space="preserve">tubeyou-frontend-kattysirel</w:t>
             </w:r>
           </w:p>
         </w:tc>
@@ -7630,7 +7693,7 @@
                 <w:szCs w:val="18"/>
                 <w:shd w:fill="F3F4F6" w:color="auto" w:val="clear"/>
               </w:rPr>
-              <w:t xml:space="preserve">tubeyou-videos-TUSUFIJO</w:t>
+              <w:t xml:space="preserve">tubeyou-videos-kattysirel</w:t>
             </w:r>
           </w:p>
         </w:tc>
@@ -7727,7 +7790,7 @@
                 <w:szCs w:val="18"/>
                 <w:shd w:fill="F3F4F6" w:color="auto" w:val="clear"/>
               </w:rPr>
-              <w:t xml:space="preserve">tubeyou-miniaturas-TUSUFIJO</w:t>
+              <w:t xml:space="preserve">tubeyou-miniaturas-kattysirel</w:t>
             </w:r>
           </w:p>
         </w:tc>
@@ -8138,7 +8201,7 @@
           <w:szCs w:val="20"/>
           <w:shd w:fill="F3F4F6" w:color="auto" w:val="clear"/>
         </w:rPr>
-        <w:t xml:space="preserve">tubeyou-frontend-TUSUFIJO</w:t>
+        <w:t xml:space="preserve">tubeyou-frontend-kattysirel</w:t>
       </w:r>
       <w:r>
         <w:rPr>
@@ -8648,7 +8711,7 @@
           <w:szCs w:val="20"/>
           <w:shd w:fill="F3F4F6" w:color="auto" w:val="clear"/>
         </w:rPr>
-        <w:t xml:space="preserve">tubeyou-videos-TUSUFIJO</w:t>
+        <w:t xml:space="preserve">tubeyou-videos-kattysirel</w:t>
       </w:r>
       <w:r>
         <w:rPr>
@@ -8896,7 +8959,7 @@
           <w:szCs w:val="20"/>
           <w:shd w:fill="F3F4F6" w:color="auto" w:val="clear"/>
         </w:rPr>
-        <w:t xml:space="preserve">tubeyou-videos-TUSUFIJO</w:t>
+        <w:t xml:space="preserve">tubeyou-videos-kattysirel</w:t>
       </w:r>
       <w:r>
         <w:rPr>
@@ -8992,7 +9055,7 @@
         <w:rPr>
           <w:rFonts w:ascii="Calibri" w:cs="Calibri" w:eastAsia="Calibri" w:hAnsi="Calibri"/>
         </w:rPr>
-        <w:t xml:space="preserve">Borra lo que haya y pega este JSON (cambia </w:t>
+        <w:t xml:space="preserve">Borra lo que haya y pega este JSON (ya lleva tu sufijo </w:t>
       </w:r>
       <w:r>
         <w:rPr>
@@ -9002,13 +9065,13 @@
           <w:szCs w:val="20"/>
           <w:shd w:fill="F3F4F6" w:color="auto" w:val="clear"/>
         </w:rPr>
-        <w:t xml:space="preserve">TUSUFIJO</w:t>
-      </w:r>
-      <w:r>
-        <w:rPr>
-          <w:rFonts w:ascii="Calibri" w:cs="Calibri" w:eastAsia="Calibri" w:hAnsi="Calibri"/>
-        </w:rPr>
-        <w:t xml:space="preserve"> por el tuyo):</w:t>
+        <w:t xml:space="preserve">kattysirel</w:t>
+      </w:r>
+      <w:r>
+        <w:rPr>
+          <w:rFonts w:ascii="Calibri" w:cs="Calibri" w:eastAsia="Calibri" w:hAnsi="Calibri"/>
+        </w:rPr>
+        <w:t xml:space="preserve">):</w:t>
       </w:r>
     </w:p>
     <w:tbl>
@@ -9186,7 +9249,7 @@
                 <w:sz w:val="18"/>
                 <w:szCs w:val="18"/>
               </w:rPr>
-              <w:t xml:space="preserve">      "Resource": "arn:aws:s3:::tubeyou-videos-TUSUFIJO/*"</w:t>
+              <w:t xml:space="preserve">      "Resource": "arn:aws:s3:::tubeyou-videos-kattysirel/*"</w:t>
             </w:r>
           </w:p>
           <w:p>
@@ -9878,7 +9941,7 @@
           <w:szCs w:val="20"/>
           <w:shd w:fill="F3F4F6" w:color="auto" w:val="clear"/>
         </w:rPr>
-        <w:t xml:space="preserve">tubeyou-miniaturas-TUSUFIJO</w:t>
+        <w:t xml:space="preserve">tubeyou-miniaturas-kattysirel</w:t>
       </w:r>
       <w:r>
         <w:rPr>
@@ -10224,7 +10287,7 @@
                 <w:sz w:val="18"/>
                 <w:szCs w:val="18"/>
               </w:rPr>
-              <w:t xml:space="preserve">      "Resource": "arn:aws:s3:::tubeyou-miniaturas-TUSUFIJO/*"</w:t>
+              <w:t xml:space="preserve">      "Resource": "arn:aws:s3:::tubeyou-miniaturas-kattysirel/*"</w:t>
             </w:r>
           </w:p>
           <w:p>
@@ -13646,7 +13709,7 @@
         <w:rPr>
           <w:rFonts w:ascii="Calibri" w:cs="Calibri" w:eastAsia="Calibri" w:hAnsi="Calibri"/>
         </w:rPr>
-        <w:t xml:space="preserve">Borra lo que haya y pega este JSON (cambia </w:t>
+        <w:t xml:space="preserve">Borra lo que haya y pega este JSON (ya lleva tu sufijo </w:t>
       </w:r>
       <w:r>
         <w:rPr>
@@ -13656,7 +13719,7 @@
           <w:szCs w:val="20"/>
           <w:shd w:fill="F3F4F6" w:color="auto" w:val="clear"/>
         </w:rPr>
-        <w:t xml:space="preserve">TUSUFIJO</w:t>
+        <w:t xml:space="preserve">kattysirel</w:t>
       </w:r>
       <w:r>
         <w:rPr>
@@ -13910,7 +13973,7 @@
                 <w:sz w:val="18"/>
                 <w:szCs w:val="18"/>
               </w:rPr>
-              <w:t xml:space="preserve">        "arn:aws:s3:::tubeyou-videos-TUSUFIJO",</w:t>
+              <w:t xml:space="preserve">        "arn:aws:s3:::tubeyou-videos-kattysirel",</w:t>
             </w:r>
           </w:p>
           <w:p>
@@ -13924,7 +13987,7 @@
                 <w:sz w:val="18"/>
                 <w:szCs w:val="18"/>
               </w:rPr>
-              <w:t xml:space="preserve">        "arn:aws:s3:::tubeyou-videos-TUSUFIJO/*",</w:t>
+              <w:t xml:space="preserve">        "arn:aws:s3:::tubeyou-videos-kattysirel/*",</w:t>
             </w:r>
           </w:p>
           <w:p>
@@ -13938,7 +14001,7 @@
                 <w:sz w:val="18"/>
                 <w:szCs w:val="18"/>
               </w:rPr>
-              <w:t xml:space="preserve">        "arn:aws:s3:::tubeyou-miniaturas-TUSUFIJO",</w:t>
+              <w:t xml:space="preserve">        "arn:aws:s3:::tubeyou-miniaturas-kattysirel",</w:t>
             </w:r>
           </w:p>
           <w:p>
@@ -13952,7 +14015,7 @@
                 <w:sz w:val="18"/>
                 <w:szCs w:val="18"/>
               </w:rPr>
-              <w:t xml:space="preserve">        "arn:aws:s3:::tubeyou-miniaturas-TUSUFIJO/*"</w:t>
+              <w:t xml:space="preserve">        "arn:aws:s3:::tubeyou-miniaturas-kattysirel/*"</w:t>
             </w:r>
           </w:p>
           <w:p>
@@ -17273,7 +17336,7 @@
                 <w:sz w:val="18"/>
                 <w:szCs w:val="18"/>
               </w:rPr>
-              <w:t xml:space="preserve">S3_BUCKET_VIDEOS=tubeyou-videos-TUSUFIJO</w:t>
+              <w:t xml:space="preserve">S3_BUCKET_VIDEOS=tubeyou-videos-kattysirel</w:t>
             </w:r>
           </w:p>
           <w:p>
@@ -17287,7 +17350,7 @@
                 <w:sz w:val="18"/>
                 <w:szCs w:val="18"/>
               </w:rPr>
-              <w:t xml:space="preserve">S3_BUCKET_THUMBNAILS=tubeyou-miniaturas-TUSUFIJO</w:t>
+              <w:t xml:space="preserve">S3_BUCKET_THUMBNAILS=tubeyou-miniaturas-kattysirel</w:t>
             </w:r>
           </w:p>
           <w:p>
@@ -19285,7 +19348,7 @@
           <w:szCs w:val="20"/>
           <w:shd w:fill="F3F4F6" w:color="auto" w:val="clear"/>
         </w:rPr>
-        <w:t xml:space="preserve">tubeyou-frontend-TUSUFIJO</w:t>
+        <w:t xml:space="preserve">tubeyou-frontend-kattysirel</w:t>
       </w:r>
       <w:r>
         <w:rPr>
@@ -21604,7 +21667,7 @@
           <w:szCs w:val="20"/>
           <w:shd w:fill="F3F4F6" w:color="auto" w:val="clear"/>
         </w:rPr>
-        <w:t xml:space="preserve">tubeyou-frontend-TUSUFIJO...</w:t>
+        <w:t xml:space="preserve">tubeyou-frontend-kattysirel...</w:t>
       </w:r>
       <w:r>
         <w:rPr>
@@ -21694,7 +21757,7 @@
           <w:szCs w:val="20"/>
           <w:shd w:fill="F3F4F6" w:color="auto" w:val="clear"/>
         </w:rPr>
-        <w:t xml:space="preserve">tubeyou-frontend-TUSUFIJO</w:t>
+        <w:t xml:space="preserve">tubeyou-frontend-kattysirel</w:t>
       </w:r>
       <w:r>
         <w:rPr>
@@ -21950,7 +22013,7 @@
                 <w:sz w:val="18"/>
                 <w:szCs w:val="18"/>
               </w:rPr>
-              <w:t xml:space="preserve">      "Resource": "arn:aws:s3:::tubeyou-frontend-TUSUFIJO/*",</w:t>
+              <w:t xml:space="preserve">      "Resource": "arn:aws:s3:::tubeyou-frontend-kattysirel/*",</w:t>
             </w:r>
           </w:p>
           <w:p>
@@ -21992,7 +22055,7 @@
                 <w:sz w:val="18"/>
                 <w:szCs w:val="18"/>
               </w:rPr>
-              <w:t xml:space="preserve">          "AWS:SourceArn": "arn:aws:cloudfront::TU_ID_DE_CUENTA:distribution/ID_DE_TU_DISTRIBUCION"</w:t>
+              <w:t xml:space="preserve">          "AWS:SourceArn": "arn:aws:cloudfront::614315078836:distribution/ID_DE_TU_DISTRIBUCION"</w:t>
             </w:r>
           </w:p>
           <w:p>
@@ -22973,7 +23036,7 @@
         <w:rPr>
           <w:rFonts w:ascii="Calibri" w:cs="Calibri" w:eastAsia="Calibri" w:hAnsi="Calibri"/>
         </w:rPr>
-        <w:t xml:space="preserve">Pega este JSON (cambia </w:t>
+        <w:t xml:space="preserve">Pega este JSON (ya lleva tu sufijo </w:t>
       </w:r>
       <w:r>
         <w:rPr>
@@ -22983,7 +23046,7 @@
           <w:szCs w:val="20"/>
           <w:shd w:fill="F3F4F6" w:color="auto" w:val="clear"/>
         </w:rPr>
-        <w:t xml:space="preserve">TUSUFIJO</w:t>
+        <w:t xml:space="preserve">kattysirel</w:t>
       </w:r>
       <w:r>
         <w:rPr>
@@ -23237,7 +23300,7 @@
                 <w:sz w:val="18"/>
                 <w:szCs w:val="18"/>
               </w:rPr>
-              <w:t xml:space="preserve">        "arn:aws:s3:::tubeyou-frontend-TUSUFIJO",</w:t>
+              <w:t xml:space="preserve">        "arn:aws:s3:::tubeyou-frontend-kattysirel",</w:t>
             </w:r>
           </w:p>
           <w:p>
@@ -23251,7 +23314,7 @@
                 <w:sz w:val="18"/>
                 <w:szCs w:val="18"/>
               </w:rPr>
-              <w:t xml:space="preserve">        "arn:aws:s3:::tubeyou-frontend-TUSUFIJO/*"</w:t>
+              <w:t xml:space="preserve">        "arn:aws:s3:::tubeyou-frontend-kattysirel/*"</w:t>
             </w:r>
           </w:p>
           <w:p>
@@ -23841,7 +23904,7 @@
         <w:rPr>
           <w:rFonts w:ascii="Calibri" w:cs="Calibri" w:eastAsia="Calibri" w:hAnsi="Calibri"/>
         </w:rPr>
-        <w:t xml:space="preserve"> y pega este JSON (reemplaza </w:t>
+        <w:t xml:space="preserve"> y pega este JSON (ya lleva tu ID de cuenta </w:t>
       </w:r>
       <w:r>
         <w:rPr>
@@ -23851,13 +23914,13 @@
           <w:szCs w:val="20"/>
           <w:shd w:fill="F3F4F6" w:color="auto" w:val="clear"/>
         </w:rPr>
-        <w:t xml:space="preserve">TU_ID_DE_CUENTA</w:t>
-      </w:r>
-      <w:r>
-        <w:rPr>
-          <w:rFonts w:ascii="Calibri" w:cs="Calibri" w:eastAsia="Calibri" w:hAnsi="Calibri"/>
-        </w:rPr>
-        <w:t xml:space="preserve"> por tu ID de 12 dígitos):</w:t>
+        <w:t xml:space="preserve">614315078836</w:t>
+      </w:r>
+      <w:r>
+        <w:rPr>
+          <w:rFonts w:ascii="Calibri" w:cs="Calibri" w:eastAsia="Calibri" w:hAnsi="Calibri"/>
+        </w:rPr>
+        <w:t xml:space="preserve">):</w:t>
       </w:r>
     </w:p>
     <w:tbl>
@@ -24021,7 +24084,7 @@
                 <w:sz w:val="18"/>
                 <w:szCs w:val="18"/>
               </w:rPr>
-              <w:t xml:space="preserve">        "Federated": "arn:aws:iam::TU_ID_DE_CUENTA:oidc-provider/token.actions.githubusercontent.com"</w:t>
+              <w:t xml:space="preserve">        "Federated": "arn:aws:iam::614315078836:oidc-provider/token.actions.githubusercontent.com"</w:t>
             </w:r>
           </w:p>
           <w:p>
@@ -25123,7 +25186,7 @@
                 <w:szCs w:val="18"/>
                 <w:shd w:fill="F3F4F6" w:color="auto" w:val="clear"/>
               </w:rPr>
-              <w:t xml:space="preserve">tubeyou-frontend-TUSUFIJO</w:t>
+              <w:t xml:space="preserve">tubeyou-frontend-kattysirel</w:t>
             </w:r>
           </w:p>
         </w:tc>
@@ -27758,7 +27821,7 @@
                 <w:szCs w:val="18"/>
                 <w:shd w:fill="F3F4F6" w:color="auto" w:val="clear"/>
               </w:rPr>
-              <w:t xml:space="preserve">https://tubeyou-frontend-TUSUFIJO.s3.amazonaws.com/index.html</w:t>
+              <w:t xml:space="preserve">https://tubeyou-frontend-kattysirel.s3.amazonaws.com/index.html</w:t>
             </w:r>
           </w:p>
         </w:tc>

</xml_diff>

<commit_message>
Manual: paso de RDS actualizado a la consola actual (entorno de pruebas, gp3, costos)
</commit_message>
<xml_diff>
--- a/docs/Manual_Despliegue_AWS_TubeYou.docx
+++ b/docs/Manual_Despliegue_AWS_TubeYou.docx
@@ -12370,939 +12370,7 @@
           <w:sz w:val="28"/>
           <w:szCs w:val="28"/>
         </w:rPr>
-        <w:t xml:space="preserve">Paso 3 · Crear la base de datos</w:t>
-      </w:r>
-    </w:p>
-    <w:p>
-      <w:pPr>
-        <w:pStyle w:val="ListParagraph"/>
-        <w:numPr>
-          <w:ilvl w:val="0"/>
-          <w:numId w:val="19"/>
-        </w:numPr>
-        <w:spacing w:after="70" w:line="276"/>
-      </w:pPr>
-      <w:r>
-        <w:rPr>
-          <w:rFonts w:ascii="Calibri" w:cs="Calibri" w:eastAsia="Calibri" w:hAnsi="Calibri"/>
-        </w:rPr>
-        <w:t xml:space="preserve">Busca </w:t>
-      </w:r>
-      <w:r>
-        <w:rPr>
-          <w:rFonts w:ascii="Consolas" w:cs="Consolas" w:eastAsia="Consolas" w:hAnsi="Consolas"/>
-          <w:color w:val="9F1239"/>
-          <w:sz w:val="20"/>
-          <w:szCs w:val="20"/>
-          <w:shd w:fill="F3F4F6" w:color="auto" w:val="clear"/>
-        </w:rPr>
-        <w:t xml:space="preserve">RDS</w:t>
-      </w:r>
-      <w:r>
-        <w:rPr>
-          <w:rFonts w:ascii="Calibri" w:cs="Calibri" w:eastAsia="Calibri" w:hAnsi="Calibri"/>
-        </w:rPr>
-        <w:t xml:space="preserve"> y entra. Menú izquierdo ➔ </w:t>
-      </w:r>
-      <w:r>
-        <w:rPr>
-          <w:rFonts w:ascii="Calibri" w:cs="Calibri" w:eastAsia="Calibri" w:hAnsi="Calibri"/>
-          <w:b/>
-          <w:bCs/>
-        </w:rPr>
-        <w:t xml:space="preserve">Bases de datos</w:t>
-      </w:r>
-      <w:r>
-        <w:rPr>
-          <w:rFonts w:ascii="Calibri" w:cs="Calibri" w:eastAsia="Calibri" w:hAnsi="Calibri"/>
-        </w:rPr>
-        <w:t xml:space="preserve"> (Databases) ➔ botón naranja </w:t>
-      </w:r>
-      <w:r>
-        <w:rPr>
-          <w:rFonts w:ascii="Calibri" w:cs="Calibri" w:eastAsia="Calibri" w:hAnsi="Calibri"/>
-          <w:b/>
-          <w:bCs/>
-        </w:rPr>
-        <w:t xml:space="preserve">Crear base de datos</w:t>
-      </w:r>
-      <w:r>
-        <w:rPr>
-          <w:rFonts w:ascii="Calibri" w:cs="Calibri" w:eastAsia="Calibri" w:hAnsi="Calibri"/>
-        </w:rPr>
-        <w:t xml:space="preserve"> (Create database).</w:t>
-      </w:r>
-    </w:p>
-    <w:p>
-      <w:pPr>
-        <w:pStyle w:val="ListParagraph"/>
-        <w:numPr>
-          <w:ilvl w:val="0"/>
-          <w:numId w:val="19"/>
-        </w:numPr>
-        <w:spacing w:after="70" w:line="276"/>
-      </w:pPr>
-      <w:r>
-        <w:rPr>
-          <w:rFonts w:ascii="Calibri" w:cs="Calibri" w:eastAsia="Calibri" w:hAnsi="Calibri"/>
-          <w:b/>
-          <w:bCs/>
-        </w:rPr>
-        <w:t xml:space="preserve">Elegir un método de creación de base de datos:</w:t>
-      </w:r>
-      <w:r>
-        <w:rPr>
-          <w:rFonts w:ascii="Calibri" w:cs="Calibri" w:eastAsia="Calibri" w:hAnsi="Calibri"/>
-        </w:rPr>
-        <w:t xml:space="preserve"> (Choose a database creation method) </w:t>
-      </w:r>
-      <w:r>
-        <w:rPr>
-          <w:rFonts w:ascii="Calibri" w:cs="Calibri" w:eastAsia="Calibri" w:hAnsi="Calibri"/>
-          <w:i/>
-          <w:iCs/>
-        </w:rPr>
-        <w:t xml:space="preserve">Creación estándar</w:t>
-      </w:r>
-      <w:r>
-        <w:rPr>
-          <w:rFonts w:ascii="Calibri" w:cs="Calibri" w:eastAsia="Calibri" w:hAnsi="Calibri"/>
-        </w:rPr>
-        <w:t xml:space="preserve"> (Standard create).</w:t>
-      </w:r>
-    </w:p>
-    <w:p>
-      <w:pPr>
-        <w:pStyle w:val="ListParagraph"/>
-        <w:numPr>
-          <w:ilvl w:val="0"/>
-          <w:numId w:val="19"/>
-        </w:numPr>
-        <w:spacing w:after="70" w:line="276"/>
-      </w:pPr>
-      <w:r>
-        <w:rPr>
-          <w:rFonts w:ascii="Calibri" w:cs="Calibri" w:eastAsia="Calibri" w:hAnsi="Calibri"/>
-          <w:b/>
-          <w:bCs/>
-        </w:rPr>
-        <w:t xml:space="preserve">Opciones del motor:</w:t>
-      </w:r>
-      <w:r>
-        <w:rPr>
-          <w:rFonts w:ascii="Calibri" w:cs="Calibri" w:eastAsia="Calibri" w:hAnsi="Calibri"/>
-        </w:rPr>
-        <w:t xml:space="preserve"> (Engine options) haz clic en el recuadro </w:t>
-      </w:r>
-      <w:r>
-        <w:rPr>
-          <w:rFonts w:ascii="Calibri" w:cs="Calibri" w:eastAsia="Calibri" w:hAnsi="Calibri"/>
-          <w:b/>
-          <w:bCs/>
-        </w:rPr>
-        <w:t xml:space="preserve">PostgreSQL</w:t>
-      </w:r>
-      <w:r>
-        <w:rPr>
-          <w:rFonts w:ascii="Calibri" w:cs="Calibri" w:eastAsia="Calibri" w:hAnsi="Calibri"/>
-        </w:rPr>
-        <w:t xml:space="preserve">. Deja la versión que sugiere.</w:t>
-      </w:r>
-    </w:p>
-    <w:p>
-      <w:pPr>
-        <w:pStyle w:val="ListParagraph"/>
-        <w:numPr>
-          <w:ilvl w:val="0"/>
-          <w:numId w:val="19"/>
-        </w:numPr>
-        <w:spacing w:after="70" w:line="276"/>
-      </w:pPr>
-      <w:r>
-        <w:rPr>
-          <w:rFonts w:ascii="Calibri" w:cs="Calibri" w:eastAsia="Calibri" w:hAnsi="Calibri"/>
-          <w:b/>
-          <w:bCs/>
-        </w:rPr>
-        <w:t xml:space="preserve">Plantillas:</w:t>
-      </w:r>
-      <w:r>
-        <w:rPr>
-          <w:rFonts w:ascii="Calibri" w:cs="Calibri" w:eastAsia="Calibri" w:hAnsi="Calibri"/>
-        </w:rPr>
-        <w:t xml:space="preserve"> (Templates) </w:t>
-      </w:r>
-      <w:r>
-        <w:rPr>
-          <w:rFonts w:ascii="Calibri" w:cs="Calibri" w:eastAsia="Calibri" w:hAnsi="Calibri"/>
-          <w:i/>
-          <w:iCs/>
-        </w:rPr>
-        <w:t xml:space="preserve">Capa gratuita</w:t>
-      </w:r>
-      <w:r>
-        <w:rPr>
-          <w:rFonts w:ascii="Calibri" w:cs="Calibri" w:eastAsia="Calibri" w:hAnsi="Calibri"/>
-        </w:rPr>
-        <w:t xml:space="preserve"> (Free tier) (si no aparece, elige </w:t>
-      </w:r>
-      <w:r>
-        <w:rPr>
-          <w:rFonts w:ascii="Calibri" w:cs="Calibri" w:eastAsia="Calibri" w:hAnsi="Calibri"/>
-          <w:i/>
-          <w:iCs/>
-        </w:rPr>
-        <w:t xml:space="preserve">Sandbox</w:t>
-      </w:r>
-      <w:r>
-        <w:rPr>
-          <w:rFonts w:ascii="Calibri" w:cs="Calibri" w:eastAsia="Calibri" w:hAnsi="Calibri"/>
-        </w:rPr>
-        <w:t xml:space="preserve"> (Sandbox) o </w:t>
-      </w:r>
-      <w:r>
-        <w:rPr>
-          <w:rFonts w:ascii="Calibri" w:cs="Calibri" w:eastAsia="Calibri" w:hAnsi="Calibri"/>
-          <w:i/>
-          <w:iCs/>
-        </w:rPr>
-        <w:t xml:space="preserve">Desarrollo/Pruebas</w:t>
-      </w:r>
-      <w:r>
-        <w:rPr>
-          <w:rFonts w:ascii="Calibri" w:cs="Calibri" w:eastAsia="Calibri" w:hAnsi="Calibri"/>
-        </w:rPr>
-        <w:t xml:space="preserve"> (Dev/Test)).</w:t>
-      </w:r>
-    </w:p>
-    <w:p>
-      <w:pPr>
-        <w:pStyle w:val="ListParagraph"/>
-        <w:numPr>
-          <w:ilvl w:val="0"/>
-          <w:numId w:val="19"/>
-        </w:numPr>
-        <w:spacing w:after="70" w:line="276"/>
-      </w:pPr>
-      <w:r>
-        <w:rPr>
-          <w:rFonts w:ascii="Calibri" w:cs="Calibri" w:eastAsia="Calibri" w:hAnsi="Calibri"/>
-          <w:b/>
-          <w:bCs/>
-        </w:rPr>
-        <w:t xml:space="preserve">Disponibilidad y durabilidad:</w:t>
-      </w:r>
-      <w:r>
-        <w:rPr>
-          <w:rFonts w:ascii="Calibri" w:cs="Calibri" w:eastAsia="Calibri" w:hAnsi="Calibri"/>
-        </w:rPr>
-        <w:t xml:space="preserve"> (Availability and durability) si aparece, elige </w:t>
-      </w:r>
-      <w:r>
-        <w:rPr>
-          <w:rFonts w:ascii="Calibri" w:cs="Calibri" w:eastAsia="Calibri" w:hAnsi="Calibri"/>
-          <w:i/>
-          <w:iCs/>
-        </w:rPr>
-        <w:t xml:space="preserve">Implementación de instancia de base de datos de una sola zona de disponibilidad (1 instancia)</w:t>
-      </w:r>
-      <w:r>
-        <w:rPr>
-          <w:rFonts w:ascii="Calibri" w:cs="Calibri" w:eastAsia="Calibri" w:hAnsi="Calibri"/>
-        </w:rPr>
-        <w:t xml:space="preserve"> (Single-AZ DB instance deployment (1 instance)).</w:t>
-      </w:r>
-    </w:p>
-    <w:p>
-      <w:pPr>
-        <w:pStyle w:val="ListParagraph"/>
-        <w:numPr>
-          <w:ilvl w:val="0"/>
-          <w:numId w:val="19"/>
-        </w:numPr>
-        <w:spacing w:after="70" w:line="276"/>
-      </w:pPr>
-      <w:r>
-        <w:rPr>
-          <w:rFonts w:ascii="Calibri" w:cs="Calibri" w:eastAsia="Calibri" w:hAnsi="Calibri"/>
-          <w:b/>
-          <w:bCs/>
-        </w:rPr>
-        <w:t xml:space="preserve">Identificador de instancias de bases de datos:</w:t>
-      </w:r>
-      <w:r>
-        <w:rPr>
-          <w:rFonts w:ascii="Calibri" w:cs="Calibri" w:eastAsia="Calibri" w:hAnsi="Calibri"/>
-        </w:rPr>
-        <w:t xml:space="preserve"> (DB instance identifier) </w:t>
-      </w:r>
-      <w:r>
-        <w:rPr>
-          <w:rFonts w:ascii="Consolas" w:cs="Consolas" w:eastAsia="Consolas" w:hAnsi="Consolas"/>
-          <w:color w:val="9F1239"/>
-          <w:sz w:val="20"/>
-          <w:szCs w:val="20"/>
-          <w:shd w:fill="F3F4F6" w:color="auto" w:val="clear"/>
-        </w:rPr>
-        <w:t xml:space="preserve">tubeyou-rds</w:t>
-      </w:r>
-      <w:r>
-        <w:rPr>
-          <w:rFonts w:ascii="Calibri" w:cs="Calibri" w:eastAsia="Calibri" w:hAnsi="Calibri"/>
-        </w:rPr>
-        <w:t xml:space="preserve">.</w:t>
-      </w:r>
-    </w:p>
-    <w:p>
-      <w:pPr>
-        <w:pStyle w:val="ListParagraph"/>
-        <w:numPr>
-          <w:ilvl w:val="0"/>
-          <w:numId w:val="19"/>
-        </w:numPr>
-        <w:spacing w:after="70" w:line="276"/>
-      </w:pPr>
-      <w:r>
-        <w:rPr>
-          <w:rFonts w:ascii="Calibri" w:cs="Calibri" w:eastAsia="Calibri" w:hAnsi="Calibri"/>
-          <w:b/>
-          <w:bCs/>
-        </w:rPr>
-        <w:t xml:space="preserve">Nombre de usuario maestro:</w:t>
-      </w:r>
-      <w:r>
-        <w:rPr>
-          <w:rFonts w:ascii="Calibri" w:cs="Calibri" w:eastAsia="Calibri" w:hAnsi="Calibri"/>
-        </w:rPr>
-        <w:t xml:space="preserve"> (Master username) </w:t>
-      </w:r>
-      <w:r>
-        <w:rPr>
-          <w:rFonts w:ascii="Consolas" w:cs="Consolas" w:eastAsia="Consolas" w:hAnsi="Consolas"/>
-          <w:color w:val="9F1239"/>
-          <w:sz w:val="20"/>
-          <w:szCs w:val="20"/>
-          <w:shd w:fill="F3F4F6" w:color="auto" w:val="clear"/>
-        </w:rPr>
-        <w:t xml:space="preserve">postgres</w:t>
-      </w:r>
-      <w:r>
-        <w:rPr>
-          <w:rFonts w:ascii="Calibri" w:cs="Calibri" w:eastAsia="Calibri" w:hAnsi="Calibri"/>
-        </w:rPr>
-        <w:t xml:space="preserve">.</w:t>
-      </w:r>
-    </w:p>
-    <w:p>
-      <w:pPr>
-        <w:pStyle w:val="ListParagraph"/>
-        <w:numPr>
-          <w:ilvl w:val="0"/>
-          <w:numId w:val="19"/>
-        </w:numPr>
-        <w:spacing w:after="70" w:line="276"/>
-      </w:pPr>
-      <w:r>
-        <w:rPr>
-          <w:rFonts w:ascii="Calibri" w:cs="Calibri" w:eastAsia="Calibri" w:hAnsi="Calibri"/>
-          <w:b/>
-          <w:bCs/>
-        </w:rPr>
-        <w:t xml:space="preserve">Administración de credenciales:</w:t>
-      </w:r>
-      <w:r>
-        <w:rPr>
-          <w:rFonts w:ascii="Calibri" w:cs="Calibri" w:eastAsia="Calibri" w:hAnsi="Calibri"/>
-        </w:rPr>
-        <w:t xml:space="preserve"> (Credentials management) </w:t>
-      </w:r>
-      <w:r>
-        <w:rPr>
-          <w:rFonts w:ascii="Calibri" w:cs="Calibri" w:eastAsia="Calibri" w:hAnsi="Calibri"/>
-          <w:i/>
-          <w:iCs/>
-        </w:rPr>
-        <w:t xml:space="preserve">Autoadministrada</w:t>
-      </w:r>
-      <w:r>
-        <w:rPr>
-          <w:rFonts w:ascii="Calibri" w:cs="Calibri" w:eastAsia="Calibri" w:hAnsi="Calibri"/>
-        </w:rPr>
-        <w:t xml:space="preserve"> (Self managed). En </w:t>
-      </w:r>
-      <w:r>
-        <w:rPr>
-          <w:rFonts w:ascii="Calibri" w:cs="Calibri" w:eastAsia="Calibri" w:hAnsi="Calibri"/>
-          <w:b/>
-          <w:bCs/>
-        </w:rPr>
-        <w:t xml:space="preserve">Contraseña maestra</w:t>
-      </w:r>
-      <w:r>
-        <w:rPr>
-          <w:rFonts w:ascii="Calibri" w:cs="Calibri" w:eastAsia="Calibri" w:hAnsi="Calibri"/>
-        </w:rPr>
-        <w:t xml:space="preserve"> (Master password) escribe una clave (ejemplo </w:t>
-      </w:r>
-      <w:r>
-        <w:rPr>
-          <w:rFonts w:ascii="Consolas" w:cs="Consolas" w:eastAsia="Consolas" w:hAnsi="Consolas"/>
-          <w:color w:val="9F1239"/>
-          <w:sz w:val="20"/>
-          <w:szCs w:val="20"/>
-          <w:shd w:fill="F3F4F6" w:color="auto" w:val="clear"/>
-        </w:rPr>
-        <w:t xml:space="preserve">TuClaveSegura2026</w:t>
-      </w:r>
-      <w:r>
-        <w:rPr>
-          <w:rFonts w:ascii="Calibri" w:cs="Calibri" w:eastAsia="Calibri" w:hAnsi="Calibri"/>
-        </w:rPr>
-        <w:t xml:space="preserve">) y repítela en </w:t>
-      </w:r>
-      <w:r>
-        <w:rPr>
-          <w:rFonts w:ascii="Calibri" w:cs="Calibri" w:eastAsia="Calibri" w:hAnsi="Calibri"/>
-          <w:b/>
-          <w:bCs/>
-        </w:rPr>
-        <w:t xml:space="preserve">Confirmar contraseña maestra</w:t>
-      </w:r>
-      <w:r>
-        <w:rPr>
-          <w:rFonts w:ascii="Calibri" w:cs="Calibri" w:eastAsia="Calibri" w:hAnsi="Calibri"/>
-        </w:rPr>
-        <w:t xml:space="preserve"> (Confirm master password). </w:t>
-      </w:r>
-      <w:r>
-        <w:rPr>
-          <w:rFonts w:ascii="Calibri" w:cs="Calibri" w:eastAsia="Calibri" w:hAnsi="Calibri"/>
-          <w:b/>
-          <w:bCs/>
-        </w:rPr>
-        <w:t xml:space="preserve">Anótala en la hoja de datos.</w:t>
-      </w:r>
-      <w:r>
-        <w:rPr>
-          <w:rFonts w:ascii="Calibri" w:cs="Calibri" w:eastAsia="Calibri" w:hAnsi="Calibri"/>
-        </w:rPr>
-        <w:t xml:space="preserve"> Usa solo letras y números para evitar problemas.</w:t>
-      </w:r>
-    </w:p>
-    <w:p>
-      <w:pPr>
-        <w:pStyle w:val="ListParagraph"/>
-        <w:numPr>
-          <w:ilvl w:val="0"/>
-          <w:numId w:val="19"/>
-        </w:numPr>
-        <w:spacing w:after="70" w:line="276"/>
-      </w:pPr>
-      <w:r>
-        <w:rPr>
-          <w:rFonts w:ascii="Calibri" w:cs="Calibri" w:eastAsia="Calibri" w:hAnsi="Calibri"/>
-          <w:b/>
-          <w:bCs/>
-        </w:rPr>
-        <w:t xml:space="preserve">Configuración de la instancia:</w:t>
-      </w:r>
-      <w:r>
-        <w:rPr>
-          <w:rFonts w:ascii="Calibri" w:cs="Calibri" w:eastAsia="Calibri" w:hAnsi="Calibri"/>
-        </w:rPr>
-        <w:t xml:space="preserve"> (Instance configuration) elige </w:t>
-      </w:r>
-      <w:r>
-        <w:rPr>
-          <w:rFonts w:ascii="Consolas" w:cs="Consolas" w:eastAsia="Consolas" w:hAnsi="Consolas"/>
-          <w:color w:val="9F1239"/>
-          <w:sz w:val="20"/>
-          <w:szCs w:val="20"/>
-          <w:shd w:fill="F3F4F6" w:color="auto" w:val="clear"/>
-        </w:rPr>
-        <w:t xml:space="preserve">db.t4g.micro</w:t>
-      </w:r>
-      <w:r>
-        <w:rPr>
-          <w:rFonts w:ascii="Calibri" w:cs="Calibri" w:eastAsia="Calibri" w:hAnsi="Calibri"/>
-        </w:rPr>
-        <w:t xml:space="preserve"> o </w:t>
-      </w:r>
-      <w:r>
-        <w:rPr>
-          <w:rFonts w:ascii="Consolas" w:cs="Consolas" w:eastAsia="Consolas" w:hAnsi="Consolas"/>
-          <w:color w:val="9F1239"/>
-          <w:sz w:val="20"/>
-          <w:szCs w:val="20"/>
-          <w:shd w:fill="F3F4F6" w:color="auto" w:val="clear"/>
-        </w:rPr>
-        <w:t xml:space="preserve">db.t3.micro</w:t>
-      </w:r>
-      <w:r>
-        <w:rPr>
-          <w:rFonts w:ascii="Calibri" w:cs="Calibri" w:eastAsia="Calibri" w:hAnsi="Calibri"/>
-        </w:rPr>
-        <w:t xml:space="preserve"> (la que diga </w:t>
-      </w:r>
-      <w:r>
-        <w:rPr>
-          <w:rFonts w:ascii="Calibri" w:cs="Calibri" w:eastAsia="Calibri" w:hAnsi="Calibri"/>
-          <w:i/>
-          <w:iCs/>
-        </w:rPr>
-        <w:t xml:space="preserve">Capa gratuita</w:t>
-      </w:r>
-      <w:r>
-        <w:rPr>
-          <w:rFonts w:ascii="Calibri" w:cs="Calibri" w:eastAsia="Calibri" w:hAnsi="Calibri"/>
-        </w:rPr>
-        <w:t xml:space="preserve"> (Free tier)).</w:t>
-      </w:r>
-    </w:p>
-    <w:p>
-      <w:pPr>
-        <w:pStyle w:val="ListParagraph"/>
-        <w:numPr>
-          <w:ilvl w:val="0"/>
-          <w:numId w:val="19"/>
-        </w:numPr>
-        <w:spacing w:after="70" w:line="276"/>
-      </w:pPr>
-      <w:r>
-        <w:rPr>
-          <w:rFonts w:ascii="Calibri" w:cs="Calibri" w:eastAsia="Calibri" w:hAnsi="Calibri"/>
-          <w:b/>
-          <w:bCs/>
-        </w:rPr>
-        <w:t xml:space="preserve">Almacenamiento:</w:t>
-      </w:r>
-      <w:r>
-        <w:rPr>
-          <w:rFonts w:ascii="Calibri" w:cs="Calibri" w:eastAsia="Calibri" w:hAnsi="Calibri"/>
-        </w:rPr>
-        <w:t xml:space="preserve"> (Storage) </w:t>
-      </w:r>
-      <w:r>
-        <w:rPr>
-          <w:rFonts w:ascii="Calibri" w:cs="Calibri" w:eastAsia="Calibri" w:hAnsi="Calibri"/>
-          <w:i/>
-          <w:iCs/>
-        </w:rPr>
-        <w:t xml:space="preserve">SSD de uso general (gp3 o gp2)</w:t>
-      </w:r>
-      <w:r>
-        <w:rPr>
-          <w:rFonts w:ascii="Calibri" w:cs="Calibri" w:eastAsia="Calibri" w:hAnsi="Calibri"/>
-        </w:rPr>
-        <w:t xml:space="preserve"> (General Purpose SSD (gp3 o gp2)) · </w:t>
-      </w:r>
-      <w:r>
-        <w:rPr>
-          <w:rFonts w:ascii="Calibri" w:cs="Calibri" w:eastAsia="Calibri" w:hAnsi="Calibri"/>
-          <w:b/>
-          <w:bCs/>
-        </w:rPr>
-        <w:t xml:space="preserve">Almacenamiento asignado</w:t>
-      </w:r>
-      <w:r>
-        <w:rPr>
-          <w:rFonts w:ascii="Calibri" w:cs="Calibri" w:eastAsia="Calibri" w:hAnsi="Calibri"/>
-        </w:rPr>
-        <w:t xml:space="preserve"> (Allocated storage) </w:t>
-      </w:r>
-      <w:r>
-        <w:rPr>
-          <w:rFonts w:ascii="Consolas" w:cs="Consolas" w:eastAsia="Consolas" w:hAnsi="Consolas"/>
-          <w:color w:val="9F1239"/>
-          <w:sz w:val="20"/>
-          <w:szCs w:val="20"/>
-          <w:shd w:fill="F3F4F6" w:color="auto" w:val="clear"/>
-        </w:rPr>
-        <w:t xml:space="preserve">20</w:t>
-      </w:r>
-      <w:r>
-        <w:rPr>
-          <w:rFonts w:ascii="Calibri" w:cs="Calibri" w:eastAsia="Calibri" w:hAnsi="Calibri"/>
-        </w:rPr>
-        <w:t xml:space="preserve"> GiB · </w:t>
-      </w:r>
-      <w:r>
-        <w:rPr>
-          <w:rFonts w:ascii="Calibri" w:cs="Calibri" w:eastAsia="Calibri" w:hAnsi="Calibri"/>
-          <w:b/>
-          <w:bCs/>
-        </w:rPr>
-        <w:t xml:space="preserve">desmarca</w:t>
-      </w:r>
-      <w:r>
-        <w:rPr>
-          <w:rFonts w:ascii="Calibri" w:cs="Calibri" w:eastAsia="Calibri" w:hAnsi="Calibri"/>
-        </w:rPr>
-        <w:t xml:space="preserve"> </w:t>
-      </w:r>
-      <w:r>
-        <w:rPr>
-          <w:rFonts w:ascii="Calibri" w:cs="Calibri" w:eastAsia="Calibri" w:hAnsi="Calibri"/>
-          <w:i/>
-          <w:iCs/>
-        </w:rPr>
-        <w:t xml:space="preserve">Habilitar el escalado automático del almacenamiento</w:t>
-      </w:r>
-      <w:r>
-        <w:rPr>
-          <w:rFonts w:ascii="Calibri" w:cs="Calibri" w:eastAsia="Calibri" w:hAnsi="Calibri"/>
-        </w:rPr>
-        <w:t xml:space="preserve"> (Enable storage autoscaling).</w:t>
-      </w:r>
-    </w:p>
-    <w:p>
-      <w:pPr>
-        <w:pStyle w:val="ListParagraph"/>
-        <w:numPr>
-          <w:ilvl w:val="0"/>
-          <w:numId w:val="19"/>
-        </w:numPr>
-        <w:spacing w:after="70" w:line="276"/>
-      </w:pPr>
-      <w:r>
-        <w:rPr>
-          <w:rFonts w:ascii="Calibri" w:cs="Calibri" w:eastAsia="Calibri" w:hAnsi="Calibri"/>
-          <w:b/>
-          <w:bCs/>
-        </w:rPr>
-        <w:t xml:space="preserve">Conectividad:</w:t>
-      </w:r>
-      <w:r>
-        <w:rPr>
-          <w:rFonts w:ascii="Calibri" w:cs="Calibri" w:eastAsia="Calibri" w:hAnsi="Calibri"/>
-        </w:rPr>
-        <w:t xml:space="preserve"> (Connectivity) </w:t>
-      </w:r>
-      <w:r>
-        <w:rPr>
-          <w:rFonts w:ascii="Calibri" w:cs="Calibri" w:eastAsia="Calibri" w:hAnsi="Calibri"/>
-          <w:i/>
-          <w:iCs/>
-        </w:rPr>
-        <w:t xml:space="preserve">No conectarse a un recurso de computación de EC2</w:t>
-      </w:r>
-      <w:r>
-        <w:rPr>
-          <w:rFonts w:ascii="Calibri" w:cs="Calibri" w:eastAsia="Calibri" w:hAnsi="Calibri"/>
-        </w:rPr>
-        <w:t xml:space="preserve"> (Don't connect to an EC2 compute resource) · </w:t>
-      </w:r>
-      <w:r>
-        <w:rPr>
-          <w:rFonts w:ascii="Calibri" w:cs="Calibri" w:eastAsia="Calibri" w:hAnsi="Calibri"/>
-          <w:i/>
-          <w:iCs/>
-        </w:rPr>
-        <w:t xml:space="preserve">Tipo de red</w:t>
-      </w:r>
-      <w:r>
-        <w:rPr>
-          <w:rFonts w:ascii="Calibri" w:cs="Calibri" w:eastAsia="Calibri" w:hAnsi="Calibri"/>
-        </w:rPr>
-        <w:t xml:space="preserve"> (Network type) IPv4 · </w:t>
-      </w:r>
-      <w:r>
-        <w:rPr>
-          <w:rFonts w:ascii="Calibri" w:cs="Calibri" w:eastAsia="Calibri" w:hAnsi="Calibri"/>
-          <w:i/>
-          <w:iCs/>
-        </w:rPr>
-        <w:t xml:space="preserve">VPC</w:t>
-      </w:r>
-      <w:r>
-        <w:rPr>
-          <w:rFonts w:ascii="Calibri" w:cs="Calibri" w:eastAsia="Calibri" w:hAnsi="Calibri"/>
-        </w:rPr>
-        <w:t xml:space="preserve"> la default · </w:t>
-      </w:r>
-      <w:r>
-        <w:rPr>
-          <w:rFonts w:ascii="Calibri" w:cs="Calibri" w:eastAsia="Calibri" w:hAnsi="Calibri"/>
-          <w:i/>
-          <w:iCs/>
-        </w:rPr>
-        <w:t xml:space="preserve">Grupo de subredes de base de datos</w:t>
-      </w:r>
-      <w:r>
-        <w:rPr>
-          <w:rFonts w:ascii="Calibri" w:cs="Calibri" w:eastAsia="Calibri" w:hAnsi="Calibri"/>
-        </w:rPr>
-        <w:t xml:space="preserve"> (DB subnet group) default.</w:t>
-      </w:r>
-    </w:p>
-    <w:p>
-      <w:pPr>
-        <w:pStyle w:val="ListParagraph"/>
-        <w:numPr>
-          <w:ilvl w:val="0"/>
-          <w:numId w:val="19"/>
-        </w:numPr>
-        <w:spacing w:after="70" w:line="276"/>
-      </w:pPr>
-      <w:r>
-        <w:rPr>
-          <w:rFonts w:ascii="Calibri" w:cs="Calibri" w:eastAsia="Calibri" w:hAnsi="Calibri"/>
-          <w:b/>
-          <w:bCs/>
-        </w:rPr>
-        <w:t xml:space="preserve">Acceso público:</w:t>
-      </w:r>
-      <w:r>
-        <w:rPr>
-          <w:rFonts w:ascii="Calibri" w:cs="Calibri" w:eastAsia="Calibri" w:hAnsi="Calibri"/>
-        </w:rPr>
-        <w:t xml:space="preserve"> (Public access) elige </w:t>
-      </w:r>
-      <w:r>
-        <w:rPr>
-          <w:rFonts w:ascii="Calibri" w:cs="Calibri" w:eastAsia="Calibri" w:hAnsi="Calibri"/>
-          <w:b/>
-          <w:bCs/>
-        </w:rPr>
-        <w:t xml:space="preserve">No</w:t>
-      </w:r>
-      <w:r>
-        <w:rPr>
-          <w:rFonts w:ascii="Calibri" w:cs="Calibri" w:eastAsia="Calibri" w:hAnsi="Calibri"/>
-        </w:rPr>
-        <w:t xml:space="preserve">.</w:t>
-      </w:r>
-    </w:p>
-    <w:p>
-      <w:pPr>
-        <w:pStyle w:val="ListParagraph"/>
-        <w:numPr>
-          <w:ilvl w:val="0"/>
-          <w:numId w:val="19"/>
-        </w:numPr>
-        <w:spacing w:after="70" w:line="276"/>
-      </w:pPr>
-      <w:r>
-        <w:rPr>
-          <w:rFonts w:ascii="Calibri" w:cs="Calibri" w:eastAsia="Calibri" w:hAnsi="Calibri"/>
-          <w:b/>
-          <w:bCs/>
-        </w:rPr>
-        <w:t xml:space="preserve">Grupo de seguridad de VPC (firewall):</w:t>
-      </w:r>
-      <w:r>
-        <w:rPr>
-          <w:rFonts w:ascii="Calibri" w:cs="Calibri" w:eastAsia="Calibri" w:hAnsi="Calibri"/>
-        </w:rPr>
-        <w:t xml:space="preserve"> (VPC security group (firewall)) </w:t>
-      </w:r>
-      <w:r>
-        <w:rPr>
-          <w:rFonts w:ascii="Calibri" w:cs="Calibri" w:eastAsia="Calibri" w:hAnsi="Calibri"/>
-          <w:i/>
-          <w:iCs/>
-        </w:rPr>
-        <w:t xml:space="preserve">Elegir existente</w:t>
-      </w:r>
-      <w:r>
-        <w:rPr>
-          <w:rFonts w:ascii="Calibri" w:cs="Calibri" w:eastAsia="Calibri" w:hAnsi="Calibri"/>
-        </w:rPr>
-        <w:t xml:space="preserve"> (Choose existing). En el cuadro, </w:t>
-      </w:r>
-      <w:r>
-        <w:rPr>
-          <w:rFonts w:ascii="Calibri" w:cs="Calibri" w:eastAsia="Calibri" w:hAnsi="Calibri"/>
-          <w:b/>
-          <w:bCs/>
-        </w:rPr>
-        <w:t xml:space="preserve">quita</w:t>
-      </w:r>
-      <w:r>
-        <w:rPr>
-          <w:rFonts w:ascii="Calibri" w:cs="Calibri" w:eastAsia="Calibri" w:hAnsi="Calibri"/>
-        </w:rPr>
-        <w:t xml:space="preserve"> </w:t>
-      </w:r>
-      <w:r>
-        <w:rPr>
-          <w:rFonts w:ascii="Consolas" w:cs="Consolas" w:eastAsia="Consolas" w:hAnsi="Consolas"/>
-          <w:color w:val="9F1239"/>
-          <w:sz w:val="20"/>
-          <w:szCs w:val="20"/>
-          <w:shd w:fill="F3F4F6" w:color="auto" w:val="clear"/>
-        </w:rPr>
-        <w:t xml:space="preserve">default</w:t>
-      </w:r>
-      <w:r>
-        <w:rPr>
-          <w:rFonts w:ascii="Calibri" w:cs="Calibri" w:eastAsia="Calibri" w:hAnsi="Calibri"/>
-        </w:rPr>
-        <w:t xml:space="preserve"> (clic en la X) y </w:t>
-      </w:r>
-      <w:r>
-        <w:rPr>
-          <w:rFonts w:ascii="Calibri" w:cs="Calibri" w:eastAsia="Calibri" w:hAnsi="Calibri"/>
-          <w:b/>
-          <w:bCs/>
-        </w:rPr>
-        <w:t xml:space="preserve">agrega</w:t>
-      </w:r>
-      <w:r>
-        <w:rPr>
-          <w:rFonts w:ascii="Calibri" w:cs="Calibri" w:eastAsia="Calibri" w:hAnsi="Calibri"/>
-        </w:rPr>
-        <w:t xml:space="preserve"> </w:t>
-      </w:r>
-      <w:r>
-        <w:rPr>
-          <w:rFonts w:ascii="Consolas" w:cs="Consolas" w:eastAsia="Consolas" w:hAnsi="Consolas"/>
-          <w:color w:val="9F1239"/>
-          <w:sz w:val="20"/>
-          <w:szCs w:val="20"/>
-          <w:shd w:fill="F3F4F6" w:color="auto" w:val="clear"/>
-        </w:rPr>
-        <w:t xml:space="preserve">rds-postgres-sg</w:t>
-      </w:r>
-      <w:r>
-        <w:rPr>
-          <w:rFonts w:ascii="Calibri" w:cs="Calibri" w:eastAsia="Calibri" w:hAnsi="Calibri"/>
-        </w:rPr>
-        <w:t xml:space="preserve">.</w:t>
-      </w:r>
-    </w:p>
-    <w:p>
-      <w:pPr>
-        <w:pStyle w:val="ListParagraph"/>
-        <w:numPr>
-          <w:ilvl w:val="0"/>
-          <w:numId w:val="19"/>
-        </w:numPr>
-        <w:spacing w:after="70" w:line="276"/>
-      </w:pPr>
-      <w:r>
-        <w:rPr>
-          <w:rFonts w:ascii="Calibri" w:cs="Calibri" w:eastAsia="Calibri" w:hAnsi="Calibri"/>
-        </w:rPr>
-        <w:t xml:space="preserve">Deja </w:t>
-      </w:r>
-      <w:r>
-        <w:rPr>
-          <w:rFonts w:ascii="Calibri" w:cs="Calibri" w:eastAsia="Calibri" w:hAnsi="Calibri"/>
-          <w:i/>
-          <w:iCs/>
-        </w:rPr>
-        <w:t xml:space="preserve">Autenticación de base de datos</w:t>
-      </w:r>
-      <w:r>
-        <w:rPr>
-          <w:rFonts w:ascii="Calibri" w:cs="Calibri" w:eastAsia="Calibri" w:hAnsi="Calibri"/>
-        </w:rPr>
-        <w:t xml:space="preserve"> (Database authentication) en </w:t>
-      </w:r>
-      <w:r>
-        <w:rPr>
-          <w:rFonts w:ascii="Calibri" w:cs="Calibri" w:eastAsia="Calibri" w:hAnsi="Calibri"/>
-          <w:i/>
-          <w:iCs/>
-        </w:rPr>
-        <w:t xml:space="preserve">Autenticación con contraseña</w:t>
-      </w:r>
-      <w:r>
-        <w:rPr>
-          <w:rFonts w:ascii="Calibri" w:cs="Calibri" w:eastAsia="Calibri" w:hAnsi="Calibri"/>
-        </w:rPr>
-        <w:t xml:space="preserve"> (Password authentication).</w:t>
-      </w:r>
-    </w:p>
-    <w:p>
-      <w:pPr>
-        <w:pStyle w:val="ListParagraph"/>
-        <w:numPr>
-          <w:ilvl w:val="0"/>
-          <w:numId w:val="19"/>
-        </w:numPr>
-        <w:spacing w:after="70" w:line="276"/>
-      </w:pPr>
-      <w:r>
-        <w:rPr>
-          <w:rFonts w:ascii="Calibri" w:cs="Calibri" w:eastAsia="Calibri" w:hAnsi="Calibri"/>
-        </w:rPr>
-        <w:t xml:space="preserve">Despliega </w:t>
-      </w:r>
-      <w:r>
-        <w:rPr>
-          <w:rFonts w:ascii="Calibri" w:cs="Calibri" w:eastAsia="Calibri" w:hAnsi="Calibri"/>
-          <w:b/>
-          <w:bCs/>
-        </w:rPr>
-        <w:t xml:space="preserve">Configuración adicional</w:t>
-      </w:r>
-      <w:r>
-        <w:rPr>
-          <w:rFonts w:ascii="Calibri" w:cs="Calibri" w:eastAsia="Calibri" w:hAnsi="Calibri"/>
-        </w:rPr>
-        <w:t xml:space="preserve"> (Additional configuration) (flecha al final de la página). En el campo </w:t>
-      </w:r>
-      <w:r>
-        <w:rPr>
-          <w:rFonts w:ascii="Calibri" w:cs="Calibri" w:eastAsia="Calibri" w:hAnsi="Calibri"/>
-          <w:b/>
-          <w:bCs/>
-        </w:rPr>
-        <w:t xml:space="preserve">Nombre de la base de datos inicial</w:t>
-      </w:r>
-      <w:r>
-        <w:rPr>
-          <w:rFonts w:ascii="Calibri" w:cs="Calibri" w:eastAsia="Calibri" w:hAnsi="Calibri"/>
-        </w:rPr>
-        <w:t xml:space="preserve"> (Initial database name) escribe exactamente </w:t>
-      </w:r>
-      <w:r>
-        <w:rPr>
-          <w:rFonts w:ascii="Consolas" w:cs="Consolas" w:eastAsia="Consolas" w:hAnsi="Consolas"/>
-          <w:color w:val="9F1239"/>
-          <w:sz w:val="20"/>
-          <w:szCs w:val="20"/>
-          <w:shd w:fill="F3F4F6" w:color="auto" w:val="clear"/>
-        </w:rPr>
-        <w:t xml:space="preserve">tubeyou_db</w:t>
-      </w:r>
-      <w:r>
-        <w:rPr>
-          <w:rFonts w:ascii="Calibri" w:cs="Calibri" w:eastAsia="Calibri" w:hAnsi="Calibri"/>
-        </w:rPr>
-        <w:t xml:space="preserve">.</w:t>
-      </w:r>
-    </w:p>
-    <w:p>
-      <w:pPr>
-        <w:pStyle w:val="ListParagraph"/>
-        <w:numPr>
-          <w:ilvl w:val="0"/>
-          <w:numId w:val="19"/>
-        </w:numPr>
-        <w:spacing w:after="70" w:line="276"/>
-      </w:pPr>
-      <w:r>
-        <w:rPr>
-          <w:rFonts w:ascii="Calibri" w:cs="Calibri" w:eastAsia="Calibri" w:hAnsi="Calibri"/>
-        </w:rPr>
-        <w:t xml:space="preserve">Presiona </w:t>
-      </w:r>
-      <w:r>
-        <w:rPr>
-          <w:rFonts w:ascii="Calibri" w:cs="Calibri" w:eastAsia="Calibri" w:hAnsi="Calibri"/>
-          <w:b/>
-          <w:bCs/>
-        </w:rPr>
-        <w:t xml:space="preserve">Crear base de datos</w:t>
-      </w:r>
-      <w:r>
-        <w:rPr>
-          <w:rFonts w:ascii="Calibri" w:cs="Calibri" w:eastAsia="Calibri" w:hAnsi="Calibri"/>
-        </w:rPr>
-        <w:t xml:space="preserve"> (Create database) (abajo).</w:t>
+        <w:t xml:space="preserve">Paso 3 · Crear la base de datos (versión actual de la consola)</w:t>
       </w:r>
     </w:p>
     <w:tbl>
@@ -13354,7 +12422,1824 @@
                 <w:sz w:val="21"/>
                 <w:szCs w:val="21"/>
               </w:rPr>
-              <w:t xml:space="preserve">ERROR: No olvides el Initial database name</w:t>
+              <w:t xml:space="preserve">ERROR: Cuidado con el costo: revisa el total antes de crear</w:t>
+            </w:r>
+          </w:p>
+          <w:p>
+            <w:pPr>
+              <w:spacing w:after="50" w:line="264"/>
+            </w:pPr>
+            <w:r>
+              <w:rPr>
+                <w:rFonts w:ascii="Calibri" w:cs="Calibri" w:eastAsia="Calibri" w:hAnsi="Calibri"/>
+                <w:sz w:val="21"/>
+                <w:szCs w:val="21"/>
+              </w:rPr>
+              <w:t xml:space="preserve">Al final del formulario, en </w:t>
+            </w:r>
+            <w:r>
+              <w:rPr>
+                <w:rFonts w:ascii="Calibri" w:cs="Calibri" w:eastAsia="Calibri" w:hAnsi="Calibri"/>
+                <w:b/>
+                <w:bCs/>
+                <w:sz w:val="21"/>
+                <w:szCs w:val="21"/>
+              </w:rPr>
+              <w:t xml:space="preserve">Costos mensuales estimados</w:t>
+            </w:r>
+            <w:r>
+              <w:rPr>
+                <w:rFonts w:ascii="Calibri" w:cs="Calibri" w:eastAsia="Calibri" w:hAnsi="Calibri"/>
+                <w:sz w:val="21"/>
+                <w:szCs w:val="21"/>
+              </w:rPr>
+              <w:t xml:space="preserve">, el total para este proyecto debe ser de </w:t>
+            </w:r>
+            <w:r>
+              <w:rPr>
+                <w:rFonts w:ascii="Calibri" w:cs="Calibri" w:eastAsia="Calibri" w:hAnsi="Calibri"/>
+                <w:b/>
+                <w:bCs/>
+                <w:sz w:val="21"/>
+                <w:szCs w:val="21"/>
+              </w:rPr>
+              <w:t xml:space="preserve">unos 15 USD al mes o menos</w:t>
+            </w:r>
+            <w:r>
+              <w:rPr>
+                <w:rFonts w:ascii="Calibri" w:cs="Calibri" w:eastAsia="Calibri" w:hAnsi="Calibri"/>
+                <w:sz w:val="21"/>
+                <w:szCs w:val="21"/>
+              </w:rPr>
+              <w:t xml:space="preserve"> (y la capa gratuita o los créditos de tu cuenta pueden cubrirlo).</w:t>
+            </w:r>
+          </w:p>
+          <w:p>
+            <w:pPr>
+              <w:spacing w:after="50" w:line="264"/>
+            </w:pPr>
+            <w:r>
+              <w:rPr>
+                <w:rFonts w:ascii="Calibri" w:cs="Calibri" w:eastAsia="Calibri" w:hAnsi="Calibri"/>
+                <w:sz w:val="21"/>
+                <w:szCs w:val="21"/>
+              </w:rPr>
+              <w:t xml:space="preserve">Si ves </w:t>
+            </w:r>
+            <w:r>
+              <w:rPr>
+                <w:rFonts w:ascii="Calibri" w:cs="Calibri" w:eastAsia="Calibri" w:hAnsi="Calibri"/>
+                <w:b/>
+                <w:bCs/>
+                <w:sz w:val="21"/>
+                <w:szCs w:val="21"/>
+              </w:rPr>
+              <w:t xml:space="preserve">cientos o miles de dólares</w:t>
+            </w:r>
+            <w:r>
+              <w:rPr>
+                <w:rFonts w:ascii="Calibri" w:cs="Calibri" w:eastAsia="Calibri" w:hAnsi="Calibri"/>
+                <w:sz w:val="21"/>
+                <w:szCs w:val="21"/>
+              </w:rPr>
+              <w:t xml:space="preserve"> (por ejemplo 1.477 USD), tienes marcada la plantilla </w:t>
+            </w:r>
+            <w:r>
+              <w:rPr>
+                <w:rFonts w:ascii="Calibri" w:cs="Calibri" w:eastAsia="Calibri" w:hAnsi="Calibri"/>
+                <w:i/>
+                <w:iCs/>
+                <w:sz w:val="21"/>
+                <w:szCs w:val="21"/>
+              </w:rPr>
+              <w:t xml:space="preserve">Producción</w:t>
+            </w:r>
+            <w:r>
+              <w:rPr>
+                <w:rFonts w:ascii="Calibri" w:cs="Calibri" w:eastAsia="Calibri" w:hAnsi="Calibri"/>
+                <w:sz w:val="21"/>
+                <w:szCs w:val="21"/>
+              </w:rPr>
+              <w:t xml:space="preserve">, una instalación </w:t>
+            </w:r>
+            <w:r>
+              <w:rPr>
+                <w:rFonts w:ascii="Calibri" w:cs="Calibri" w:eastAsia="Calibri" w:hAnsi="Calibri"/>
+                <w:i/>
+                <w:iCs/>
+                <w:sz w:val="21"/>
+                <w:szCs w:val="21"/>
+              </w:rPr>
+              <w:t xml:space="preserve">multi-AZ</w:t>
+            </w:r>
+            <w:r>
+              <w:rPr>
+                <w:rFonts w:ascii="Calibri" w:cs="Calibri" w:eastAsia="Calibri" w:hAnsi="Calibri"/>
+                <w:sz w:val="21"/>
+                <w:szCs w:val="21"/>
+              </w:rPr>
+              <w:t xml:space="preserve"> o el disco </w:t>
+            </w:r>
+            <w:r>
+              <w:rPr>
+                <w:rFonts w:ascii="Calibri" w:cs="Calibri" w:eastAsia="Calibri" w:hAnsi="Calibri"/>
+                <w:i/>
+                <w:iCs/>
+                <w:sz w:val="21"/>
+                <w:szCs w:val="21"/>
+              </w:rPr>
+              <w:t xml:space="preserve">io2</w:t>
+            </w:r>
+            <w:r>
+              <w:rPr>
+                <w:rFonts w:ascii="Calibri" w:cs="Calibri" w:eastAsia="Calibri" w:hAnsi="Calibri"/>
+                <w:sz w:val="21"/>
+                <w:szCs w:val="21"/>
+              </w:rPr>
+              <w:t xml:space="preserve">. </w:t>
+            </w:r>
+            <w:r>
+              <w:rPr>
+                <w:rFonts w:ascii="Calibri" w:cs="Calibri" w:eastAsia="Calibri" w:hAnsi="Calibri"/>
+                <w:b/>
+                <w:bCs/>
+                <w:sz w:val="21"/>
+                <w:szCs w:val="21"/>
+              </w:rPr>
+              <w:t xml:space="preserve">No crees la base</w:t>
+            </w:r>
+            <w:r>
+              <w:rPr>
+                <w:rFonts w:ascii="Calibri" w:cs="Calibri" w:eastAsia="Calibri" w:hAnsi="Calibri"/>
+                <w:sz w:val="21"/>
+                <w:szCs w:val="21"/>
+              </w:rPr>
+              <w:t xml:space="preserve"> hasta corregirlo con los pasos de abajo.</w:t>
+            </w:r>
+          </w:p>
+        </w:tc>
+      </w:tr>
+    </w:tbl>
+    <w:p>
+      <w:pPr>
+        <w:spacing w:after="0" w:line="160"/>
+      </w:pPr>
+      <w:r>
+        <w:rPr>
+          <w:sz w:val="4"/>
+          <w:szCs w:val="4"/>
+        </w:rPr>
+        <w:t xml:space="preserve"/>
+      </w:r>
+    </w:p>
+    <w:p>
+      <w:pPr>
+        <w:pStyle w:val="ListParagraph"/>
+        <w:numPr>
+          <w:ilvl w:val="0"/>
+          <w:numId w:val="19"/>
+        </w:numPr>
+        <w:spacing w:after="70" w:line="276"/>
+      </w:pPr>
+      <w:r>
+        <w:rPr>
+          <w:rFonts w:ascii="Calibri" w:cs="Calibri" w:eastAsia="Calibri" w:hAnsi="Calibri"/>
+        </w:rPr>
+        <w:t xml:space="preserve">Busca </w:t>
+      </w:r>
+      <w:r>
+        <w:rPr>
+          <w:rFonts w:ascii="Consolas" w:cs="Consolas" w:eastAsia="Consolas" w:hAnsi="Consolas"/>
+          <w:color w:val="9F1239"/>
+          <w:sz w:val="20"/>
+          <w:szCs w:val="20"/>
+          <w:shd w:fill="F3F4F6" w:color="auto" w:val="clear"/>
+        </w:rPr>
+        <w:t xml:space="preserve">RDS</w:t>
+      </w:r>
+      <w:r>
+        <w:rPr>
+          <w:rFonts w:ascii="Calibri" w:cs="Calibri" w:eastAsia="Calibri" w:hAnsi="Calibri"/>
+        </w:rPr>
+        <w:t xml:space="preserve"> y entra. Menú izquierdo ➔ </w:t>
+      </w:r>
+      <w:r>
+        <w:rPr>
+          <w:rFonts w:ascii="Calibri" w:cs="Calibri" w:eastAsia="Calibri" w:hAnsi="Calibri"/>
+          <w:b/>
+          <w:bCs/>
+        </w:rPr>
+        <w:t xml:space="preserve">Bases de datos</w:t>
+      </w:r>
+      <w:r>
+        <w:rPr>
+          <w:rFonts w:ascii="Calibri" w:cs="Calibri" w:eastAsia="Calibri" w:hAnsi="Calibri"/>
+        </w:rPr>
+        <w:t xml:space="preserve"> ➔ botón naranja </w:t>
+      </w:r>
+      <w:r>
+        <w:rPr>
+          <w:rFonts w:ascii="Calibri" w:cs="Calibri" w:eastAsia="Calibri" w:hAnsi="Calibri"/>
+          <w:b/>
+          <w:bCs/>
+        </w:rPr>
+        <w:t xml:space="preserve">Crear base de datos</w:t>
+      </w:r>
+      <w:r>
+        <w:rPr>
+          <w:rFonts w:ascii="Calibri" w:cs="Calibri" w:eastAsia="Calibri" w:hAnsi="Calibri"/>
+        </w:rPr>
+        <w:t xml:space="preserve">.</w:t>
+      </w:r>
+    </w:p>
+    <w:p>
+      <w:pPr>
+        <w:pStyle w:val="ListParagraph"/>
+        <w:numPr>
+          <w:ilvl w:val="0"/>
+          <w:numId w:val="19"/>
+        </w:numPr>
+        <w:spacing w:after="70" w:line="276"/>
+      </w:pPr>
+      <w:r>
+        <w:rPr>
+          <w:rFonts w:ascii="Calibri" w:cs="Calibri" w:eastAsia="Calibri" w:hAnsi="Calibri"/>
+          <w:b/>
+          <w:bCs/>
+        </w:rPr>
+        <w:t xml:space="preserve">Opciones del motor</w:t>
+      </w:r>
+      <w:r>
+        <w:rPr>
+          <w:rFonts w:ascii="Calibri" w:cs="Calibri" w:eastAsia="Calibri" w:hAnsi="Calibri"/>
+        </w:rPr>
+        <w:t xml:space="preserve"> ➔ </w:t>
+      </w:r>
+      <w:r>
+        <w:rPr>
+          <w:rFonts w:ascii="Calibri" w:cs="Calibri" w:eastAsia="Calibri" w:hAnsi="Calibri"/>
+          <w:b/>
+          <w:bCs/>
+        </w:rPr>
+        <w:t xml:space="preserve">Tipo de motor</w:t>
+      </w:r>
+      <w:r>
+        <w:rPr>
+          <w:rFonts w:ascii="Calibri" w:cs="Calibri" w:eastAsia="Calibri" w:hAnsi="Calibri"/>
+        </w:rPr>
+        <w:t xml:space="preserve">: haz clic en el recuadro </w:t>
+      </w:r>
+      <w:r>
+        <w:rPr>
+          <w:rFonts w:ascii="Calibri" w:cs="Calibri" w:eastAsia="Calibri" w:hAnsi="Calibri"/>
+          <w:b/>
+          <w:bCs/>
+        </w:rPr>
+        <w:t xml:space="preserve">PostgreSQL</w:t>
+      </w:r>
+      <w:r>
+        <w:rPr>
+          <w:rFonts w:ascii="Calibri" w:cs="Calibri" w:eastAsia="Calibri" w:hAnsi="Calibri"/>
+        </w:rPr>
+        <w:t xml:space="preserve"> (no Aurora).</w:t>
+      </w:r>
+    </w:p>
+    <w:p>
+      <w:pPr>
+        <w:pStyle w:val="ListParagraph"/>
+        <w:numPr>
+          <w:ilvl w:val="0"/>
+          <w:numId w:val="19"/>
+        </w:numPr>
+        <w:spacing w:after="70" w:line="276"/>
+      </w:pPr>
+      <w:r>
+        <w:rPr>
+          <w:rFonts w:ascii="Calibri" w:cs="Calibri" w:eastAsia="Calibri" w:hAnsi="Calibri"/>
+          <w:b/>
+          <w:bCs/>
+        </w:rPr>
+        <w:t xml:space="preserve">Elegir un método de creación de base de datos</w:t>
+      </w:r>
+      <w:r>
+        <w:rPr>
+          <w:rFonts w:ascii="Calibri" w:cs="Calibri" w:eastAsia="Calibri" w:hAnsi="Calibri"/>
+        </w:rPr>
+        <w:t xml:space="preserve">: marca </w:t>
+      </w:r>
+      <w:r>
+        <w:rPr>
+          <w:rFonts w:ascii="Calibri" w:cs="Calibri" w:eastAsia="Calibri" w:hAnsi="Calibri"/>
+          <w:b/>
+          <w:bCs/>
+        </w:rPr>
+        <w:t xml:space="preserve">Configuración completa</w:t>
+      </w:r>
+      <w:r>
+        <w:rPr>
+          <w:rFonts w:ascii="Calibri" w:cs="Calibri" w:eastAsia="Calibri" w:hAnsi="Calibri"/>
+        </w:rPr>
+        <w:t xml:space="preserve">.</w:t>
+      </w:r>
+    </w:p>
+    <w:p>
+      <w:pPr>
+        <w:pStyle w:val="ListParagraph"/>
+        <w:numPr>
+          <w:ilvl w:val="0"/>
+          <w:numId w:val="19"/>
+        </w:numPr>
+        <w:spacing w:after="70" w:line="276"/>
+      </w:pPr>
+      <w:r>
+        <w:rPr>
+          <w:rFonts w:ascii="Calibri" w:cs="Calibri" w:eastAsia="Calibri" w:hAnsi="Calibri"/>
+          <w:b/>
+          <w:bCs/>
+        </w:rPr>
+        <w:t xml:space="preserve">Plantillas</w:t>
+      </w:r>
+      <w:r>
+        <w:rPr>
+          <w:rFonts w:ascii="Calibri" w:cs="Calibri" w:eastAsia="Calibri" w:hAnsi="Calibri"/>
+        </w:rPr>
+        <w:t xml:space="preserve">: marca </w:t>
+      </w:r>
+      <w:r>
+        <w:rPr>
+          <w:rFonts w:ascii="Calibri" w:cs="Calibri" w:eastAsia="Calibri" w:hAnsi="Calibri"/>
+          <w:b/>
+          <w:bCs/>
+        </w:rPr>
+        <w:t xml:space="preserve">Entorno de pruebas</w:t>
+      </w:r>
+      <w:r>
+        <w:rPr>
+          <w:rFonts w:ascii="Calibri" w:cs="Calibri" w:eastAsia="Calibri" w:hAnsi="Calibri"/>
+        </w:rPr>
+        <w:t xml:space="preserve"> (Sandbox). </w:t>
+      </w:r>
+      <w:r>
+        <w:rPr>
+          <w:rFonts w:ascii="Calibri" w:cs="Calibri" w:eastAsia="Calibri" w:hAnsi="Calibri"/>
+          <w:b/>
+          <w:bCs/>
+        </w:rPr>
+        <w:t xml:space="preserve">No</w:t>
+      </w:r>
+      <w:r>
+        <w:rPr>
+          <w:rFonts w:ascii="Calibri" w:cs="Calibri" w:eastAsia="Calibri" w:hAnsi="Calibri"/>
+        </w:rPr>
+        <w:t xml:space="preserve"> elijas </w:t>
+      </w:r>
+      <w:r>
+        <w:rPr>
+          <w:rFonts w:ascii="Calibri" w:cs="Calibri" w:eastAsia="Calibri" w:hAnsi="Calibri"/>
+          <w:i/>
+          <w:iCs/>
+        </w:rPr>
+        <w:t xml:space="preserve">Producción</w:t>
+      </w:r>
+      <w:r>
+        <w:rPr>
+          <w:rFonts w:ascii="Calibri" w:cs="Calibri" w:eastAsia="Calibri" w:hAnsi="Calibri"/>
+        </w:rPr>
+        <w:t xml:space="preserve"> ni </w:t>
+      </w:r>
+      <w:r>
+        <w:rPr>
+          <w:rFonts w:ascii="Calibri" w:cs="Calibri" w:eastAsia="Calibri" w:hAnsi="Calibri"/>
+          <w:i/>
+          <w:iCs/>
+        </w:rPr>
+        <w:t xml:space="preserve">Desarrollo y pruebas</w:t>
+      </w:r>
+      <w:r>
+        <w:rPr>
+          <w:rFonts w:ascii="Calibri" w:cs="Calibri" w:eastAsia="Calibri" w:hAnsi="Calibri"/>
+        </w:rPr>
+        <w:t xml:space="preserve">: esas activan opciones caras.</w:t>
+      </w:r>
+    </w:p>
+    <w:p>
+      <w:pPr>
+        <w:pStyle w:val="ListParagraph"/>
+        <w:numPr>
+          <w:ilvl w:val="0"/>
+          <w:numId w:val="19"/>
+        </w:numPr>
+        <w:spacing w:after="70" w:line="276"/>
+      </w:pPr>
+      <w:r>
+        <w:rPr>
+          <w:rFonts w:ascii="Calibri" w:cs="Calibri" w:eastAsia="Calibri" w:hAnsi="Calibri"/>
+          <w:b/>
+          <w:bCs/>
+        </w:rPr>
+        <w:t xml:space="preserve">Disponibilidad y durabilidad</w:t>
+      </w:r>
+      <w:r>
+        <w:rPr>
+          <w:rFonts w:ascii="Calibri" w:cs="Calibri" w:eastAsia="Calibri" w:hAnsi="Calibri"/>
+        </w:rPr>
+        <w:t xml:space="preserve"> ➔ </w:t>
+      </w:r>
+      <w:r>
+        <w:rPr>
+          <w:rFonts w:ascii="Calibri" w:cs="Calibri" w:eastAsia="Calibri" w:hAnsi="Calibri"/>
+          <w:b/>
+          <w:bCs/>
+        </w:rPr>
+        <w:t xml:space="preserve">Opciones de implementación</w:t>
+      </w:r>
+      <w:r>
+        <w:rPr>
+          <w:rFonts w:ascii="Calibri" w:cs="Calibri" w:eastAsia="Calibri" w:hAnsi="Calibri"/>
+        </w:rPr>
+        <w:t xml:space="preserve">: marca </w:t>
+      </w:r>
+      <w:r>
+        <w:rPr>
+          <w:rFonts w:ascii="Calibri" w:cs="Calibri" w:eastAsia="Calibri" w:hAnsi="Calibri"/>
+          <w:b/>
+          <w:bCs/>
+        </w:rPr>
+        <w:t xml:space="preserve">Implementación de una instancia de base de datos de zona de disponibilidad única (1 instancia)</w:t>
+      </w:r>
+      <w:r>
+        <w:rPr>
+          <w:rFonts w:ascii="Calibri" w:cs="Calibri" w:eastAsia="Calibri" w:hAnsi="Calibri"/>
+        </w:rPr>
+        <w:t xml:space="preserve">. Con </w:t>
+      </w:r>
+      <w:r>
+        <w:rPr>
+          <w:rFonts w:ascii="Calibri" w:cs="Calibri" w:eastAsia="Calibri" w:hAnsi="Calibri"/>
+          <w:i/>
+          <w:iCs/>
+        </w:rPr>
+        <w:t xml:space="preserve">Entorno de pruebas</w:t>
+      </w:r>
+      <w:r>
+        <w:rPr>
+          <w:rFonts w:ascii="Calibri" w:cs="Calibri" w:eastAsia="Calibri" w:hAnsi="Calibri"/>
+        </w:rPr>
+        <w:t xml:space="preserve"> ya viene marcada.</w:t>
+      </w:r>
+    </w:p>
+    <w:p>
+      <w:pPr>
+        <w:pStyle w:val="ListParagraph"/>
+        <w:numPr>
+          <w:ilvl w:val="0"/>
+          <w:numId w:val="19"/>
+        </w:numPr>
+        <w:spacing w:after="70" w:line="276"/>
+      </w:pPr>
+      <w:r>
+        <w:rPr>
+          <w:rFonts w:ascii="Calibri" w:cs="Calibri" w:eastAsia="Calibri" w:hAnsi="Calibri"/>
+          <w:b/>
+          <w:bCs/>
+        </w:rPr>
+        <w:t xml:space="preserve">Versión del motor</w:t>
+      </w:r>
+      <w:r>
+        <w:rPr>
+          <w:rFonts w:ascii="Calibri" w:cs="Calibri" w:eastAsia="Calibri" w:hAnsi="Calibri"/>
+        </w:rPr>
+        <w:t xml:space="preserve">: deja la que aparece (o elige una PostgreSQL 16 o 17 si la ves). </w:t>
+      </w:r>
+      <w:r>
+        <w:rPr>
+          <w:rFonts w:ascii="Calibri" w:cs="Calibri" w:eastAsia="Calibri" w:hAnsi="Calibri"/>
+          <w:b/>
+          <w:bCs/>
+        </w:rPr>
+        <w:t xml:space="preserve">No</w:t>
+      </w:r>
+      <w:r>
+        <w:rPr>
+          <w:rFonts w:ascii="Calibri" w:cs="Calibri" w:eastAsia="Calibri" w:hAnsi="Calibri"/>
+        </w:rPr>
+        <w:t xml:space="preserve"> marques </w:t>
+      </w:r>
+      <w:r>
+        <w:rPr>
+          <w:rFonts w:ascii="Calibri" w:cs="Calibri" w:eastAsia="Calibri" w:hAnsi="Calibri"/>
+          <w:i/>
+          <w:iCs/>
+        </w:rPr>
+        <w:t xml:space="preserve">Activar el soporte extendido de RDS</w:t>
+      </w:r>
+      <w:r>
+        <w:rPr>
+          <w:rFonts w:ascii="Calibri" w:cs="Calibri" w:eastAsia="Calibri" w:hAnsi="Calibri"/>
+        </w:rPr>
+        <w:t xml:space="preserve"> (tiene costo).</w:t>
+      </w:r>
+    </w:p>
+    <w:p>
+      <w:pPr>
+        <w:pStyle w:val="ListParagraph"/>
+        <w:numPr>
+          <w:ilvl w:val="0"/>
+          <w:numId w:val="19"/>
+        </w:numPr>
+        <w:spacing w:after="70" w:line="276"/>
+      </w:pPr>
+      <w:r>
+        <w:rPr>
+          <w:rFonts w:ascii="Calibri" w:cs="Calibri" w:eastAsia="Calibri" w:hAnsi="Calibri"/>
+          <w:b/>
+          <w:bCs/>
+        </w:rPr>
+        <w:t xml:space="preserve">Identificador de instancia de base de datos</w:t>
+      </w:r>
+      <w:r>
+        <w:rPr>
+          <w:rFonts w:ascii="Calibri" w:cs="Calibri" w:eastAsia="Calibri" w:hAnsi="Calibri"/>
+        </w:rPr>
+        <w:t xml:space="preserve">: escribe </w:t>
+      </w:r>
+      <w:r>
+        <w:rPr>
+          <w:rFonts w:ascii="Consolas" w:cs="Consolas" w:eastAsia="Consolas" w:hAnsi="Consolas"/>
+          <w:color w:val="9F1239"/>
+          <w:sz w:val="20"/>
+          <w:szCs w:val="20"/>
+          <w:shd w:fill="F3F4F6" w:color="auto" w:val="clear"/>
+        </w:rPr>
+        <w:t xml:space="preserve">tubeyou-rds</w:t>
+      </w:r>
+      <w:r>
+        <w:rPr>
+          <w:rFonts w:ascii="Calibri" w:cs="Calibri" w:eastAsia="Calibri" w:hAnsi="Calibri"/>
+        </w:rPr>
+        <w:t xml:space="preserve">. (Si el campo dice </w:t>
+      </w:r>
+      <w:r>
+        <w:rPr>
+          <w:rFonts w:ascii="Calibri" w:cs="Calibri" w:eastAsia="Calibri" w:hAnsi="Calibri"/>
+          <w:i/>
+          <w:iCs/>
+        </w:rPr>
+        <w:t xml:space="preserve">Identificador del clúster</w:t>
+      </w:r>
+      <w:r>
+        <w:rPr>
+          <w:rFonts w:ascii="Calibri" w:cs="Calibri" w:eastAsia="Calibri" w:hAnsi="Calibri"/>
+        </w:rPr>
+        <w:t xml:space="preserve">, es que sigues en una opción multi-AZ: vuelve al paso 5.)</w:t>
+      </w:r>
+    </w:p>
+    <w:p>
+      <w:pPr>
+        <w:pStyle w:val="ListParagraph"/>
+        <w:numPr>
+          <w:ilvl w:val="0"/>
+          <w:numId w:val="19"/>
+        </w:numPr>
+        <w:spacing w:after="70" w:line="276"/>
+      </w:pPr>
+      <w:r>
+        <w:rPr>
+          <w:rFonts w:ascii="Calibri" w:cs="Calibri" w:eastAsia="Calibri" w:hAnsi="Calibri"/>
+          <w:b/>
+          <w:bCs/>
+        </w:rPr>
+        <w:t xml:space="preserve">Configuración de credenciales</w:t>
+      </w:r>
+      <w:r>
+        <w:rPr>
+          <w:rFonts w:ascii="Calibri" w:cs="Calibri" w:eastAsia="Calibri" w:hAnsi="Calibri"/>
+        </w:rPr>
+        <w:t xml:space="preserve"> ➔ </w:t>
+      </w:r>
+      <w:r>
+        <w:rPr>
+          <w:rFonts w:ascii="Calibri" w:cs="Calibri" w:eastAsia="Calibri" w:hAnsi="Calibri"/>
+          <w:b/>
+          <w:bCs/>
+        </w:rPr>
+        <w:t xml:space="preserve">Nombre de usuario maestro</w:t>
+      </w:r>
+      <w:r>
+        <w:rPr>
+          <w:rFonts w:ascii="Calibri" w:cs="Calibri" w:eastAsia="Calibri" w:hAnsi="Calibri"/>
+        </w:rPr>
+        <w:t xml:space="preserve">: escribe </w:t>
+      </w:r>
+      <w:r>
+        <w:rPr>
+          <w:rFonts w:ascii="Consolas" w:cs="Consolas" w:eastAsia="Consolas" w:hAnsi="Consolas"/>
+          <w:color w:val="9F1239"/>
+          <w:sz w:val="20"/>
+          <w:szCs w:val="20"/>
+          <w:shd w:fill="F3F4F6" w:color="auto" w:val="clear"/>
+        </w:rPr>
+        <w:t xml:space="preserve">postgres</w:t>
+      </w:r>
+      <w:r>
+        <w:rPr>
+          <w:rFonts w:ascii="Calibri" w:cs="Calibri" w:eastAsia="Calibri" w:hAnsi="Calibri"/>
+        </w:rPr>
+        <w:t xml:space="preserve">.</w:t>
+      </w:r>
+    </w:p>
+    <w:p>
+      <w:pPr>
+        <w:pStyle w:val="ListParagraph"/>
+        <w:numPr>
+          <w:ilvl w:val="0"/>
+          <w:numId w:val="19"/>
+        </w:numPr>
+        <w:spacing w:after="70" w:line="276"/>
+      </w:pPr>
+      <w:r>
+        <w:rPr>
+          <w:rFonts w:ascii="Calibri" w:cs="Calibri" w:eastAsia="Calibri" w:hAnsi="Calibri"/>
+          <w:b/>
+          <w:bCs/>
+        </w:rPr>
+        <w:t xml:space="preserve">Administración de credenciales</w:t>
+      </w:r>
+      <w:r>
+        <w:rPr>
+          <w:rFonts w:ascii="Calibri" w:cs="Calibri" w:eastAsia="Calibri" w:hAnsi="Calibri"/>
+        </w:rPr>
+        <w:t xml:space="preserve">: marca </w:t>
+      </w:r>
+      <w:r>
+        <w:rPr>
+          <w:rFonts w:ascii="Calibri" w:cs="Calibri" w:eastAsia="Calibri" w:hAnsi="Calibri"/>
+          <w:b/>
+          <w:bCs/>
+        </w:rPr>
+        <w:t xml:space="preserve">Autoadministrado</w:t>
+      </w:r>
+      <w:r>
+        <w:rPr>
+          <w:rFonts w:ascii="Calibri" w:cs="Calibri" w:eastAsia="Calibri" w:hAnsi="Calibri"/>
+        </w:rPr>
+        <w:t xml:space="preserve"> (no </w:t>
+      </w:r>
+      <w:r>
+        <w:rPr>
+          <w:rFonts w:ascii="Calibri" w:cs="Calibri" w:eastAsia="Calibri" w:hAnsi="Calibri"/>
+          <w:i/>
+          <w:iCs/>
+        </w:rPr>
+        <w:t xml:space="preserve">Administrado en AWS Secrets Manager</w:t>
+      </w:r>
+      <w:r>
+        <w:rPr>
+          <w:rFonts w:ascii="Calibri" w:cs="Calibri" w:eastAsia="Calibri" w:hAnsi="Calibri"/>
+        </w:rPr>
+        <w:t xml:space="preserve">, que cobra aparte).</w:t>
+      </w:r>
+    </w:p>
+    <w:p>
+      <w:pPr>
+        <w:pStyle w:val="ListParagraph"/>
+        <w:numPr>
+          <w:ilvl w:val="0"/>
+          <w:numId w:val="19"/>
+        </w:numPr>
+        <w:spacing w:after="70" w:line="276"/>
+      </w:pPr>
+      <w:r>
+        <w:rPr>
+          <w:rFonts w:ascii="Calibri" w:cs="Calibri" w:eastAsia="Calibri" w:hAnsi="Calibri"/>
+        </w:rPr>
+        <w:t xml:space="preserve">En </w:t>
+      </w:r>
+      <w:r>
+        <w:rPr>
+          <w:rFonts w:ascii="Calibri" w:cs="Calibri" w:eastAsia="Calibri" w:hAnsi="Calibri"/>
+          <w:b/>
+          <w:bCs/>
+        </w:rPr>
+        <w:t xml:space="preserve">Contraseña maestra</w:t>
+      </w:r>
+      <w:r>
+        <w:rPr>
+          <w:rFonts w:ascii="Calibri" w:cs="Calibri" w:eastAsia="Calibri" w:hAnsi="Calibri"/>
+        </w:rPr>
+        <w:t xml:space="preserve"> escribe una clave (ejemplo </w:t>
+      </w:r>
+      <w:r>
+        <w:rPr>
+          <w:rFonts w:ascii="Consolas" w:cs="Consolas" w:eastAsia="Consolas" w:hAnsi="Consolas"/>
+          <w:color w:val="9F1239"/>
+          <w:sz w:val="20"/>
+          <w:szCs w:val="20"/>
+          <w:shd w:fill="F3F4F6" w:color="auto" w:val="clear"/>
+        </w:rPr>
+        <w:t xml:space="preserve">TuClaveSegura2026</w:t>
+      </w:r>
+      <w:r>
+        <w:rPr>
+          <w:rFonts w:ascii="Calibri" w:cs="Calibri" w:eastAsia="Calibri" w:hAnsi="Calibri"/>
+        </w:rPr>
+        <w:t xml:space="preserve">) y repítela en </w:t>
+      </w:r>
+      <w:r>
+        <w:rPr>
+          <w:rFonts w:ascii="Calibri" w:cs="Calibri" w:eastAsia="Calibri" w:hAnsi="Calibri"/>
+          <w:b/>
+          <w:bCs/>
+        </w:rPr>
+        <w:t xml:space="preserve">Confirmar contraseña maestra</w:t>
+      </w:r>
+      <w:r>
+        <w:rPr>
+          <w:rFonts w:ascii="Calibri" w:cs="Calibri" w:eastAsia="Calibri" w:hAnsi="Calibri"/>
+        </w:rPr>
+        <w:t xml:space="preserve">. </w:t>
+      </w:r>
+      <w:r>
+        <w:rPr>
+          <w:rFonts w:ascii="Calibri" w:cs="Calibri" w:eastAsia="Calibri" w:hAnsi="Calibri"/>
+          <w:b/>
+          <w:bCs/>
+        </w:rPr>
+        <w:t xml:space="preserve">Anótala en la hoja de datos.</w:t>
+      </w:r>
+      <w:r>
+        <w:rPr>
+          <w:rFonts w:ascii="Calibri" w:cs="Calibri" w:eastAsia="Calibri" w:hAnsi="Calibri"/>
+        </w:rPr>
+        <w:t xml:space="preserve"> Usa solo letras y números.</w:t>
+      </w:r>
+    </w:p>
+    <w:p>
+      <w:pPr>
+        <w:pStyle w:val="ListParagraph"/>
+        <w:numPr>
+          <w:ilvl w:val="0"/>
+          <w:numId w:val="19"/>
+        </w:numPr>
+        <w:spacing w:after="70" w:line="276"/>
+      </w:pPr>
+      <w:r>
+        <w:rPr>
+          <w:rFonts w:ascii="Calibri" w:cs="Calibri" w:eastAsia="Calibri" w:hAnsi="Calibri"/>
+          <w:b/>
+          <w:bCs/>
+        </w:rPr>
+        <w:t xml:space="preserve">Opciones de autenticación de bases de datos</w:t>
+      </w:r>
+      <w:r>
+        <w:rPr>
+          <w:rFonts w:ascii="Calibri" w:cs="Calibri" w:eastAsia="Calibri" w:hAnsi="Calibri"/>
+        </w:rPr>
+        <w:t xml:space="preserve">: deja </w:t>
+      </w:r>
+      <w:r>
+        <w:rPr>
+          <w:rFonts w:ascii="Calibri" w:cs="Calibri" w:eastAsia="Calibri" w:hAnsi="Calibri"/>
+          <w:b/>
+          <w:bCs/>
+        </w:rPr>
+        <w:t xml:space="preserve">Autenticación con contraseña</w:t>
+      </w:r>
+      <w:r>
+        <w:rPr>
+          <w:rFonts w:ascii="Calibri" w:cs="Calibri" w:eastAsia="Calibri" w:hAnsi="Calibri"/>
+        </w:rPr>
+        <w:t xml:space="preserve">.</w:t>
+      </w:r>
+    </w:p>
+    <w:p>
+      <w:pPr>
+        <w:pStyle w:val="ListParagraph"/>
+        <w:numPr>
+          <w:ilvl w:val="0"/>
+          <w:numId w:val="19"/>
+        </w:numPr>
+        <w:spacing w:after="70" w:line="276"/>
+      </w:pPr>
+      <w:r>
+        <w:rPr>
+          <w:rFonts w:ascii="Calibri" w:cs="Calibri" w:eastAsia="Calibri" w:hAnsi="Calibri"/>
+          <w:b/>
+          <w:bCs/>
+        </w:rPr>
+        <w:t xml:space="preserve">Configuración de la instancia</w:t>
+      </w:r>
+      <w:r>
+        <w:rPr>
+          <w:rFonts w:ascii="Calibri" w:cs="Calibri" w:eastAsia="Calibri" w:hAnsi="Calibri"/>
+        </w:rPr>
+        <w:t xml:space="preserve"> ➔ </w:t>
+      </w:r>
+      <w:r>
+        <w:rPr>
+          <w:rFonts w:ascii="Calibri" w:cs="Calibri" w:eastAsia="Calibri" w:hAnsi="Calibri"/>
+          <w:b/>
+          <w:bCs/>
+        </w:rPr>
+        <w:t xml:space="preserve">Clase de instancia de base de datos</w:t>
+      </w:r>
+      <w:r>
+        <w:rPr>
+          <w:rFonts w:ascii="Calibri" w:cs="Calibri" w:eastAsia="Calibri" w:hAnsi="Calibri"/>
+        </w:rPr>
+        <w:t xml:space="preserve">: marca </w:t>
+      </w:r>
+      <w:r>
+        <w:rPr>
+          <w:rFonts w:ascii="Calibri" w:cs="Calibri" w:eastAsia="Calibri" w:hAnsi="Calibri"/>
+          <w:b/>
+          <w:bCs/>
+        </w:rPr>
+        <w:t xml:space="preserve">Clases ampliables (incluye clases t)</w:t>
+      </w:r>
+      <w:r>
+        <w:rPr>
+          <w:rFonts w:ascii="Calibri" w:cs="Calibri" w:eastAsia="Calibri" w:hAnsi="Calibri"/>
+        </w:rPr>
+        <w:t xml:space="preserve">. Si solo ves </w:t>
+      </w:r>
+      <w:r>
+        <w:rPr>
+          <w:rFonts w:ascii="Calibri" w:cs="Calibri" w:eastAsia="Calibri" w:hAnsi="Calibri"/>
+          <w:i/>
+          <w:iCs/>
+        </w:rPr>
+        <w:t xml:space="preserve">Clases estándar (incluye clases m)</w:t>
+      </w:r>
+      <w:r>
+        <w:rPr>
+          <w:rFonts w:ascii="Calibri" w:cs="Calibri" w:eastAsia="Calibri" w:hAnsi="Calibri"/>
+        </w:rPr>
+        <w:t xml:space="preserve"> sin la opción de clases t, regresa y confirma que la plantilla sea </w:t>
+      </w:r>
+      <w:r>
+        <w:rPr>
+          <w:rFonts w:ascii="Calibri" w:cs="Calibri" w:eastAsia="Calibri" w:hAnsi="Calibri"/>
+          <w:i/>
+          <w:iCs/>
+        </w:rPr>
+        <w:t xml:space="preserve">Entorno de pruebas</w:t>
+      </w:r>
+      <w:r>
+        <w:rPr>
+          <w:rFonts w:ascii="Calibri" w:cs="Calibri" w:eastAsia="Calibri" w:hAnsi="Calibri"/>
+        </w:rPr>
+        <w:t xml:space="preserve">.</w:t>
+      </w:r>
+    </w:p>
+    <w:p>
+      <w:pPr>
+        <w:pStyle w:val="ListParagraph"/>
+        <w:numPr>
+          <w:ilvl w:val="0"/>
+          <w:numId w:val="19"/>
+        </w:numPr>
+        <w:spacing w:after="70" w:line="276"/>
+      </w:pPr>
+      <w:r>
+        <w:rPr>
+          <w:rFonts w:ascii="Calibri" w:cs="Calibri" w:eastAsia="Calibri" w:hAnsi="Calibri"/>
+        </w:rPr>
+        <w:t xml:space="preserve">En </w:t>
+      </w:r>
+      <w:r>
+        <w:rPr>
+          <w:rFonts w:ascii="Calibri" w:cs="Calibri" w:eastAsia="Calibri" w:hAnsi="Calibri"/>
+          <w:b/>
+          <w:bCs/>
+        </w:rPr>
+        <w:t xml:space="preserve">Tipo de instancia</w:t>
+      </w:r>
+      <w:r>
+        <w:rPr>
+          <w:rFonts w:ascii="Calibri" w:cs="Calibri" w:eastAsia="Calibri" w:hAnsi="Calibri"/>
+        </w:rPr>
+        <w:t xml:space="preserve"> elige </w:t>
+      </w:r>
+      <w:r>
+        <w:rPr>
+          <w:rFonts w:ascii="Consolas" w:cs="Consolas" w:eastAsia="Consolas" w:hAnsi="Consolas"/>
+          <w:color w:val="9F1239"/>
+          <w:sz w:val="20"/>
+          <w:szCs w:val="20"/>
+          <w:shd w:fill="F3F4F6" w:color="auto" w:val="clear"/>
+        </w:rPr>
+        <w:t xml:space="preserve">db.t3.micro</w:t>
+      </w:r>
+      <w:r>
+        <w:rPr>
+          <w:rFonts w:ascii="Calibri" w:cs="Calibri" w:eastAsia="Calibri" w:hAnsi="Calibri"/>
+        </w:rPr>
+        <w:t xml:space="preserve"> o </w:t>
+      </w:r>
+      <w:r>
+        <w:rPr>
+          <w:rFonts w:ascii="Consolas" w:cs="Consolas" w:eastAsia="Consolas" w:hAnsi="Consolas"/>
+          <w:color w:val="9F1239"/>
+          <w:sz w:val="20"/>
+          <w:szCs w:val="20"/>
+          <w:shd w:fill="F3F4F6" w:color="auto" w:val="clear"/>
+        </w:rPr>
+        <w:t xml:space="preserve">db.t4g.micro</w:t>
+      </w:r>
+      <w:r>
+        <w:rPr>
+          <w:rFonts w:ascii="Calibri" w:cs="Calibri" w:eastAsia="Calibri" w:hAnsi="Calibri"/>
+        </w:rPr>
+        <w:t xml:space="preserve">. Si no aparece ninguna </w:t>
+      </w:r>
+      <w:r>
+        <w:rPr>
+          <w:rFonts w:ascii="Consolas" w:cs="Consolas" w:eastAsia="Consolas" w:hAnsi="Consolas"/>
+          <w:color w:val="9F1239"/>
+          <w:sz w:val="20"/>
+          <w:szCs w:val="20"/>
+          <w:shd w:fill="F3F4F6" w:color="auto" w:val="clear"/>
+        </w:rPr>
+        <w:t xml:space="preserve">micro</w:t>
+      </w:r>
+      <w:r>
+        <w:rPr>
+          <w:rFonts w:ascii="Calibri" w:cs="Calibri" w:eastAsia="Calibri" w:hAnsi="Calibri"/>
+        </w:rPr>
+        <w:t xml:space="preserve">, elige </w:t>
+      </w:r>
+      <w:r>
+        <w:rPr>
+          <w:rFonts w:ascii="Consolas" w:cs="Consolas" w:eastAsia="Consolas" w:hAnsi="Consolas"/>
+          <w:color w:val="9F1239"/>
+          <w:sz w:val="20"/>
+          <w:szCs w:val="20"/>
+          <w:shd w:fill="F3F4F6" w:color="auto" w:val="clear"/>
+        </w:rPr>
+        <w:t xml:space="preserve">db.t3.small</w:t>
+      </w:r>
+      <w:r>
+        <w:rPr>
+          <w:rFonts w:ascii="Calibri" w:cs="Calibri" w:eastAsia="Calibri" w:hAnsi="Calibri"/>
+        </w:rPr>
+        <w:t xml:space="preserve">.</w:t>
+      </w:r>
+    </w:p>
+    <w:p>
+      <w:pPr>
+        <w:pStyle w:val="ListParagraph"/>
+        <w:numPr>
+          <w:ilvl w:val="0"/>
+          <w:numId w:val="19"/>
+        </w:numPr>
+        <w:spacing w:after="70" w:line="276"/>
+      </w:pPr>
+      <w:r>
+        <w:rPr>
+          <w:rFonts w:ascii="Calibri" w:cs="Calibri" w:eastAsia="Calibri" w:hAnsi="Calibri"/>
+          <w:b/>
+          <w:bCs/>
+        </w:rPr>
+        <w:t xml:space="preserve">Almacenamiento</w:t>
+      </w:r>
+      <w:r>
+        <w:rPr>
+          <w:rFonts w:ascii="Calibri" w:cs="Calibri" w:eastAsia="Calibri" w:hAnsi="Calibri"/>
+        </w:rPr>
+        <w:t xml:space="preserve"> ➔ </w:t>
+      </w:r>
+      <w:r>
+        <w:rPr>
+          <w:rFonts w:ascii="Calibri" w:cs="Calibri" w:eastAsia="Calibri" w:hAnsi="Calibri"/>
+          <w:b/>
+          <w:bCs/>
+        </w:rPr>
+        <w:t xml:space="preserve">Tipo de almacenamiento</w:t>
+      </w:r>
+      <w:r>
+        <w:rPr>
+          <w:rFonts w:ascii="Calibri" w:cs="Calibri" w:eastAsia="Calibri" w:hAnsi="Calibri"/>
+        </w:rPr>
+        <w:t xml:space="preserve">: elige </w:t>
+      </w:r>
+      <w:r>
+        <w:rPr>
+          <w:rFonts w:ascii="Calibri" w:cs="Calibri" w:eastAsia="Calibri" w:hAnsi="Calibri"/>
+          <w:b/>
+          <w:bCs/>
+        </w:rPr>
+        <w:t xml:space="preserve">SSD de uso general (gp3)</w:t>
+      </w:r>
+      <w:r>
+        <w:rPr>
+          <w:rFonts w:ascii="Calibri" w:cs="Calibri" w:eastAsia="Calibri" w:hAnsi="Calibri"/>
+        </w:rPr>
+        <w:t xml:space="preserve">. </w:t>
+      </w:r>
+      <w:r>
+        <w:rPr>
+          <w:rFonts w:ascii="Calibri" w:cs="Calibri" w:eastAsia="Calibri" w:hAnsi="Calibri"/>
+          <w:b/>
+          <w:bCs/>
+        </w:rPr>
+        <w:t xml:space="preserve">No</w:t>
+      </w:r>
+      <w:r>
+        <w:rPr>
+          <w:rFonts w:ascii="Calibri" w:cs="Calibri" w:eastAsia="Calibri" w:hAnsi="Calibri"/>
+        </w:rPr>
+        <w:t xml:space="preserve"> dejes </w:t>
+      </w:r>
+      <w:r>
+        <w:rPr>
+          <w:rFonts w:ascii="Calibri" w:cs="Calibri" w:eastAsia="Calibri" w:hAnsi="Calibri"/>
+          <w:i/>
+          <w:iCs/>
+        </w:rPr>
+        <w:t xml:space="preserve">SSD de IOPS provisionadas (io2)</w:t>
+      </w:r>
+      <w:r>
+        <w:rPr>
+          <w:rFonts w:ascii="Calibri" w:cs="Calibri" w:eastAsia="Calibri" w:hAnsi="Calibri"/>
+        </w:rPr>
+        <w:t xml:space="preserve">: pide mínimo 100 GiB y 1.000 IOPS y es la causa de los 1.477 USD.</w:t>
+      </w:r>
+    </w:p>
+    <w:p>
+      <w:pPr>
+        <w:pStyle w:val="ListParagraph"/>
+        <w:numPr>
+          <w:ilvl w:val="0"/>
+          <w:numId w:val="19"/>
+        </w:numPr>
+        <w:spacing w:after="70" w:line="276"/>
+      </w:pPr>
+      <w:r>
+        <w:rPr>
+          <w:rFonts w:ascii="Calibri" w:cs="Calibri" w:eastAsia="Calibri" w:hAnsi="Calibri"/>
+          <w:b/>
+          <w:bCs/>
+        </w:rPr>
+        <w:t xml:space="preserve">Almacenamiento asignado</w:t>
+      </w:r>
+      <w:r>
+        <w:rPr>
+          <w:rFonts w:ascii="Calibri" w:cs="Calibri" w:eastAsia="Calibri" w:hAnsi="Calibri"/>
+        </w:rPr>
+        <w:t xml:space="preserve">: escribe </w:t>
+      </w:r>
+      <w:r>
+        <w:rPr>
+          <w:rFonts w:ascii="Consolas" w:cs="Consolas" w:eastAsia="Consolas" w:hAnsi="Consolas"/>
+          <w:color w:val="9F1239"/>
+          <w:sz w:val="20"/>
+          <w:szCs w:val="20"/>
+          <w:shd w:fill="F3F4F6" w:color="auto" w:val="clear"/>
+        </w:rPr>
+        <w:t xml:space="preserve">20</w:t>
+      </w:r>
+      <w:r>
+        <w:rPr>
+          <w:rFonts w:ascii="Calibri" w:cs="Calibri" w:eastAsia="Calibri" w:hAnsi="Calibri"/>
+        </w:rPr>
+        <w:t xml:space="preserve"> (GiB).</w:t>
+      </w:r>
+    </w:p>
+    <w:p>
+      <w:pPr>
+        <w:pStyle w:val="ListParagraph"/>
+        <w:numPr>
+          <w:ilvl w:val="0"/>
+          <w:numId w:val="19"/>
+        </w:numPr>
+        <w:spacing w:after="70" w:line="276"/>
+      </w:pPr>
+      <w:r>
+        <w:rPr>
+          <w:rFonts w:ascii="Calibri" w:cs="Calibri" w:eastAsia="Calibri" w:hAnsi="Calibri"/>
+        </w:rPr>
+        <w:t xml:space="preserve">Despliega </w:t>
+      </w:r>
+      <w:r>
+        <w:rPr>
+          <w:rFonts w:ascii="Calibri" w:cs="Calibri" w:eastAsia="Calibri" w:hAnsi="Calibri"/>
+          <w:b/>
+          <w:bCs/>
+        </w:rPr>
+        <w:t xml:space="preserve">Configuración de almacenamiento adicional</w:t>
+      </w:r>
+      <w:r>
+        <w:rPr>
+          <w:rFonts w:ascii="Calibri" w:cs="Calibri" w:eastAsia="Calibri" w:hAnsi="Calibri"/>
+        </w:rPr>
+        <w:t xml:space="preserve"> y </w:t>
+      </w:r>
+      <w:r>
+        <w:rPr>
+          <w:rFonts w:ascii="Calibri" w:cs="Calibri" w:eastAsia="Calibri" w:hAnsi="Calibri"/>
+          <w:b/>
+          <w:bCs/>
+        </w:rPr>
+        <w:t xml:space="preserve">desmarca</w:t>
+      </w:r>
+      <w:r>
+        <w:rPr>
+          <w:rFonts w:ascii="Calibri" w:cs="Calibri" w:eastAsia="Calibri" w:hAnsi="Calibri"/>
+        </w:rPr>
+        <w:t xml:space="preserve"> </w:t>
+      </w:r>
+      <w:r>
+        <w:rPr>
+          <w:rFonts w:ascii="Calibri" w:cs="Calibri" w:eastAsia="Calibri" w:hAnsi="Calibri"/>
+          <w:i/>
+          <w:iCs/>
+        </w:rPr>
+        <w:t xml:space="preserve">Habilitar el escalado automático del almacenamiento</w:t>
+      </w:r>
+      <w:r>
+        <w:rPr>
+          <w:rFonts w:ascii="Calibri" w:cs="Calibri" w:eastAsia="Calibri" w:hAnsi="Calibri"/>
+        </w:rPr>
+        <w:t xml:space="preserve">.</w:t>
+      </w:r>
+    </w:p>
+    <w:p>
+      <w:pPr>
+        <w:pStyle w:val="ListParagraph"/>
+        <w:numPr>
+          <w:ilvl w:val="0"/>
+          <w:numId w:val="19"/>
+        </w:numPr>
+        <w:spacing w:after="70" w:line="276"/>
+      </w:pPr>
+      <w:r>
+        <w:rPr>
+          <w:rFonts w:ascii="Calibri" w:cs="Calibri" w:eastAsia="Calibri" w:hAnsi="Calibri"/>
+          <w:b/>
+          <w:bCs/>
+        </w:rPr>
+        <w:t xml:space="preserve">Conectividad</w:t>
+      </w:r>
+      <w:r>
+        <w:rPr>
+          <w:rFonts w:ascii="Calibri" w:cs="Calibri" w:eastAsia="Calibri" w:hAnsi="Calibri"/>
+        </w:rPr>
+        <w:t xml:space="preserve"> ➔ </w:t>
+      </w:r>
+      <w:r>
+        <w:rPr>
+          <w:rFonts w:ascii="Calibri" w:cs="Calibri" w:eastAsia="Calibri" w:hAnsi="Calibri"/>
+          <w:b/>
+          <w:bCs/>
+        </w:rPr>
+        <w:t xml:space="preserve">Recurso de computación</w:t>
+      </w:r>
+      <w:r>
+        <w:rPr>
+          <w:rFonts w:ascii="Calibri" w:cs="Calibri" w:eastAsia="Calibri" w:hAnsi="Calibri"/>
+        </w:rPr>
+        <w:t xml:space="preserve">: marca </w:t>
+      </w:r>
+      <w:r>
+        <w:rPr>
+          <w:rFonts w:ascii="Calibri" w:cs="Calibri" w:eastAsia="Calibri" w:hAnsi="Calibri"/>
+          <w:b/>
+          <w:bCs/>
+        </w:rPr>
+        <w:t xml:space="preserve">No se conecte a un recurso informático EC2</w:t>
+      </w:r>
+      <w:r>
+        <w:rPr>
+          <w:rFonts w:ascii="Calibri" w:cs="Calibri" w:eastAsia="Calibri" w:hAnsi="Calibri"/>
+        </w:rPr>
+        <w:t xml:space="preserve">.</w:t>
+      </w:r>
+    </w:p>
+    <w:p>
+      <w:pPr>
+        <w:pStyle w:val="ListParagraph"/>
+        <w:numPr>
+          <w:ilvl w:val="0"/>
+          <w:numId w:val="19"/>
+        </w:numPr>
+        <w:spacing w:after="70" w:line="276"/>
+      </w:pPr>
+      <w:r>
+        <w:rPr>
+          <w:rFonts w:ascii="Calibri" w:cs="Calibri" w:eastAsia="Calibri" w:hAnsi="Calibri"/>
+          <w:b/>
+          <w:bCs/>
+        </w:rPr>
+        <w:t xml:space="preserve">Nube privada virtual (VPC)</w:t>
+      </w:r>
+      <w:r>
+        <w:rPr>
+          <w:rFonts w:ascii="Calibri" w:cs="Calibri" w:eastAsia="Calibri" w:hAnsi="Calibri"/>
+        </w:rPr>
+        <w:t xml:space="preserve">: deja </w:t>
+      </w:r>
+      <w:r>
+        <w:rPr>
+          <w:rFonts w:ascii="Calibri" w:cs="Calibri" w:eastAsia="Calibri" w:hAnsi="Calibri"/>
+          <w:b/>
+          <w:bCs/>
+        </w:rPr>
+        <w:t xml:space="preserve">Default VPC</w:t>
+      </w:r>
+      <w:r>
+        <w:rPr>
+          <w:rFonts w:ascii="Calibri" w:cs="Calibri" w:eastAsia="Calibri" w:hAnsi="Calibri"/>
+        </w:rPr>
+        <w:t xml:space="preserve">. </w:t>
+      </w:r>
+      <w:r>
+        <w:rPr>
+          <w:rFonts w:ascii="Calibri" w:cs="Calibri" w:eastAsia="Calibri" w:hAnsi="Calibri"/>
+          <w:b/>
+          <w:bCs/>
+        </w:rPr>
+        <w:t xml:space="preserve">Grupo de subredes de la base de datos</w:t>
+      </w:r>
+      <w:r>
+        <w:rPr>
+          <w:rFonts w:ascii="Calibri" w:cs="Calibri" w:eastAsia="Calibri" w:hAnsi="Calibri"/>
+        </w:rPr>
+        <w:t xml:space="preserve">: deja el que viene (</w:t>
+      </w:r>
+      <w:r>
+        <w:rPr>
+          <w:rFonts w:ascii="Consolas" w:cs="Consolas" w:eastAsia="Consolas" w:hAnsi="Consolas"/>
+          <w:color w:val="9F1239"/>
+          <w:sz w:val="20"/>
+          <w:szCs w:val="20"/>
+          <w:shd w:fill="F3F4F6" w:color="auto" w:val="clear"/>
+        </w:rPr>
+        <w:t xml:space="preserve">default-vpc-...</w:t>
+      </w:r>
+      <w:r>
+        <w:rPr>
+          <w:rFonts w:ascii="Calibri" w:cs="Calibri" w:eastAsia="Calibri" w:hAnsi="Calibri"/>
+        </w:rPr>
+        <w:t xml:space="preserve">).</w:t>
+      </w:r>
+    </w:p>
+    <w:p>
+      <w:pPr>
+        <w:pStyle w:val="ListParagraph"/>
+        <w:numPr>
+          <w:ilvl w:val="0"/>
+          <w:numId w:val="19"/>
+        </w:numPr>
+        <w:spacing w:after="70" w:line="276"/>
+      </w:pPr>
+      <w:r>
+        <w:rPr>
+          <w:rFonts w:ascii="Calibri" w:cs="Calibri" w:eastAsia="Calibri" w:hAnsi="Calibri"/>
+          <w:b/>
+          <w:bCs/>
+        </w:rPr>
+        <w:t xml:space="preserve">Acceso público</w:t>
+      </w:r>
+      <w:r>
+        <w:rPr>
+          <w:rFonts w:ascii="Calibri" w:cs="Calibri" w:eastAsia="Calibri" w:hAnsi="Calibri"/>
+        </w:rPr>
+        <w:t xml:space="preserve">: marca </w:t>
+      </w:r>
+      <w:r>
+        <w:rPr>
+          <w:rFonts w:ascii="Calibri" w:cs="Calibri" w:eastAsia="Calibri" w:hAnsi="Calibri"/>
+          <w:b/>
+          <w:bCs/>
+        </w:rPr>
+        <w:t xml:space="preserve">No</w:t>
+      </w:r>
+      <w:r>
+        <w:rPr>
+          <w:rFonts w:ascii="Calibri" w:cs="Calibri" w:eastAsia="Calibri" w:hAnsi="Calibri"/>
+        </w:rPr>
+        <w:t xml:space="preserve">.</w:t>
+      </w:r>
+    </w:p>
+    <w:p>
+      <w:pPr>
+        <w:pStyle w:val="ListParagraph"/>
+        <w:numPr>
+          <w:ilvl w:val="0"/>
+          <w:numId w:val="19"/>
+        </w:numPr>
+        <w:spacing w:after="70" w:line="276"/>
+      </w:pPr>
+      <w:r>
+        <w:rPr>
+          <w:rFonts w:ascii="Calibri" w:cs="Calibri" w:eastAsia="Calibri" w:hAnsi="Calibri"/>
+          <w:b/>
+          <w:bCs/>
+        </w:rPr>
+        <w:t xml:space="preserve">Grupo de seguridad de VPC (firewall)</w:t>
+      </w:r>
+      <w:r>
+        <w:rPr>
+          <w:rFonts w:ascii="Calibri" w:cs="Calibri" w:eastAsia="Calibri" w:hAnsi="Calibri"/>
+        </w:rPr>
+        <w:t xml:space="preserve">: marca </w:t>
+      </w:r>
+      <w:r>
+        <w:rPr>
+          <w:rFonts w:ascii="Calibri" w:cs="Calibri" w:eastAsia="Calibri" w:hAnsi="Calibri"/>
+          <w:b/>
+          <w:bCs/>
+        </w:rPr>
+        <w:t xml:space="preserve">Elegir existente</w:t>
+      </w:r>
+      <w:r>
+        <w:rPr>
+          <w:rFonts w:ascii="Calibri" w:cs="Calibri" w:eastAsia="Calibri" w:hAnsi="Calibri"/>
+        </w:rPr>
+        <w:t xml:space="preserve">. En </w:t>
+      </w:r>
+      <w:r>
+        <w:rPr>
+          <w:rFonts w:ascii="Calibri" w:cs="Calibri" w:eastAsia="Calibri" w:hAnsi="Calibri"/>
+          <w:b/>
+          <w:bCs/>
+        </w:rPr>
+        <w:t xml:space="preserve">Grupos de seguridad de VPC existentes</w:t>
+      </w:r>
+      <w:r>
+        <w:rPr>
+          <w:rFonts w:ascii="Calibri" w:cs="Calibri" w:eastAsia="Calibri" w:hAnsi="Calibri"/>
+        </w:rPr>
+        <w:t xml:space="preserve"> quita </w:t>
+      </w:r>
+      <w:r>
+        <w:rPr>
+          <w:rFonts w:ascii="Consolas" w:cs="Consolas" w:eastAsia="Consolas" w:hAnsi="Consolas"/>
+          <w:color w:val="9F1239"/>
+          <w:sz w:val="20"/>
+          <w:szCs w:val="20"/>
+          <w:shd w:fill="F3F4F6" w:color="auto" w:val="clear"/>
+        </w:rPr>
+        <w:t xml:space="preserve">default</w:t>
+      </w:r>
+      <w:r>
+        <w:rPr>
+          <w:rFonts w:ascii="Calibri" w:cs="Calibri" w:eastAsia="Calibri" w:hAnsi="Calibri"/>
+        </w:rPr>
+        <w:t xml:space="preserve"> (clic en la X) y agrega </w:t>
+      </w:r>
+      <w:r>
+        <w:rPr>
+          <w:rFonts w:ascii="Calibri" w:cs="Calibri" w:eastAsia="Calibri" w:hAnsi="Calibri"/>
+          <w:b/>
+          <w:bCs/>
+        </w:rPr>
+        <w:t xml:space="preserve">`rds-postgres-sg`</w:t>
+      </w:r>
+      <w:r>
+        <w:rPr>
+          <w:rFonts w:ascii="Calibri" w:cs="Calibri" w:eastAsia="Calibri" w:hAnsi="Calibri"/>
+        </w:rPr>
+        <w:t xml:space="preserve">.</w:t>
+      </w:r>
+    </w:p>
+    <w:p>
+      <w:pPr>
+        <w:pStyle w:val="ListParagraph"/>
+        <w:numPr>
+          <w:ilvl w:val="0"/>
+          <w:numId w:val="19"/>
+        </w:numPr>
+        <w:spacing w:after="70" w:line="276"/>
+      </w:pPr>
+      <w:r>
+        <w:rPr>
+          <w:rFonts w:ascii="Calibri" w:cs="Calibri" w:eastAsia="Calibri" w:hAnsi="Calibri"/>
+          <w:b/>
+          <w:bCs/>
+        </w:rPr>
+        <w:t xml:space="preserve">Proxy de RDS</w:t>
+      </w:r>
+      <w:r>
+        <w:rPr>
+          <w:rFonts w:ascii="Calibri" w:cs="Calibri" w:eastAsia="Calibri" w:hAnsi="Calibri"/>
+        </w:rPr>
+        <w:t xml:space="preserve">: déjalo </w:t>
+      </w:r>
+      <w:r>
+        <w:rPr>
+          <w:rFonts w:ascii="Calibri" w:cs="Calibri" w:eastAsia="Calibri" w:hAnsi="Calibri"/>
+          <w:b/>
+          <w:bCs/>
+        </w:rPr>
+        <w:t xml:space="preserve">sin marcar</w:t>
+      </w:r>
+      <w:r>
+        <w:rPr>
+          <w:rFonts w:ascii="Calibri" w:cs="Calibri" w:eastAsia="Calibri" w:hAnsi="Calibri"/>
+        </w:rPr>
+        <w:t xml:space="preserve"> (tiene costo adicional). </w:t>
+      </w:r>
+      <w:r>
+        <w:rPr>
+          <w:rFonts w:ascii="Calibri" w:cs="Calibri" w:eastAsia="Calibri" w:hAnsi="Calibri"/>
+          <w:b/>
+          <w:bCs/>
+        </w:rPr>
+        <w:t xml:space="preserve">Entidad de certificación</w:t>
+      </w:r>
+      <w:r>
+        <w:rPr>
+          <w:rFonts w:ascii="Calibri" w:cs="Calibri" w:eastAsia="Calibri" w:hAnsi="Calibri"/>
+        </w:rPr>
+        <w:t xml:space="preserve">: deja el valor predeterminado.</w:t>
+      </w:r>
+    </w:p>
+    <w:p>
+      <w:pPr>
+        <w:pStyle w:val="ListParagraph"/>
+        <w:numPr>
+          <w:ilvl w:val="0"/>
+          <w:numId w:val="19"/>
+        </w:numPr>
+        <w:spacing w:after="70" w:line="276"/>
+      </w:pPr>
+      <w:r>
+        <w:rPr>
+          <w:rFonts w:ascii="Calibri" w:cs="Calibri" w:eastAsia="Calibri" w:hAnsi="Calibri"/>
+          <w:b/>
+          <w:bCs/>
+        </w:rPr>
+        <w:t xml:space="preserve">Supervisión</w:t>
+      </w:r>
+      <w:r>
+        <w:rPr>
+          <w:rFonts w:ascii="Calibri" w:cs="Calibri" w:eastAsia="Calibri" w:hAnsi="Calibri"/>
+        </w:rPr>
+        <w:t xml:space="preserve">: elige </w:t>
+      </w:r>
+      <w:r>
+        <w:rPr>
+          <w:rFonts w:ascii="Calibri" w:cs="Calibri" w:eastAsia="Calibri" w:hAnsi="Calibri"/>
+          <w:b/>
+          <w:bCs/>
+        </w:rPr>
+        <w:t xml:space="preserve">Database Insights: estándar</w:t>
+      </w:r>
+      <w:r>
+        <w:rPr>
+          <w:rFonts w:ascii="Calibri" w:cs="Calibri" w:eastAsia="Calibri" w:hAnsi="Calibri"/>
+        </w:rPr>
+        <w:t xml:space="preserve"> (no </w:t>
+      </w:r>
+      <w:r>
+        <w:rPr>
+          <w:rFonts w:ascii="Calibri" w:cs="Calibri" w:eastAsia="Calibri" w:hAnsi="Calibri"/>
+          <w:i/>
+          <w:iCs/>
+        </w:rPr>
+        <w:t xml:space="preserve">avanzado</w:t>
+      </w:r>
+      <w:r>
+        <w:rPr>
+          <w:rFonts w:ascii="Calibri" w:cs="Calibri" w:eastAsia="Calibri" w:hAnsi="Calibri"/>
+        </w:rPr>
+        <w:t xml:space="preserve">). Más abajo, en </w:t>
+      </w:r>
+      <w:r>
+        <w:rPr>
+          <w:rFonts w:ascii="Calibri" w:cs="Calibri" w:eastAsia="Calibri" w:hAnsi="Calibri"/>
+          <w:i/>
+          <w:iCs/>
+        </w:rPr>
+        <w:t xml:space="preserve">Ajustes de monitorización adicional</w:t>
+      </w:r>
+      <w:r>
+        <w:rPr>
+          <w:rFonts w:ascii="Calibri" w:cs="Calibri" w:eastAsia="Calibri" w:hAnsi="Calibri"/>
+        </w:rPr>
+        <w:t xml:space="preserve">, deja </w:t>
+      </w:r>
+      <w:r>
+        <w:rPr>
+          <w:rFonts w:ascii="Calibri" w:cs="Calibri" w:eastAsia="Calibri" w:hAnsi="Calibri"/>
+          <w:b/>
+          <w:bCs/>
+        </w:rPr>
+        <w:t xml:space="preserve">sin marcar</w:t>
+      </w:r>
+      <w:r>
+        <w:rPr>
+          <w:rFonts w:ascii="Calibri" w:cs="Calibri" w:eastAsia="Calibri" w:hAnsi="Calibri"/>
+        </w:rPr>
+        <w:t xml:space="preserve"> </w:t>
+      </w:r>
+      <w:r>
+        <w:rPr>
+          <w:rFonts w:ascii="Calibri" w:cs="Calibri" w:eastAsia="Calibri" w:hAnsi="Calibri"/>
+          <w:i/>
+          <w:iCs/>
+        </w:rPr>
+        <w:t xml:space="preserve">Monitorización mejorada</w:t>
+      </w:r>
+      <w:r>
+        <w:rPr>
+          <w:rFonts w:ascii="Calibri" w:cs="Calibri" w:eastAsia="Calibri" w:hAnsi="Calibri"/>
+        </w:rPr>
+        <w:t xml:space="preserve">, </w:t>
+      </w:r>
+      <w:r>
+        <w:rPr>
+          <w:rFonts w:ascii="Calibri" w:cs="Calibri" w:eastAsia="Calibri" w:hAnsi="Calibri"/>
+          <w:i/>
+          <w:iCs/>
+        </w:rPr>
+        <w:t xml:space="preserve">Exportaciones de registros</w:t>
+      </w:r>
+      <w:r>
+        <w:rPr>
+          <w:rFonts w:ascii="Calibri" w:cs="Calibri" w:eastAsia="Calibri" w:hAnsi="Calibri"/>
+        </w:rPr>
+        <w:t xml:space="preserve"> y </w:t>
+      </w:r>
+      <w:r>
+        <w:rPr>
+          <w:rFonts w:ascii="Calibri" w:cs="Calibri" w:eastAsia="Calibri" w:hAnsi="Calibri"/>
+          <w:i/>
+          <w:iCs/>
+        </w:rPr>
+        <w:t xml:space="preserve">Activar DevOps Guru</w:t>
+      </w:r>
+      <w:r>
+        <w:rPr>
+          <w:rFonts w:ascii="Calibri" w:cs="Calibri" w:eastAsia="Calibri" w:hAnsi="Calibri"/>
+        </w:rPr>
+        <w:t xml:space="preserve">.</w:t>
+      </w:r>
+    </w:p>
+    <w:p>
+      <w:pPr>
+        <w:pStyle w:val="ListParagraph"/>
+        <w:numPr>
+          <w:ilvl w:val="0"/>
+          <w:numId w:val="19"/>
+        </w:numPr>
+        <w:spacing w:after="70" w:line="276"/>
+      </w:pPr>
+      <w:r>
+        <w:rPr>
+          <w:rFonts w:ascii="Calibri" w:cs="Calibri" w:eastAsia="Calibri" w:hAnsi="Calibri"/>
+        </w:rPr>
+        <w:t xml:space="preserve">Abre </w:t>
+      </w:r>
+      <w:r>
+        <w:rPr>
+          <w:rFonts w:ascii="Calibri" w:cs="Calibri" w:eastAsia="Calibri" w:hAnsi="Calibri"/>
+          <w:b/>
+          <w:bCs/>
+        </w:rPr>
+        <w:t xml:space="preserve">Configuración adicional</w:t>
+      </w:r>
+      <w:r>
+        <w:rPr>
+          <w:rFonts w:ascii="Calibri" w:cs="Calibri" w:eastAsia="Calibri" w:hAnsi="Calibri"/>
+        </w:rPr>
+        <w:t xml:space="preserve"> (la sección plegada al final de la página) y llena:</w:t>
+      </w:r>
+    </w:p>
+    <w:p>
+      <w:pPr>
+        <w:pStyle w:val="ListParagraph"/>
+        <w:numPr>
+          <w:ilvl w:val="0"/>
+          <w:numId w:val="2"/>
+        </w:numPr>
+        <w:spacing w:after="70" w:line="276"/>
+      </w:pPr>
+      <w:r>
+        <w:rPr>
+          <w:rFonts w:ascii="Calibri" w:cs="Calibri" w:eastAsia="Calibri" w:hAnsi="Calibri"/>
+          <w:b/>
+          <w:bCs/>
+        </w:rPr>
+        <w:t xml:space="preserve">Nombre de la base de datos inicial</w:t>
+      </w:r>
+      <w:r>
+        <w:rPr>
+          <w:rFonts w:ascii="Calibri" w:cs="Calibri" w:eastAsia="Calibri" w:hAnsi="Calibri"/>
+        </w:rPr>
+        <w:t xml:space="preserve">: escribe exactamente </w:t>
+      </w:r>
+      <w:r>
+        <w:rPr>
+          <w:rFonts w:ascii="Consolas" w:cs="Consolas" w:eastAsia="Consolas" w:hAnsi="Consolas"/>
+          <w:color w:val="9F1239"/>
+          <w:sz w:val="20"/>
+          <w:szCs w:val="20"/>
+          <w:shd w:fill="F3F4F6" w:color="auto" w:val="clear"/>
+        </w:rPr>
+        <w:t xml:space="preserve">tubeyou_db</w:t>
+      </w:r>
+      <w:r>
+        <w:rPr>
+          <w:rFonts w:ascii="Calibri" w:cs="Calibri" w:eastAsia="Calibri" w:hAnsi="Calibri"/>
+        </w:rPr>
+        <w:t xml:space="preserve">.</w:t>
+      </w:r>
+    </w:p>
+    <w:p>
+      <w:pPr>
+        <w:pStyle w:val="ListParagraph"/>
+        <w:numPr>
+          <w:ilvl w:val="0"/>
+          <w:numId w:val="2"/>
+        </w:numPr>
+        <w:spacing w:after="70" w:line="276"/>
+      </w:pPr>
+      <w:r>
+        <w:rPr>
+          <w:rFonts w:ascii="Calibri" w:cs="Calibri" w:eastAsia="Calibri" w:hAnsi="Calibri"/>
+          <w:b/>
+          <w:bCs/>
+        </w:rPr>
+        <w:t xml:space="preserve">Protección contra eliminación</w:t>
+      </w:r>
+      <w:r>
+        <w:rPr>
+          <w:rFonts w:ascii="Calibri" w:cs="Calibri" w:eastAsia="Calibri" w:hAnsi="Calibri"/>
+        </w:rPr>
+        <w:t xml:space="preserve">: </w:t>
+      </w:r>
+      <w:r>
+        <w:rPr>
+          <w:rFonts w:ascii="Calibri" w:cs="Calibri" w:eastAsia="Calibri" w:hAnsi="Calibri"/>
+          <w:b/>
+          <w:bCs/>
+        </w:rPr>
+        <w:t xml:space="preserve">desmarca</w:t>
+      </w:r>
+      <w:r>
+        <w:rPr>
+          <w:rFonts w:ascii="Calibri" w:cs="Calibri" w:eastAsia="Calibri" w:hAnsi="Calibri"/>
+        </w:rPr>
+        <w:t xml:space="preserve"> </w:t>
+      </w:r>
+      <w:r>
+        <w:rPr>
+          <w:rFonts w:ascii="Calibri" w:cs="Calibri" w:eastAsia="Calibri" w:hAnsi="Calibri"/>
+          <w:i/>
+          <w:iCs/>
+        </w:rPr>
+        <w:t xml:space="preserve">Activar la protección contra eliminación</w:t>
+      </w:r>
+      <w:r>
+        <w:rPr>
+          <w:rFonts w:ascii="Calibri" w:cs="Calibri" w:eastAsia="Calibri" w:hAnsi="Calibri"/>
+        </w:rPr>
+        <w:t xml:space="preserve"> (si no, no podrás borrar la base al terminar y el Bloque 0 fallará).</w:t>
+      </w:r>
+    </w:p>
+    <w:p>
+      <w:pPr>
+        <w:pStyle w:val="ListParagraph"/>
+        <w:numPr>
+          <w:ilvl w:val="0"/>
+          <w:numId w:val="2"/>
+        </w:numPr>
+        <w:spacing w:after="70" w:line="276"/>
+      </w:pPr>
+      <w:r>
+        <w:rPr>
+          <w:rFonts w:ascii="Calibri" w:cs="Calibri" w:eastAsia="Calibri" w:hAnsi="Calibri"/>
+        </w:rPr>
+        <w:t xml:space="preserve">Copias de seguridad: puedes dejarlas como vienen.</w:t>
+      </w:r>
+    </w:p>
+    <w:p>
+      <w:pPr>
+        <w:pStyle w:val="ListParagraph"/>
+        <w:numPr>
+          <w:ilvl w:val="0"/>
+          <w:numId w:val="19"/>
+        </w:numPr>
+        <w:spacing w:after="70" w:line="276"/>
+      </w:pPr>
+      <w:r>
+        <w:rPr>
+          <w:rFonts w:ascii="Calibri" w:cs="Calibri" w:eastAsia="Calibri" w:hAnsi="Calibri"/>
+        </w:rPr>
+        <w:t xml:space="preserve">Baja hasta </w:t>
+      </w:r>
+      <w:r>
+        <w:rPr>
+          <w:rFonts w:ascii="Calibri" w:cs="Calibri" w:eastAsia="Calibri" w:hAnsi="Calibri"/>
+          <w:b/>
+          <w:bCs/>
+        </w:rPr>
+        <w:t xml:space="preserve">Costos mensuales estimados</w:t>
+      </w:r>
+      <w:r>
+        <w:rPr>
+          <w:rFonts w:ascii="Calibri" w:cs="Calibri" w:eastAsia="Calibri" w:hAnsi="Calibri"/>
+        </w:rPr>
+        <w:t xml:space="preserve"> y comprueba el </w:t>
+      </w:r>
+      <w:r>
+        <w:rPr>
+          <w:rFonts w:ascii="Calibri" w:cs="Calibri" w:eastAsia="Calibri" w:hAnsi="Calibri"/>
+          <w:b/>
+          <w:bCs/>
+        </w:rPr>
+        <w:t xml:space="preserve">Total</w:t>
+      </w:r>
+      <w:r>
+        <w:rPr>
+          <w:rFonts w:ascii="Calibri" w:cs="Calibri" w:eastAsia="Calibri" w:hAnsi="Calibri"/>
+        </w:rPr>
+        <w:t xml:space="preserve"> (unos 15 USD o menos).</w:t>
+      </w:r>
+    </w:p>
+    <w:p>
+      <w:pPr>
+        <w:pStyle w:val="ListParagraph"/>
+        <w:numPr>
+          <w:ilvl w:val="0"/>
+          <w:numId w:val="19"/>
+        </w:numPr>
+        <w:spacing w:after="70" w:line="276"/>
+      </w:pPr>
+      <w:r>
+        <w:rPr>
+          <w:rFonts w:ascii="Calibri" w:cs="Calibri" w:eastAsia="Calibri" w:hAnsi="Calibri"/>
+        </w:rPr>
+        <w:t xml:space="preserve">Presiona el botón naranja </w:t>
+      </w:r>
+      <w:r>
+        <w:rPr>
+          <w:rFonts w:ascii="Calibri" w:cs="Calibri" w:eastAsia="Calibri" w:hAnsi="Calibri"/>
+          <w:b/>
+          <w:bCs/>
+        </w:rPr>
+        <w:t xml:space="preserve">Crear base de datos</w:t>
+      </w:r>
+      <w:r>
+        <w:rPr>
+          <w:rFonts w:ascii="Calibri" w:cs="Calibri" w:eastAsia="Calibri" w:hAnsi="Calibri"/>
+        </w:rPr>
+        <w:t xml:space="preserve">.</w:t>
+      </w:r>
+    </w:p>
+    <w:tbl>
+      <w:tblPr>
+        <w:tblW w:type="dxa" w:w="9360"/>
+        <w:tblBorders>
+          <w:top w:val="single" w:color="auto" w:sz="4"/>
+          <w:left w:val="single" w:color="auto" w:sz="4"/>
+          <w:bottom w:val="single" w:color="auto" w:sz="4"/>
+          <w:right w:val="single" w:color="auto" w:sz="4"/>
+          <w:insideH w:val="single" w:color="auto" w:sz="4"/>
+          <w:insideV w:val="single" w:color="auto" w:sz="4"/>
+        </w:tblBorders>
+      </w:tblPr>
+      <w:tblGrid>
+        <w:gridCol w:w="9360"/>
+      </w:tblGrid>
+      <w:tr>
+        <w:trPr>
+          <w:cantSplit/>
+        </w:trPr>
+        <w:tc>
+          <w:tcPr>
+            <w:tcW w:type="dxa" w:w="9360"/>
+            <w:tcBorders>
+              <w:top w:val="single" w:color="FEF2F2" w:sz="4"/>
+              <w:left w:val="single" w:color="DC2626" w:sz="24"/>
+              <w:bottom w:val="single" w:color="FEF2F2" w:sz="4"/>
+              <w:right w:val="single" w:color="FEF2F2" w:sz="4"/>
+            </w:tcBorders>
+            <w:shd w:fill="FEF2F2" w:color="auto" w:val="clear"/>
+            <w:tcMar>
+              <w:top w:type="dxa" w:w="100"/>
+              <w:left w:type="dxa" w:w="160"/>
+              <w:bottom w:type="dxa" w:w="100"/>
+              <w:right w:type="dxa" w:w="140"/>
+            </w:tcMar>
+          </w:tcPr>
+          <w:p>
+            <w:pPr>
+              <w:spacing w:after="60"/>
+            </w:pPr>
+            <w:r>
+              <w:rPr>
+                <w:rFonts w:ascii="Calibri" w:cs="Calibri" w:eastAsia="Calibri" w:hAnsi="Calibri"/>
+                <w:b/>
+                <w:bCs/>
+                <w:color w:val="DC2626"/>
+                <w:sz w:val="21"/>
+                <w:szCs w:val="21"/>
+              </w:rPr>
+              <w:t xml:space="preserve">ERROR: No olvides el nombre de la base de datos inicial</w:t>
             </w:r>
           </w:p>
           <w:p>

</xml_diff>

<commit_message>
Manual: paso de RDS simplificado con la plantilla Entorno de pruebas
</commit_message>
<xml_diff>
--- a/docs/Manual_Despliegue_AWS_TubeYou.docx
+++ b/docs/Manual_Despliegue_AWS_TubeYou.docx
@@ -12370,7 +12370,892 @@
           <w:sz w:val="28"/>
           <w:szCs w:val="28"/>
         </w:rPr>
-        <w:t xml:space="preserve">Paso 3 · Crear la base de datos (versión actual de la consola)</w:t>
+        <w:t xml:space="preserve">Paso 3 · Crear la base de datos</w:t>
+      </w:r>
+    </w:p>
+    <w:p>
+      <w:pPr>
+        <w:spacing w:after="120" w:line="276"/>
+      </w:pPr>
+      <w:r>
+        <w:rPr>
+          <w:rFonts w:ascii="Calibri" w:cs="Calibri" w:eastAsia="Calibri" w:hAnsi="Calibri"/>
+        </w:rPr>
+        <w:t xml:space="preserve">La clave es elegir la plantilla </w:t>
+      </w:r>
+      <w:r>
+        <w:rPr>
+          <w:rFonts w:ascii="Calibri" w:cs="Calibri" w:eastAsia="Calibri" w:hAnsi="Calibri"/>
+          <w:b/>
+          <w:bCs/>
+        </w:rPr>
+        <w:t xml:space="preserve">Entorno de pruebas</w:t>
+      </w:r>
+      <w:r>
+        <w:rPr>
+          <w:rFonts w:ascii="Calibri" w:cs="Calibri" w:eastAsia="Calibri" w:hAnsi="Calibri"/>
+        </w:rPr>
+        <w:t xml:space="preserve">: con ella AWS ya deja una sola instancia, clases pequeñas y disco económico. </w:t>
+      </w:r>
+      <w:r>
+        <w:rPr>
+          <w:rFonts w:ascii="Calibri" w:cs="Calibri" w:eastAsia="Calibri" w:hAnsi="Calibri"/>
+          <w:b/>
+          <w:bCs/>
+        </w:rPr>
+        <w:t xml:space="preserve">Todo lo que no se mencione aquí se queda como viene.</w:t>
+      </w:r>
+    </w:p>
+    <w:p>
+      <w:pPr>
+        <w:pStyle w:val="ListParagraph"/>
+        <w:numPr>
+          <w:ilvl w:val="0"/>
+          <w:numId w:val="19"/>
+        </w:numPr>
+        <w:spacing w:after="70" w:line="276"/>
+      </w:pPr>
+      <w:r>
+        <w:rPr>
+          <w:rFonts w:ascii="Calibri" w:cs="Calibri" w:eastAsia="Calibri" w:hAnsi="Calibri"/>
+        </w:rPr>
+        <w:t xml:space="preserve">Busca </w:t>
+      </w:r>
+      <w:r>
+        <w:rPr>
+          <w:rFonts w:ascii="Consolas" w:cs="Consolas" w:eastAsia="Consolas" w:hAnsi="Consolas"/>
+          <w:color w:val="9F1239"/>
+          <w:sz w:val="20"/>
+          <w:szCs w:val="20"/>
+          <w:shd w:fill="F3F4F6" w:color="auto" w:val="clear"/>
+        </w:rPr>
+        <w:t xml:space="preserve">RDS</w:t>
+      </w:r>
+      <w:r>
+        <w:rPr>
+          <w:rFonts w:ascii="Calibri" w:cs="Calibri" w:eastAsia="Calibri" w:hAnsi="Calibri"/>
+        </w:rPr>
+        <w:t xml:space="preserve"> y entra. Menú izquierdo ➔ </w:t>
+      </w:r>
+      <w:r>
+        <w:rPr>
+          <w:rFonts w:ascii="Calibri" w:cs="Calibri" w:eastAsia="Calibri" w:hAnsi="Calibri"/>
+          <w:b/>
+          <w:bCs/>
+        </w:rPr>
+        <w:t xml:space="preserve">Bases de datos</w:t>
+      </w:r>
+      <w:r>
+        <w:rPr>
+          <w:rFonts w:ascii="Calibri" w:cs="Calibri" w:eastAsia="Calibri" w:hAnsi="Calibri"/>
+        </w:rPr>
+        <w:t xml:space="preserve"> ➔ botón naranja </w:t>
+      </w:r>
+      <w:r>
+        <w:rPr>
+          <w:rFonts w:ascii="Calibri" w:cs="Calibri" w:eastAsia="Calibri" w:hAnsi="Calibri"/>
+          <w:b/>
+          <w:bCs/>
+        </w:rPr>
+        <w:t xml:space="preserve">Crear base de datos</w:t>
+      </w:r>
+      <w:r>
+        <w:rPr>
+          <w:rFonts w:ascii="Calibri" w:cs="Calibri" w:eastAsia="Calibri" w:hAnsi="Calibri"/>
+        </w:rPr>
+        <w:t xml:space="preserve">.</w:t>
+      </w:r>
+    </w:p>
+    <w:p>
+      <w:pPr>
+        <w:pStyle w:val="ListParagraph"/>
+        <w:numPr>
+          <w:ilvl w:val="0"/>
+          <w:numId w:val="19"/>
+        </w:numPr>
+        <w:spacing w:after="70" w:line="276"/>
+      </w:pPr>
+      <w:r>
+        <w:rPr>
+          <w:rFonts w:ascii="Calibri" w:cs="Calibri" w:eastAsia="Calibri" w:hAnsi="Calibri"/>
+          <w:b/>
+          <w:bCs/>
+        </w:rPr>
+        <w:t xml:space="preserve">Elegir un método de creación de base de datos</w:t>
+      </w:r>
+      <w:r>
+        <w:rPr>
+          <w:rFonts w:ascii="Calibri" w:cs="Calibri" w:eastAsia="Calibri" w:hAnsi="Calibri"/>
+        </w:rPr>
+        <w:t xml:space="preserve">: marca </w:t>
+      </w:r>
+      <w:r>
+        <w:rPr>
+          <w:rFonts w:ascii="Calibri" w:cs="Calibri" w:eastAsia="Calibri" w:hAnsi="Calibri"/>
+          <w:b/>
+          <w:bCs/>
+        </w:rPr>
+        <w:t xml:space="preserve">Configuración completa</w:t>
+      </w:r>
+      <w:r>
+        <w:rPr>
+          <w:rFonts w:ascii="Calibri" w:cs="Calibri" w:eastAsia="Calibri" w:hAnsi="Calibri"/>
+        </w:rPr>
+        <w:t xml:space="preserve">.</w:t>
+      </w:r>
+    </w:p>
+    <w:p>
+      <w:pPr>
+        <w:pStyle w:val="ListParagraph"/>
+        <w:numPr>
+          <w:ilvl w:val="0"/>
+          <w:numId w:val="19"/>
+        </w:numPr>
+        <w:spacing w:after="70" w:line="276"/>
+      </w:pPr>
+      <w:r>
+        <w:rPr>
+          <w:rFonts w:ascii="Calibri" w:cs="Calibri" w:eastAsia="Calibri" w:hAnsi="Calibri"/>
+          <w:b/>
+          <w:bCs/>
+        </w:rPr>
+        <w:t xml:space="preserve">Opciones del motor</w:t>
+      </w:r>
+      <w:r>
+        <w:rPr>
+          <w:rFonts w:ascii="Calibri" w:cs="Calibri" w:eastAsia="Calibri" w:hAnsi="Calibri"/>
+        </w:rPr>
+        <w:t xml:space="preserve"> ➔ </w:t>
+      </w:r>
+      <w:r>
+        <w:rPr>
+          <w:rFonts w:ascii="Calibri" w:cs="Calibri" w:eastAsia="Calibri" w:hAnsi="Calibri"/>
+          <w:b/>
+          <w:bCs/>
+        </w:rPr>
+        <w:t xml:space="preserve">Tipo de motor</w:t>
+      </w:r>
+      <w:r>
+        <w:rPr>
+          <w:rFonts w:ascii="Calibri" w:cs="Calibri" w:eastAsia="Calibri" w:hAnsi="Calibri"/>
+        </w:rPr>
+        <w:t xml:space="preserve">: haz clic en </w:t>
+      </w:r>
+      <w:r>
+        <w:rPr>
+          <w:rFonts w:ascii="Calibri" w:cs="Calibri" w:eastAsia="Calibri" w:hAnsi="Calibri"/>
+          <w:b/>
+          <w:bCs/>
+        </w:rPr>
+        <w:t xml:space="preserve">PostgreSQL</w:t>
+      </w:r>
+      <w:r>
+        <w:rPr>
+          <w:rFonts w:ascii="Calibri" w:cs="Calibri" w:eastAsia="Calibri" w:hAnsi="Calibri"/>
+        </w:rPr>
+        <w:t xml:space="preserve">.</w:t>
+      </w:r>
+    </w:p>
+    <w:p>
+      <w:pPr>
+        <w:pStyle w:val="ListParagraph"/>
+        <w:numPr>
+          <w:ilvl w:val="0"/>
+          <w:numId w:val="19"/>
+        </w:numPr>
+        <w:spacing w:after="70" w:line="276"/>
+      </w:pPr>
+      <w:r>
+        <w:rPr>
+          <w:rFonts w:ascii="Calibri" w:cs="Calibri" w:eastAsia="Calibri" w:hAnsi="Calibri"/>
+          <w:b/>
+          <w:bCs/>
+        </w:rPr>
+        <w:t xml:space="preserve">Plantillas</w:t>
+      </w:r>
+      <w:r>
+        <w:rPr>
+          <w:rFonts w:ascii="Calibri" w:cs="Calibri" w:eastAsia="Calibri" w:hAnsi="Calibri"/>
+        </w:rPr>
+        <w:t xml:space="preserve">: marca </w:t>
+      </w:r>
+      <w:r>
+        <w:rPr>
+          <w:rFonts w:ascii="Calibri" w:cs="Calibri" w:eastAsia="Calibri" w:hAnsi="Calibri"/>
+          <w:b/>
+          <w:bCs/>
+        </w:rPr>
+        <w:t xml:space="preserve">Entorno de pruebas</w:t>
+      </w:r>
+      <w:r>
+        <w:rPr>
+          <w:rFonts w:ascii="Calibri" w:cs="Calibri" w:eastAsia="Calibri" w:hAnsi="Calibri"/>
+        </w:rPr>
+        <w:t xml:space="preserve">. (No elijas </w:t>
+      </w:r>
+      <w:r>
+        <w:rPr>
+          <w:rFonts w:ascii="Calibri" w:cs="Calibri" w:eastAsia="Calibri" w:hAnsi="Calibri"/>
+          <w:i/>
+          <w:iCs/>
+        </w:rPr>
+        <w:t xml:space="preserve">Producción</w:t>
+      </w:r>
+      <w:r>
+        <w:rPr>
+          <w:rFonts w:ascii="Calibri" w:cs="Calibri" w:eastAsia="Calibri" w:hAnsi="Calibri"/>
+        </w:rPr>
+        <w:t xml:space="preserve"> ni </w:t>
+      </w:r>
+      <w:r>
+        <w:rPr>
+          <w:rFonts w:ascii="Calibri" w:cs="Calibri" w:eastAsia="Calibri" w:hAnsi="Calibri"/>
+          <w:i/>
+          <w:iCs/>
+        </w:rPr>
+        <w:t xml:space="preserve">Desarrollo y pruebas</w:t>
+      </w:r>
+      <w:r>
+        <w:rPr>
+          <w:rFonts w:ascii="Calibri" w:cs="Calibri" w:eastAsia="Calibri" w:hAnsi="Calibri"/>
+        </w:rPr>
+        <w:t xml:space="preserve">.)</w:t>
+      </w:r>
+    </w:p>
+    <w:p>
+      <w:pPr>
+        <w:pStyle w:val="ListParagraph"/>
+        <w:numPr>
+          <w:ilvl w:val="0"/>
+          <w:numId w:val="19"/>
+        </w:numPr>
+        <w:spacing w:after="70" w:line="276"/>
+      </w:pPr>
+      <w:r>
+        <w:rPr>
+          <w:rFonts w:ascii="Calibri" w:cs="Calibri" w:eastAsia="Calibri" w:hAnsi="Calibri"/>
+          <w:b/>
+          <w:bCs/>
+        </w:rPr>
+        <w:t xml:space="preserve">Identificador de instancia de base de datos</w:t>
+      </w:r>
+      <w:r>
+        <w:rPr>
+          <w:rFonts w:ascii="Calibri" w:cs="Calibri" w:eastAsia="Calibri" w:hAnsi="Calibri"/>
+        </w:rPr>
+        <w:t xml:space="preserve">: escribe </w:t>
+      </w:r>
+      <w:r>
+        <w:rPr>
+          <w:rFonts w:ascii="Consolas" w:cs="Consolas" w:eastAsia="Consolas" w:hAnsi="Consolas"/>
+          <w:color w:val="9F1239"/>
+          <w:sz w:val="20"/>
+          <w:szCs w:val="20"/>
+          <w:shd w:fill="F3F4F6" w:color="auto" w:val="clear"/>
+        </w:rPr>
+        <w:t xml:space="preserve">tubeyou-rds</w:t>
+      </w:r>
+      <w:r>
+        <w:rPr>
+          <w:rFonts w:ascii="Calibri" w:cs="Calibri" w:eastAsia="Calibri" w:hAnsi="Calibri"/>
+        </w:rPr>
+        <w:t xml:space="preserve">.</w:t>
+      </w:r>
+    </w:p>
+    <w:p>
+      <w:pPr>
+        <w:pStyle w:val="ListParagraph"/>
+        <w:numPr>
+          <w:ilvl w:val="0"/>
+          <w:numId w:val="19"/>
+        </w:numPr>
+        <w:spacing w:after="70" w:line="276"/>
+      </w:pPr>
+      <w:r>
+        <w:rPr>
+          <w:rFonts w:ascii="Calibri" w:cs="Calibri" w:eastAsia="Calibri" w:hAnsi="Calibri"/>
+          <w:b/>
+          <w:bCs/>
+        </w:rPr>
+        <w:t xml:space="preserve">Nombre de usuario maestro</w:t>
+      </w:r>
+      <w:r>
+        <w:rPr>
+          <w:rFonts w:ascii="Calibri" w:cs="Calibri" w:eastAsia="Calibri" w:hAnsi="Calibri"/>
+        </w:rPr>
+        <w:t xml:space="preserve">: escribe </w:t>
+      </w:r>
+      <w:r>
+        <w:rPr>
+          <w:rFonts w:ascii="Consolas" w:cs="Consolas" w:eastAsia="Consolas" w:hAnsi="Consolas"/>
+          <w:color w:val="9F1239"/>
+          <w:sz w:val="20"/>
+          <w:szCs w:val="20"/>
+          <w:shd w:fill="F3F4F6" w:color="auto" w:val="clear"/>
+        </w:rPr>
+        <w:t xml:space="preserve">postgres</w:t>
+      </w:r>
+      <w:r>
+        <w:rPr>
+          <w:rFonts w:ascii="Calibri" w:cs="Calibri" w:eastAsia="Calibri" w:hAnsi="Calibri"/>
+        </w:rPr>
+        <w:t xml:space="preserve">.</w:t>
+      </w:r>
+    </w:p>
+    <w:p>
+      <w:pPr>
+        <w:pStyle w:val="ListParagraph"/>
+        <w:numPr>
+          <w:ilvl w:val="0"/>
+          <w:numId w:val="19"/>
+        </w:numPr>
+        <w:spacing w:after="70" w:line="276"/>
+      </w:pPr>
+      <w:r>
+        <w:rPr>
+          <w:rFonts w:ascii="Calibri" w:cs="Calibri" w:eastAsia="Calibri" w:hAnsi="Calibri"/>
+          <w:b/>
+          <w:bCs/>
+        </w:rPr>
+        <w:t xml:space="preserve">Administración de credenciales</w:t>
+      </w:r>
+      <w:r>
+        <w:rPr>
+          <w:rFonts w:ascii="Calibri" w:cs="Calibri" w:eastAsia="Calibri" w:hAnsi="Calibri"/>
+        </w:rPr>
+        <w:t xml:space="preserve">: marca </w:t>
+      </w:r>
+      <w:r>
+        <w:rPr>
+          <w:rFonts w:ascii="Calibri" w:cs="Calibri" w:eastAsia="Calibri" w:hAnsi="Calibri"/>
+          <w:b/>
+          <w:bCs/>
+        </w:rPr>
+        <w:t xml:space="preserve">Autoadministrado</w:t>
+      </w:r>
+      <w:r>
+        <w:rPr>
+          <w:rFonts w:ascii="Calibri" w:cs="Calibri" w:eastAsia="Calibri" w:hAnsi="Calibri"/>
+        </w:rPr>
+        <w:t xml:space="preserve">. En </w:t>
+      </w:r>
+      <w:r>
+        <w:rPr>
+          <w:rFonts w:ascii="Calibri" w:cs="Calibri" w:eastAsia="Calibri" w:hAnsi="Calibri"/>
+          <w:b/>
+          <w:bCs/>
+        </w:rPr>
+        <w:t xml:space="preserve">Contraseña maestra</w:t>
+      </w:r>
+      <w:r>
+        <w:rPr>
+          <w:rFonts w:ascii="Calibri" w:cs="Calibri" w:eastAsia="Calibri" w:hAnsi="Calibri"/>
+        </w:rPr>
+        <w:t xml:space="preserve"> escribe una clave (ejemplo </w:t>
+      </w:r>
+      <w:r>
+        <w:rPr>
+          <w:rFonts w:ascii="Consolas" w:cs="Consolas" w:eastAsia="Consolas" w:hAnsi="Consolas"/>
+          <w:color w:val="9F1239"/>
+          <w:sz w:val="20"/>
+          <w:szCs w:val="20"/>
+          <w:shd w:fill="F3F4F6" w:color="auto" w:val="clear"/>
+        </w:rPr>
+        <w:t xml:space="preserve">TuClaveSegura2026</w:t>
+      </w:r>
+      <w:r>
+        <w:rPr>
+          <w:rFonts w:ascii="Calibri" w:cs="Calibri" w:eastAsia="Calibri" w:hAnsi="Calibri"/>
+        </w:rPr>
+        <w:t xml:space="preserve">, solo letras y números) y repítela en </w:t>
+      </w:r>
+      <w:r>
+        <w:rPr>
+          <w:rFonts w:ascii="Calibri" w:cs="Calibri" w:eastAsia="Calibri" w:hAnsi="Calibri"/>
+          <w:b/>
+          <w:bCs/>
+        </w:rPr>
+        <w:t xml:space="preserve">Confirmar contraseña maestra</w:t>
+      </w:r>
+      <w:r>
+        <w:rPr>
+          <w:rFonts w:ascii="Calibri" w:cs="Calibri" w:eastAsia="Calibri" w:hAnsi="Calibri"/>
+        </w:rPr>
+        <w:t xml:space="preserve">. </w:t>
+      </w:r>
+      <w:r>
+        <w:rPr>
+          <w:rFonts w:ascii="Calibri" w:cs="Calibri" w:eastAsia="Calibri" w:hAnsi="Calibri"/>
+          <w:b/>
+          <w:bCs/>
+        </w:rPr>
+        <w:t xml:space="preserve">Anótala en la hoja de datos.</w:t>
+      </w:r>
+    </w:p>
+    <w:p>
+      <w:pPr>
+        <w:pStyle w:val="ListParagraph"/>
+        <w:numPr>
+          <w:ilvl w:val="0"/>
+          <w:numId w:val="19"/>
+        </w:numPr>
+        <w:spacing w:after="70" w:line="276"/>
+      </w:pPr>
+      <w:r>
+        <w:rPr>
+          <w:rFonts w:ascii="Calibri" w:cs="Calibri" w:eastAsia="Calibri" w:hAnsi="Calibri"/>
+          <w:b/>
+          <w:bCs/>
+        </w:rPr>
+        <w:t xml:space="preserve">Configuración de la instancia</w:t>
+      </w:r>
+      <w:r>
+        <w:rPr>
+          <w:rFonts w:ascii="Calibri" w:cs="Calibri" w:eastAsia="Calibri" w:hAnsi="Calibri"/>
+        </w:rPr>
+        <w:t xml:space="preserve"> ➔ </w:t>
+      </w:r>
+      <w:r>
+        <w:rPr>
+          <w:rFonts w:ascii="Calibri" w:cs="Calibri" w:eastAsia="Calibri" w:hAnsi="Calibri"/>
+          <w:b/>
+          <w:bCs/>
+        </w:rPr>
+        <w:t xml:space="preserve">Clase de instancia de base de datos</w:t>
+      </w:r>
+      <w:r>
+        <w:rPr>
+          <w:rFonts w:ascii="Calibri" w:cs="Calibri" w:eastAsia="Calibri" w:hAnsi="Calibri"/>
+        </w:rPr>
+        <w:t xml:space="preserve">: marca </w:t>
+      </w:r>
+      <w:r>
+        <w:rPr>
+          <w:rFonts w:ascii="Calibri" w:cs="Calibri" w:eastAsia="Calibri" w:hAnsi="Calibri"/>
+          <w:b/>
+          <w:bCs/>
+        </w:rPr>
+        <w:t xml:space="preserve">Clases ampliables (incluye clases t)</w:t>
+      </w:r>
+      <w:r>
+        <w:rPr>
+          <w:rFonts w:ascii="Calibri" w:cs="Calibri" w:eastAsia="Calibri" w:hAnsi="Calibri"/>
+        </w:rPr>
+        <w:t xml:space="preserve"> y en </w:t>
+      </w:r>
+      <w:r>
+        <w:rPr>
+          <w:rFonts w:ascii="Calibri" w:cs="Calibri" w:eastAsia="Calibri" w:hAnsi="Calibri"/>
+          <w:b/>
+          <w:bCs/>
+        </w:rPr>
+        <w:t xml:space="preserve">Tipo de instancia</w:t>
+      </w:r>
+      <w:r>
+        <w:rPr>
+          <w:rFonts w:ascii="Calibri" w:cs="Calibri" w:eastAsia="Calibri" w:hAnsi="Calibri"/>
+        </w:rPr>
+        <w:t xml:space="preserve"> elige </w:t>
+      </w:r>
+      <w:r>
+        <w:rPr>
+          <w:rFonts w:ascii="Consolas" w:cs="Consolas" w:eastAsia="Consolas" w:hAnsi="Consolas"/>
+          <w:color w:val="9F1239"/>
+          <w:sz w:val="20"/>
+          <w:szCs w:val="20"/>
+          <w:shd w:fill="F3F4F6" w:color="auto" w:val="clear"/>
+        </w:rPr>
+        <w:t xml:space="preserve">db.t3.micro</w:t>
+      </w:r>
+      <w:r>
+        <w:rPr>
+          <w:rFonts w:ascii="Calibri" w:cs="Calibri" w:eastAsia="Calibri" w:hAnsi="Calibri"/>
+        </w:rPr>
+        <w:t xml:space="preserve"> (o </w:t>
+      </w:r>
+      <w:r>
+        <w:rPr>
+          <w:rFonts w:ascii="Consolas" w:cs="Consolas" w:eastAsia="Consolas" w:hAnsi="Consolas"/>
+          <w:color w:val="9F1239"/>
+          <w:sz w:val="20"/>
+          <w:szCs w:val="20"/>
+          <w:shd w:fill="F3F4F6" w:color="auto" w:val="clear"/>
+        </w:rPr>
+        <w:t xml:space="preserve">db.t4g.micro</w:t>
+      </w:r>
+      <w:r>
+        <w:rPr>
+          <w:rFonts w:ascii="Calibri" w:cs="Calibri" w:eastAsia="Calibri" w:hAnsi="Calibri"/>
+        </w:rPr>
+        <w:t xml:space="preserve">; si no hay </w:t>
+      </w:r>
+      <w:r>
+        <w:rPr>
+          <w:rFonts w:ascii="Consolas" w:cs="Consolas" w:eastAsia="Consolas" w:hAnsi="Consolas"/>
+          <w:color w:val="9F1239"/>
+          <w:sz w:val="20"/>
+          <w:szCs w:val="20"/>
+          <w:shd w:fill="F3F4F6" w:color="auto" w:val="clear"/>
+        </w:rPr>
+        <w:t xml:space="preserve">micro</w:t>
+      </w:r>
+      <w:r>
+        <w:rPr>
+          <w:rFonts w:ascii="Calibri" w:cs="Calibri" w:eastAsia="Calibri" w:hAnsi="Calibri"/>
+        </w:rPr>
+        <w:t xml:space="preserve">, </w:t>
+      </w:r>
+      <w:r>
+        <w:rPr>
+          <w:rFonts w:ascii="Consolas" w:cs="Consolas" w:eastAsia="Consolas" w:hAnsi="Consolas"/>
+          <w:color w:val="9F1239"/>
+          <w:sz w:val="20"/>
+          <w:szCs w:val="20"/>
+          <w:shd w:fill="F3F4F6" w:color="auto" w:val="clear"/>
+        </w:rPr>
+        <w:t xml:space="preserve">db.t3.small</w:t>
+      </w:r>
+      <w:r>
+        <w:rPr>
+          <w:rFonts w:ascii="Calibri" w:cs="Calibri" w:eastAsia="Calibri" w:hAnsi="Calibri"/>
+        </w:rPr>
+        <w:t xml:space="preserve">).</w:t>
+      </w:r>
+    </w:p>
+    <w:p>
+      <w:pPr>
+        <w:pStyle w:val="ListParagraph"/>
+        <w:numPr>
+          <w:ilvl w:val="0"/>
+          <w:numId w:val="19"/>
+        </w:numPr>
+        <w:spacing w:after="70" w:line="276"/>
+      </w:pPr>
+      <w:r>
+        <w:rPr>
+          <w:rFonts w:ascii="Calibri" w:cs="Calibri" w:eastAsia="Calibri" w:hAnsi="Calibri"/>
+          <w:b/>
+          <w:bCs/>
+        </w:rPr>
+        <w:t xml:space="preserve">Conectividad</w:t>
+      </w:r>
+      <w:r>
+        <w:rPr>
+          <w:rFonts w:ascii="Calibri" w:cs="Calibri" w:eastAsia="Calibri" w:hAnsi="Calibri"/>
+        </w:rPr>
+        <w:t xml:space="preserve"> ➔ </w:t>
+      </w:r>
+      <w:r>
+        <w:rPr>
+          <w:rFonts w:ascii="Calibri" w:cs="Calibri" w:eastAsia="Calibri" w:hAnsi="Calibri"/>
+          <w:b/>
+          <w:bCs/>
+        </w:rPr>
+        <w:t xml:space="preserve">Recurso de computación</w:t>
+      </w:r>
+      <w:r>
+        <w:rPr>
+          <w:rFonts w:ascii="Calibri" w:cs="Calibri" w:eastAsia="Calibri" w:hAnsi="Calibri"/>
+        </w:rPr>
+        <w:t xml:space="preserve">: marca </w:t>
+      </w:r>
+      <w:r>
+        <w:rPr>
+          <w:rFonts w:ascii="Calibri" w:cs="Calibri" w:eastAsia="Calibri" w:hAnsi="Calibri"/>
+          <w:b/>
+          <w:bCs/>
+        </w:rPr>
+        <w:t xml:space="preserve">No se conecte a un recurso informático EC2</w:t>
+      </w:r>
+      <w:r>
+        <w:rPr>
+          <w:rFonts w:ascii="Calibri" w:cs="Calibri" w:eastAsia="Calibri" w:hAnsi="Calibri"/>
+        </w:rPr>
+        <w:t xml:space="preserve">.</w:t>
+      </w:r>
+    </w:p>
+    <w:p>
+      <w:pPr>
+        <w:pStyle w:val="ListParagraph"/>
+        <w:numPr>
+          <w:ilvl w:val="0"/>
+          <w:numId w:val="19"/>
+        </w:numPr>
+        <w:spacing w:after="70" w:line="276"/>
+      </w:pPr>
+      <w:r>
+        <w:rPr>
+          <w:rFonts w:ascii="Calibri" w:cs="Calibri" w:eastAsia="Calibri" w:hAnsi="Calibri"/>
+          <w:b/>
+          <w:bCs/>
+        </w:rPr>
+        <w:t xml:space="preserve">Acceso público</w:t>
+      </w:r>
+      <w:r>
+        <w:rPr>
+          <w:rFonts w:ascii="Calibri" w:cs="Calibri" w:eastAsia="Calibri" w:hAnsi="Calibri"/>
+        </w:rPr>
+        <w:t xml:space="preserve">: marca </w:t>
+      </w:r>
+      <w:r>
+        <w:rPr>
+          <w:rFonts w:ascii="Calibri" w:cs="Calibri" w:eastAsia="Calibri" w:hAnsi="Calibri"/>
+          <w:b/>
+          <w:bCs/>
+        </w:rPr>
+        <w:t xml:space="preserve">No</w:t>
+      </w:r>
+      <w:r>
+        <w:rPr>
+          <w:rFonts w:ascii="Calibri" w:cs="Calibri" w:eastAsia="Calibri" w:hAnsi="Calibri"/>
+        </w:rPr>
+        <w:t xml:space="preserve">.</w:t>
+      </w:r>
+    </w:p>
+    <w:p>
+      <w:pPr>
+        <w:pStyle w:val="ListParagraph"/>
+        <w:numPr>
+          <w:ilvl w:val="0"/>
+          <w:numId w:val="19"/>
+        </w:numPr>
+        <w:spacing w:after="70" w:line="276"/>
+      </w:pPr>
+      <w:r>
+        <w:rPr>
+          <w:rFonts w:ascii="Calibri" w:cs="Calibri" w:eastAsia="Calibri" w:hAnsi="Calibri"/>
+          <w:b/>
+          <w:bCs/>
+        </w:rPr>
+        <w:t xml:space="preserve">Grupo de seguridad de VPC (firewall)</w:t>
+      </w:r>
+      <w:r>
+        <w:rPr>
+          <w:rFonts w:ascii="Calibri" w:cs="Calibri" w:eastAsia="Calibri" w:hAnsi="Calibri"/>
+        </w:rPr>
+        <w:t xml:space="preserve">: marca </w:t>
+      </w:r>
+      <w:r>
+        <w:rPr>
+          <w:rFonts w:ascii="Calibri" w:cs="Calibri" w:eastAsia="Calibri" w:hAnsi="Calibri"/>
+          <w:b/>
+          <w:bCs/>
+        </w:rPr>
+        <w:t xml:space="preserve">Elegir existente</w:t>
+      </w:r>
+      <w:r>
+        <w:rPr>
+          <w:rFonts w:ascii="Calibri" w:cs="Calibri" w:eastAsia="Calibri" w:hAnsi="Calibri"/>
+        </w:rPr>
+        <w:t xml:space="preserve">, quita </w:t>
+      </w:r>
+      <w:r>
+        <w:rPr>
+          <w:rFonts w:ascii="Consolas" w:cs="Consolas" w:eastAsia="Consolas" w:hAnsi="Consolas"/>
+          <w:color w:val="9F1239"/>
+          <w:sz w:val="20"/>
+          <w:szCs w:val="20"/>
+          <w:shd w:fill="F3F4F6" w:color="auto" w:val="clear"/>
+        </w:rPr>
+        <w:t xml:space="preserve">default</w:t>
+      </w:r>
+      <w:r>
+        <w:rPr>
+          <w:rFonts w:ascii="Calibri" w:cs="Calibri" w:eastAsia="Calibri" w:hAnsi="Calibri"/>
+        </w:rPr>
+        <w:t xml:space="preserve"> (clic en la X) y agrega </w:t>
+      </w:r>
+      <w:r>
+        <w:rPr>
+          <w:rFonts w:ascii="Consolas" w:cs="Consolas" w:eastAsia="Consolas" w:hAnsi="Consolas"/>
+          <w:color w:val="9F1239"/>
+          <w:sz w:val="20"/>
+          <w:szCs w:val="20"/>
+          <w:shd w:fill="F3F4F6" w:color="auto" w:val="clear"/>
+        </w:rPr>
+        <w:t xml:space="preserve">rds-postgres-sg</w:t>
+      </w:r>
+      <w:r>
+        <w:rPr>
+          <w:rFonts w:ascii="Calibri" w:cs="Calibri" w:eastAsia="Calibri" w:hAnsi="Calibri"/>
+        </w:rPr>
+        <w:t xml:space="preserve">.</w:t>
+      </w:r>
+    </w:p>
+    <w:p>
+      <w:pPr>
+        <w:pStyle w:val="ListParagraph"/>
+        <w:numPr>
+          <w:ilvl w:val="0"/>
+          <w:numId w:val="19"/>
+        </w:numPr>
+        <w:spacing w:after="70" w:line="276"/>
+      </w:pPr>
+      <w:r>
+        <w:rPr>
+          <w:rFonts w:ascii="Calibri" w:cs="Calibri" w:eastAsia="Calibri" w:hAnsi="Calibri"/>
+        </w:rPr>
+        <w:t xml:space="preserve">Abre </w:t>
+      </w:r>
+      <w:r>
+        <w:rPr>
+          <w:rFonts w:ascii="Calibri" w:cs="Calibri" w:eastAsia="Calibri" w:hAnsi="Calibri"/>
+          <w:b/>
+          <w:bCs/>
+        </w:rPr>
+        <w:t xml:space="preserve">Configuración adicional</w:t>
+      </w:r>
+      <w:r>
+        <w:rPr>
+          <w:rFonts w:ascii="Calibri" w:cs="Calibri" w:eastAsia="Calibri" w:hAnsi="Calibri"/>
+        </w:rPr>
+        <w:t xml:space="preserve"> (sección plegada, al final de la página) y llena: </w:t>
+      </w:r>
+      <w:r>
+        <w:rPr>
+          <w:rFonts w:ascii="Calibri" w:cs="Calibri" w:eastAsia="Calibri" w:hAnsi="Calibri"/>
+          <w:b/>
+          <w:bCs/>
+        </w:rPr>
+        <w:t xml:space="preserve">Nombre de la base de datos inicial</w:t>
+      </w:r>
+      <w:r>
+        <w:rPr>
+          <w:rFonts w:ascii="Calibri" w:cs="Calibri" w:eastAsia="Calibri" w:hAnsi="Calibri"/>
+        </w:rPr>
+        <w:t xml:space="preserve"> = </w:t>
+      </w:r>
+      <w:r>
+        <w:rPr>
+          <w:rFonts w:ascii="Consolas" w:cs="Consolas" w:eastAsia="Consolas" w:hAnsi="Consolas"/>
+          <w:color w:val="9F1239"/>
+          <w:sz w:val="20"/>
+          <w:szCs w:val="20"/>
+          <w:shd w:fill="F3F4F6" w:color="auto" w:val="clear"/>
+        </w:rPr>
+        <w:t xml:space="preserve">tubeyou_db</w:t>
+      </w:r>
+      <w:r>
+        <w:rPr>
+          <w:rFonts w:ascii="Calibri" w:cs="Calibri" w:eastAsia="Calibri" w:hAnsi="Calibri"/>
+        </w:rPr>
+        <w:t xml:space="preserve">. Además </w:t>
+      </w:r>
+      <w:r>
+        <w:rPr>
+          <w:rFonts w:ascii="Calibri" w:cs="Calibri" w:eastAsia="Calibri" w:hAnsi="Calibri"/>
+          <w:b/>
+          <w:bCs/>
+        </w:rPr>
+        <w:t xml:space="preserve">desmarca</w:t>
+      </w:r>
+      <w:r>
+        <w:rPr>
+          <w:rFonts w:ascii="Calibri" w:cs="Calibri" w:eastAsia="Calibri" w:hAnsi="Calibri"/>
+        </w:rPr>
+        <w:t xml:space="preserve"> </w:t>
+      </w:r>
+      <w:r>
+        <w:rPr>
+          <w:rFonts w:ascii="Calibri" w:cs="Calibri" w:eastAsia="Calibri" w:hAnsi="Calibri"/>
+          <w:i/>
+          <w:iCs/>
+        </w:rPr>
+        <w:t xml:space="preserve">Activar la protección contra eliminación</w:t>
+      </w:r>
+      <w:r>
+        <w:rPr>
+          <w:rFonts w:ascii="Calibri" w:cs="Calibri" w:eastAsia="Calibri" w:hAnsi="Calibri"/>
+        </w:rPr>
+        <w:t xml:space="preserve"> (si no, no podrás borrar la base al terminar).</w:t>
+      </w:r>
+    </w:p>
+    <w:p>
+      <w:pPr>
+        <w:pStyle w:val="ListParagraph"/>
+        <w:numPr>
+          <w:ilvl w:val="0"/>
+          <w:numId w:val="19"/>
+        </w:numPr>
+        <w:spacing w:after="70" w:line="276"/>
+      </w:pPr>
+      <w:r>
+        <w:rPr>
+          <w:rFonts w:ascii="Calibri" w:cs="Calibri" w:eastAsia="Calibri" w:hAnsi="Calibri"/>
+        </w:rPr>
+        <w:t xml:space="preserve">Baja hasta </w:t>
+      </w:r>
+      <w:r>
+        <w:rPr>
+          <w:rFonts w:ascii="Calibri" w:cs="Calibri" w:eastAsia="Calibri" w:hAnsi="Calibri"/>
+          <w:b/>
+          <w:bCs/>
+        </w:rPr>
+        <w:t xml:space="preserve">Costos mensuales estimados</w:t>
+      </w:r>
+      <w:r>
+        <w:rPr>
+          <w:rFonts w:ascii="Calibri" w:cs="Calibri" w:eastAsia="Calibri" w:hAnsi="Calibri"/>
+        </w:rPr>
+        <w:t xml:space="preserve">: el </w:t>
+      </w:r>
+      <w:r>
+        <w:rPr>
+          <w:rFonts w:ascii="Calibri" w:cs="Calibri" w:eastAsia="Calibri" w:hAnsi="Calibri"/>
+          <w:b/>
+          <w:bCs/>
+        </w:rPr>
+        <w:t xml:space="preserve">Total</w:t>
+      </w:r>
+      <w:r>
+        <w:rPr>
+          <w:rFonts w:ascii="Calibri" w:cs="Calibri" w:eastAsia="Calibri" w:hAnsi="Calibri"/>
+        </w:rPr>
+        <w:t xml:space="preserve"> debe ser de unos </w:t>
+      </w:r>
+      <w:r>
+        <w:rPr>
+          <w:rFonts w:ascii="Calibri" w:cs="Calibri" w:eastAsia="Calibri" w:hAnsi="Calibri"/>
+          <w:b/>
+          <w:bCs/>
+        </w:rPr>
+        <w:t xml:space="preserve">15 USD o menos</w:t>
+      </w:r>
+      <w:r>
+        <w:rPr>
+          <w:rFonts w:ascii="Calibri" w:cs="Calibri" w:eastAsia="Calibri" w:hAnsi="Calibri"/>
+        </w:rPr>
+        <w:t xml:space="preserve">.</w:t>
+      </w:r>
+    </w:p>
+    <w:p>
+      <w:pPr>
+        <w:pStyle w:val="ListParagraph"/>
+        <w:numPr>
+          <w:ilvl w:val="0"/>
+          <w:numId w:val="19"/>
+        </w:numPr>
+        <w:spacing w:after="70" w:line="276"/>
+      </w:pPr>
+      <w:r>
+        <w:rPr>
+          <w:rFonts w:ascii="Calibri" w:cs="Calibri" w:eastAsia="Calibri" w:hAnsi="Calibri"/>
+        </w:rPr>
+        <w:t xml:space="preserve">Presiona el botón naranja </w:t>
+      </w:r>
+      <w:r>
+        <w:rPr>
+          <w:rFonts w:ascii="Calibri" w:cs="Calibri" w:eastAsia="Calibri" w:hAnsi="Calibri"/>
+          <w:b/>
+          <w:bCs/>
+        </w:rPr>
+        <w:t xml:space="preserve">Crear base de datos</w:t>
+      </w:r>
+      <w:r>
+        <w:rPr>
+          <w:rFonts w:ascii="Calibri" w:cs="Calibri" w:eastAsia="Calibri" w:hAnsi="Calibri"/>
+        </w:rPr>
+        <w:t xml:space="preserve">.</w:t>
       </w:r>
     </w:p>
     <w:tbl>
@@ -12396,12 +13281,12 @@
           <w:tcPr>
             <w:tcW w:type="dxa" w:w="9360"/>
             <w:tcBorders>
-              <w:top w:val="single" w:color="FEF2F2" w:sz="4"/>
-              <w:left w:val="single" w:color="DC2626" w:sz="24"/>
-              <w:bottom w:val="single" w:color="FEF2F2" w:sz="4"/>
-              <w:right w:val="single" w:color="FEF2F2" w:sz="4"/>
+              <w:top w:val="single" w:color="FFFBEB" w:sz="4"/>
+              <w:left w:val="single" w:color="D97706" w:sz="24"/>
+              <w:bottom w:val="single" w:color="FFFBEB" w:sz="4"/>
+              <w:right w:val="single" w:color="FFFBEB" w:sz="4"/>
             </w:tcBorders>
-            <w:shd w:fill="FEF2F2" w:color="auto" w:val="clear"/>
+            <w:shd w:fill="FFFBEB" w:color="auto" w:val="clear"/>
             <w:tcMar>
               <w:top w:type="dxa" w:w="100"/>
               <w:left w:type="dxa" w:w="160"/>
@@ -12418,11 +13303,11 @@
                 <w:rFonts w:ascii="Calibri" w:cs="Calibri" w:eastAsia="Calibri" w:hAnsi="Calibri"/>
                 <w:b/>
                 <w:bCs/>
-                <w:color w:val="DC2626"/>
+                <w:color w:val="D97706"/>
                 <w:sz w:val="21"/>
                 <w:szCs w:val="21"/>
               </w:rPr>
-              <w:t xml:space="preserve">ERROR: Cuidado con el costo: revisa el total antes de crear</w:t>
+              <w:t xml:space="preserve">ATENCION: Si el total sale de cientos de dólares</w:t>
             </w:r>
           </w:p>
           <w:p>
@@ -12435,7 +13320,7 @@
                 <w:sz w:val="21"/>
                 <w:szCs w:val="21"/>
               </w:rPr>
-              <w:t xml:space="preserve">Al final del formulario, en </w:t>
+              <w:t xml:space="preserve">No crees la base. Casi siempre es que no quedó </w:t>
             </w:r>
             <w:r>
               <w:rPr>
@@ -12445,7 +13330,7 @@
                 <w:sz w:val="21"/>
                 <w:szCs w:val="21"/>
               </w:rPr>
-              <w:t xml:space="preserve">Costos mensuales estimados</w:t>
+              <w:t xml:space="preserve">Entorno de pruebas</w:t>
             </w:r>
             <w:r>
               <w:rPr>
@@ -12453,56 +13338,7 @@
                 <w:sz w:val="21"/>
                 <w:szCs w:val="21"/>
               </w:rPr>
-              <w:t xml:space="preserve">, el total para este proyecto debe ser de </w:t>
-            </w:r>
-            <w:r>
-              <w:rPr>
-                <w:rFonts w:ascii="Calibri" w:cs="Calibri" w:eastAsia="Calibri" w:hAnsi="Calibri"/>
-                <w:b/>
-                <w:bCs/>
-                <w:sz w:val="21"/>
-                <w:szCs w:val="21"/>
-              </w:rPr>
-              <w:t xml:space="preserve">unos 15 USD al mes o menos</w:t>
-            </w:r>
-            <w:r>
-              <w:rPr>
-                <w:rFonts w:ascii="Calibri" w:cs="Calibri" w:eastAsia="Calibri" w:hAnsi="Calibri"/>
-                <w:sz w:val="21"/>
-                <w:szCs w:val="21"/>
-              </w:rPr>
-              <w:t xml:space="preserve"> (y la capa gratuita o los créditos de tu cuenta pueden cubrirlo).</w:t>
-            </w:r>
-          </w:p>
-          <w:p>
-            <w:pPr>
-              <w:spacing w:after="50" w:line="264"/>
-            </w:pPr>
-            <w:r>
-              <w:rPr>
-                <w:rFonts w:ascii="Calibri" w:cs="Calibri" w:eastAsia="Calibri" w:hAnsi="Calibri"/>
-                <w:sz w:val="21"/>
-                <w:szCs w:val="21"/>
-              </w:rPr>
-              <w:t xml:space="preserve">Si ves </w:t>
-            </w:r>
-            <w:r>
-              <w:rPr>
-                <w:rFonts w:ascii="Calibri" w:cs="Calibri" w:eastAsia="Calibri" w:hAnsi="Calibri"/>
-                <w:b/>
-                <w:bCs/>
-                <w:sz w:val="21"/>
-                <w:szCs w:val="21"/>
-              </w:rPr>
-              <w:t xml:space="preserve">cientos o miles de dólares</w:t>
-            </w:r>
-            <w:r>
-              <w:rPr>
-                <w:rFonts w:ascii="Calibri" w:cs="Calibri" w:eastAsia="Calibri" w:hAnsi="Calibri"/>
-                <w:sz w:val="21"/>
-                <w:szCs w:val="21"/>
-              </w:rPr>
-              <w:t xml:space="preserve"> (por ejemplo 1.477 USD), tienes marcada la plantilla </w:t>
+              <w:t xml:space="preserve"> en </w:t>
             </w:r>
             <w:r>
               <w:rPr>
@@ -12512,7 +13348,7 @@
                 <w:sz w:val="21"/>
                 <w:szCs w:val="21"/>
               </w:rPr>
-              <w:t xml:space="preserve">Producción</w:t>
+              <w:t xml:space="preserve">Plantillas</w:t>
             </w:r>
             <w:r>
               <w:rPr>
@@ -12520,61 +13356,7 @@
                 <w:sz w:val="21"/>
                 <w:szCs w:val="21"/>
               </w:rPr>
-              <w:t xml:space="preserve">, una instalación </w:t>
-            </w:r>
-            <w:r>
-              <w:rPr>
-                <w:rFonts w:ascii="Calibri" w:cs="Calibri" w:eastAsia="Calibri" w:hAnsi="Calibri"/>
-                <w:i/>
-                <w:iCs/>
-                <w:sz w:val="21"/>
-                <w:szCs w:val="21"/>
-              </w:rPr>
-              <w:t xml:space="preserve">multi-AZ</w:t>
-            </w:r>
-            <w:r>
-              <w:rPr>
-                <w:rFonts w:ascii="Calibri" w:cs="Calibri" w:eastAsia="Calibri" w:hAnsi="Calibri"/>
-                <w:sz w:val="21"/>
-                <w:szCs w:val="21"/>
-              </w:rPr>
-              <w:t xml:space="preserve"> o el disco </w:t>
-            </w:r>
-            <w:r>
-              <w:rPr>
-                <w:rFonts w:ascii="Calibri" w:cs="Calibri" w:eastAsia="Calibri" w:hAnsi="Calibri"/>
-                <w:i/>
-                <w:iCs/>
-                <w:sz w:val="21"/>
-                <w:szCs w:val="21"/>
-              </w:rPr>
-              <w:t xml:space="preserve">io2</w:t>
-            </w:r>
-            <w:r>
-              <w:rPr>
-                <w:rFonts w:ascii="Calibri" w:cs="Calibri" w:eastAsia="Calibri" w:hAnsi="Calibri"/>
-                <w:sz w:val="21"/>
-                <w:szCs w:val="21"/>
-              </w:rPr>
-              <w:t xml:space="preserve">. </w:t>
-            </w:r>
-            <w:r>
-              <w:rPr>
-                <w:rFonts w:ascii="Calibri" w:cs="Calibri" w:eastAsia="Calibri" w:hAnsi="Calibri"/>
-                <w:b/>
-                <w:bCs/>
-                <w:sz w:val="21"/>
-                <w:szCs w:val="21"/>
-              </w:rPr>
-              <w:t xml:space="preserve">No crees la base</w:t>
-            </w:r>
-            <w:r>
-              <w:rPr>
-                <w:rFonts w:ascii="Calibri" w:cs="Calibri" w:eastAsia="Calibri" w:hAnsi="Calibri"/>
-                <w:sz w:val="21"/>
-                <w:szCs w:val="21"/>
-              </w:rPr>
-              <w:t xml:space="preserve"> hasta corregirlo con los pasos de abajo.</w:t>
+              <w:t xml:space="preserve"> (sube a ese punto y márcalo otra vez). Con esa plantilla el costo baja solo.</w:t>
             </w:r>
           </w:p>
         </w:tc>
@@ -12590,1604 +13372,6 @@
           <w:szCs w:val="4"/>
         </w:rPr>
         <w:t xml:space="preserve"/>
-      </w:r>
-    </w:p>
-    <w:p>
-      <w:pPr>
-        <w:pStyle w:val="ListParagraph"/>
-        <w:numPr>
-          <w:ilvl w:val="0"/>
-          <w:numId w:val="19"/>
-        </w:numPr>
-        <w:spacing w:after="70" w:line="276"/>
-      </w:pPr>
-      <w:r>
-        <w:rPr>
-          <w:rFonts w:ascii="Calibri" w:cs="Calibri" w:eastAsia="Calibri" w:hAnsi="Calibri"/>
-        </w:rPr>
-        <w:t xml:space="preserve">Busca </w:t>
-      </w:r>
-      <w:r>
-        <w:rPr>
-          <w:rFonts w:ascii="Consolas" w:cs="Consolas" w:eastAsia="Consolas" w:hAnsi="Consolas"/>
-          <w:color w:val="9F1239"/>
-          <w:sz w:val="20"/>
-          <w:szCs w:val="20"/>
-          <w:shd w:fill="F3F4F6" w:color="auto" w:val="clear"/>
-        </w:rPr>
-        <w:t xml:space="preserve">RDS</w:t>
-      </w:r>
-      <w:r>
-        <w:rPr>
-          <w:rFonts w:ascii="Calibri" w:cs="Calibri" w:eastAsia="Calibri" w:hAnsi="Calibri"/>
-        </w:rPr>
-        <w:t xml:space="preserve"> y entra. Menú izquierdo ➔ </w:t>
-      </w:r>
-      <w:r>
-        <w:rPr>
-          <w:rFonts w:ascii="Calibri" w:cs="Calibri" w:eastAsia="Calibri" w:hAnsi="Calibri"/>
-          <w:b/>
-          <w:bCs/>
-        </w:rPr>
-        <w:t xml:space="preserve">Bases de datos</w:t>
-      </w:r>
-      <w:r>
-        <w:rPr>
-          <w:rFonts w:ascii="Calibri" w:cs="Calibri" w:eastAsia="Calibri" w:hAnsi="Calibri"/>
-        </w:rPr>
-        <w:t xml:space="preserve"> ➔ botón naranja </w:t>
-      </w:r>
-      <w:r>
-        <w:rPr>
-          <w:rFonts w:ascii="Calibri" w:cs="Calibri" w:eastAsia="Calibri" w:hAnsi="Calibri"/>
-          <w:b/>
-          <w:bCs/>
-        </w:rPr>
-        <w:t xml:space="preserve">Crear base de datos</w:t>
-      </w:r>
-      <w:r>
-        <w:rPr>
-          <w:rFonts w:ascii="Calibri" w:cs="Calibri" w:eastAsia="Calibri" w:hAnsi="Calibri"/>
-        </w:rPr>
-        <w:t xml:space="preserve">.</w:t>
-      </w:r>
-    </w:p>
-    <w:p>
-      <w:pPr>
-        <w:pStyle w:val="ListParagraph"/>
-        <w:numPr>
-          <w:ilvl w:val="0"/>
-          <w:numId w:val="19"/>
-        </w:numPr>
-        <w:spacing w:after="70" w:line="276"/>
-      </w:pPr>
-      <w:r>
-        <w:rPr>
-          <w:rFonts w:ascii="Calibri" w:cs="Calibri" w:eastAsia="Calibri" w:hAnsi="Calibri"/>
-          <w:b/>
-          <w:bCs/>
-        </w:rPr>
-        <w:t xml:space="preserve">Opciones del motor</w:t>
-      </w:r>
-      <w:r>
-        <w:rPr>
-          <w:rFonts w:ascii="Calibri" w:cs="Calibri" w:eastAsia="Calibri" w:hAnsi="Calibri"/>
-        </w:rPr>
-        <w:t xml:space="preserve"> ➔ </w:t>
-      </w:r>
-      <w:r>
-        <w:rPr>
-          <w:rFonts w:ascii="Calibri" w:cs="Calibri" w:eastAsia="Calibri" w:hAnsi="Calibri"/>
-          <w:b/>
-          <w:bCs/>
-        </w:rPr>
-        <w:t xml:space="preserve">Tipo de motor</w:t>
-      </w:r>
-      <w:r>
-        <w:rPr>
-          <w:rFonts w:ascii="Calibri" w:cs="Calibri" w:eastAsia="Calibri" w:hAnsi="Calibri"/>
-        </w:rPr>
-        <w:t xml:space="preserve">: haz clic en el recuadro </w:t>
-      </w:r>
-      <w:r>
-        <w:rPr>
-          <w:rFonts w:ascii="Calibri" w:cs="Calibri" w:eastAsia="Calibri" w:hAnsi="Calibri"/>
-          <w:b/>
-          <w:bCs/>
-        </w:rPr>
-        <w:t xml:space="preserve">PostgreSQL</w:t>
-      </w:r>
-      <w:r>
-        <w:rPr>
-          <w:rFonts w:ascii="Calibri" w:cs="Calibri" w:eastAsia="Calibri" w:hAnsi="Calibri"/>
-        </w:rPr>
-        <w:t xml:space="preserve"> (no Aurora).</w:t>
-      </w:r>
-    </w:p>
-    <w:p>
-      <w:pPr>
-        <w:pStyle w:val="ListParagraph"/>
-        <w:numPr>
-          <w:ilvl w:val="0"/>
-          <w:numId w:val="19"/>
-        </w:numPr>
-        <w:spacing w:after="70" w:line="276"/>
-      </w:pPr>
-      <w:r>
-        <w:rPr>
-          <w:rFonts w:ascii="Calibri" w:cs="Calibri" w:eastAsia="Calibri" w:hAnsi="Calibri"/>
-          <w:b/>
-          <w:bCs/>
-        </w:rPr>
-        <w:t xml:space="preserve">Elegir un método de creación de base de datos</w:t>
-      </w:r>
-      <w:r>
-        <w:rPr>
-          <w:rFonts w:ascii="Calibri" w:cs="Calibri" w:eastAsia="Calibri" w:hAnsi="Calibri"/>
-        </w:rPr>
-        <w:t xml:space="preserve">: marca </w:t>
-      </w:r>
-      <w:r>
-        <w:rPr>
-          <w:rFonts w:ascii="Calibri" w:cs="Calibri" w:eastAsia="Calibri" w:hAnsi="Calibri"/>
-          <w:b/>
-          <w:bCs/>
-        </w:rPr>
-        <w:t xml:space="preserve">Configuración completa</w:t>
-      </w:r>
-      <w:r>
-        <w:rPr>
-          <w:rFonts w:ascii="Calibri" w:cs="Calibri" w:eastAsia="Calibri" w:hAnsi="Calibri"/>
-        </w:rPr>
-        <w:t xml:space="preserve">.</w:t>
-      </w:r>
-    </w:p>
-    <w:p>
-      <w:pPr>
-        <w:pStyle w:val="ListParagraph"/>
-        <w:numPr>
-          <w:ilvl w:val="0"/>
-          <w:numId w:val="19"/>
-        </w:numPr>
-        <w:spacing w:after="70" w:line="276"/>
-      </w:pPr>
-      <w:r>
-        <w:rPr>
-          <w:rFonts w:ascii="Calibri" w:cs="Calibri" w:eastAsia="Calibri" w:hAnsi="Calibri"/>
-          <w:b/>
-          <w:bCs/>
-        </w:rPr>
-        <w:t xml:space="preserve">Plantillas</w:t>
-      </w:r>
-      <w:r>
-        <w:rPr>
-          <w:rFonts w:ascii="Calibri" w:cs="Calibri" w:eastAsia="Calibri" w:hAnsi="Calibri"/>
-        </w:rPr>
-        <w:t xml:space="preserve">: marca </w:t>
-      </w:r>
-      <w:r>
-        <w:rPr>
-          <w:rFonts w:ascii="Calibri" w:cs="Calibri" w:eastAsia="Calibri" w:hAnsi="Calibri"/>
-          <w:b/>
-          <w:bCs/>
-        </w:rPr>
-        <w:t xml:space="preserve">Entorno de pruebas</w:t>
-      </w:r>
-      <w:r>
-        <w:rPr>
-          <w:rFonts w:ascii="Calibri" w:cs="Calibri" w:eastAsia="Calibri" w:hAnsi="Calibri"/>
-        </w:rPr>
-        <w:t xml:space="preserve"> (Sandbox). </w:t>
-      </w:r>
-      <w:r>
-        <w:rPr>
-          <w:rFonts w:ascii="Calibri" w:cs="Calibri" w:eastAsia="Calibri" w:hAnsi="Calibri"/>
-          <w:b/>
-          <w:bCs/>
-        </w:rPr>
-        <w:t xml:space="preserve">No</w:t>
-      </w:r>
-      <w:r>
-        <w:rPr>
-          <w:rFonts w:ascii="Calibri" w:cs="Calibri" w:eastAsia="Calibri" w:hAnsi="Calibri"/>
-        </w:rPr>
-        <w:t xml:space="preserve"> elijas </w:t>
-      </w:r>
-      <w:r>
-        <w:rPr>
-          <w:rFonts w:ascii="Calibri" w:cs="Calibri" w:eastAsia="Calibri" w:hAnsi="Calibri"/>
-          <w:i/>
-          <w:iCs/>
-        </w:rPr>
-        <w:t xml:space="preserve">Producción</w:t>
-      </w:r>
-      <w:r>
-        <w:rPr>
-          <w:rFonts w:ascii="Calibri" w:cs="Calibri" w:eastAsia="Calibri" w:hAnsi="Calibri"/>
-        </w:rPr>
-        <w:t xml:space="preserve"> ni </w:t>
-      </w:r>
-      <w:r>
-        <w:rPr>
-          <w:rFonts w:ascii="Calibri" w:cs="Calibri" w:eastAsia="Calibri" w:hAnsi="Calibri"/>
-          <w:i/>
-          <w:iCs/>
-        </w:rPr>
-        <w:t xml:space="preserve">Desarrollo y pruebas</w:t>
-      </w:r>
-      <w:r>
-        <w:rPr>
-          <w:rFonts w:ascii="Calibri" w:cs="Calibri" w:eastAsia="Calibri" w:hAnsi="Calibri"/>
-        </w:rPr>
-        <w:t xml:space="preserve">: esas activan opciones caras.</w:t>
-      </w:r>
-    </w:p>
-    <w:p>
-      <w:pPr>
-        <w:pStyle w:val="ListParagraph"/>
-        <w:numPr>
-          <w:ilvl w:val="0"/>
-          <w:numId w:val="19"/>
-        </w:numPr>
-        <w:spacing w:after="70" w:line="276"/>
-      </w:pPr>
-      <w:r>
-        <w:rPr>
-          <w:rFonts w:ascii="Calibri" w:cs="Calibri" w:eastAsia="Calibri" w:hAnsi="Calibri"/>
-          <w:b/>
-          <w:bCs/>
-        </w:rPr>
-        <w:t xml:space="preserve">Disponibilidad y durabilidad</w:t>
-      </w:r>
-      <w:r>
-        <w:rPr>
-          <w:rFonts w:ascii="Calibri" w:cs="Calibri" w:eastAsia="Calibri" w:hAnsi="Calibri"/>
-        </w:rPr>
-        <w:t xml:space="preserve"> ➔ </w:t>
-      </w:r>
-      <w:r>
-        <w:rPr>
-          <w:rFonts w:ascii="Calibri" w:cs="Calibri" w:eastAsia="Calibri" w:hAnsi="Calibri"/>
-          <w:b/>
-          <w:bCs/>
-        </w:rPr>
-        <w:t xml:space="preserve">Opciones de implementación</w:t>
-      </w:r>
-      <w:r>
-        <w:rPr>
-          <w:rFonts w:ascii="Calibri" w:cs="Calibri" w:eastAsia="Calibri" w:hAnsi="Calibri"/>
-        </w:rPr>
-        <w:t xml:space="preserve">: marca </w:t>
-      </w:r>
-      <w:r>
-        <w:rPr>
-          <w:rFonts w:ascii="Calibri" w:cs="Calibri" w:eastAsia="Calibri" w:hAnsi="Calibri"/>
-          <w:b/>
-          <w:bCs/>
-        </w:rPr>
-        <w:t xml:space="preserve">Implementación de una instancia de base de datos de zona de disponibilidad única (1 instancia)</w:t>
-      </w:r>
-      <w:r>
-        <w:rPr>
-          <w:rFonts w:ascii="Calibri" w:cs="Calibri" w:eastAsia="Calibri" w:hAnsi="Calibri"/>
-        </w:rPr>
-        <w:t xml:space="preserve">. Con </w:t>
-      </w:r>
-      <w:r>
-        <w:rPr>
-          <w:rFonts w:ascii="Calibri" w:cs="Calibri" w:eastAsia="Calibri" w:hAnsi="Calibri"/>
-          <w:i/>
-          <w:iCs/>
-        </w:rPr>
-        <w:t xml:space="preserve">Entorno de pruebas</w:t>
-      </w:r>
-      <w:r>
-        <w:rPr>
-          <w:rFonts w:ascii="Calibri" w:cs="Calibri" w:eastAsia="Calibri" w:hAnsi="Calibri"/>
-        </w:rPr>
-        <w:t xml:space="preserve"> ya viene marcada.</w:t>
-      </w:r>
-    </w:p>
-    <w:p>
-      <w:pPr>
-        <w:pStyle w:val="ListParagraph"/>
-        <w:numPr>
-          <w:ilvl w:val="0"/>
-          <w:numId w:val="19"/>
-        </w:numPr>
-        <w:spacing w:after="70" w:line="276"/>
-      </w:pPr>
-      <w:r>
-        <w:rPr>
-          <w:rFonts w:ascii="Calibri" w:cs="Calibri" w:eastAsia="Calibri" w:hAnsi="Calibri"/>
-          <w:b/>
-          <w:bCs/>
-        </w:rPr>
-        <w:t xml:space="preserve">Versión del motor</w:t>
-      </w:r>
-      <w:r>
-        <w:rPr>
-          <w:rFonts w:ascii="Calibri" w:cs="Calibri" w:eastAsia="Calibri" w:hAnsi="Calibri"/>
-        </w:rPr>
-        <w:t xml:space="preserve">: deja la que aparece (o elige una PostgreSQL 16 o 17 si la ves). </w:t>
-      </w:r>
-      <w:r>
-        <w:rPr>
-          <w:rFonts w:ascii="Calibri" w:cs="Calibri" w:eastAsia="Calibri" w:hAnsi="Calibri"/>
-          <w:b/>
-          <w:bCs/>
-        </w:rPr>
-        <w:t xml:space="preserve">No</w:t>
-      </w:r>
-      <w:r>
-        <w:rPr>
-          <w:rFonts w:ascii="Calibri" w:cs="Calibri" w:eastAsia="Calibri" w:hAnsi="Calibri"/>
-        </w:rPr>
-        <w:t xml:space="preserve"> marques </w:t>
-      </w:r>
-      <w:r>
-        <w:rPr>
-          <w:rFonts w:ascii="Calibri" w:cs="Calibri" w:eastAsia="Calibri" w:hAnsi="Calibri"/>
-          <w:i/>
-          <w:iCs/>
-        </w:rPr>
-        <w:t xml:space="preserve">Activar el soporte extendido de RDS</w:t>
-      </w:r>
-      <w:r>
-        <w:rPr>
-          <w:rFonts w:ascii="Calibri" w:cs="Calibri" w:eastAsia="Calibri" w:hAnsi="Calibri"/>
-        </w:rPr>
-        <w:t xml:space="preserve"> (tiene costo).</w:t>
-      </w:r>
-    </w:p>
-    <w:p>
-      <w:pPr>
-        <w:pStyle w:val="ListParagraph"/>
-        <w:numPr>
-          <w:ilvl w:val="0"/>
-          <w:numId w:val="19"/>
-        </w:numPr>
-        <w:spacing w:after="70" w:line="276"/>
-      </w:pPr>
-      <w:r>
-        <w:rPr>
-          <w:rFonts w:ascii="Calibri" w:cs="Calibri" w:eastAsia="Calibri" w:hAnsi="Calibri"/>
-          <w:b/>
-          <w:bCs/>
-        </w:rPr>
-        <w:t xml:space="preserve">Identificador de instancia de base de datos</w:t>
-      </w:r>
-      <w:r>
-        <w:rPr>
-          <w:rFonts w:ascii="Calibri" w:cs="Calibri" w:eastAsia="Calibri" w:hAnsi="Calibri"/>
-        </w:rPr>
-        <w:t xml:space="preserve">: escribe </w:t>
-      </w:r>
-      <w:r>
-        <w:rPr>
-          <w:rFonts w:ascii="Consolas" w:cs="Consolas" w:eastAsia="Consolas" w:hAnsi="Consolas"/>
-          <w:color w:val="9F1239"/>
-          <w:sz w:val="20"/>
-          <w:szCs w:val="20"/>
-          <w:shd w:fill="F3F4F6" w:color="auto" w:val="clear"/>
-        </w:rPr>
-        <w:t xml:space="preserve">tubeyou-rds</w:t>
-      </w:r>
-      <w:r>
-        <w:rPr>
-          <w:rFonts w:ascii="Calibri" w:cs="Calibri" w:eastAsia="Calibri" w:hAnsi="Calibri"/>
-        </w:rPr>
-        <w:t xml:space="preserve">. (Si el campo dice </w:t>
-      </w:r>
-      <w:r>
-        <w:rPr>
-          <w:rFonts w:ascii="Calibri" w:cs="Calibri" w:eastAsia="Calibri" w:hAnsi="Calibri"/>
-          <w:i/>
-          <w:iCs/>
-        </w:rPr>
-        <w:t xml:space="preserve">Identificador del clúster</w:t>
-      </w:r>
-      <w:r>
-        <w:rPr>
-          <w:rFonts w:ascii="Calibri" w:cs="Calibri" w:eastAsia="Calibri" w:hAnsi="Calibri"/>
-        </w:rPr>
-        <w:t xml:space="preserve">, es que sigues en una opción multi-AZ: vuelve al paso 5.)</w:t>
-      </w:r>
-    </w:p>
-    <w:p>
-      <w:pPr>
-        <w:pStyle w:val="ListParagraph"/>
-        <w:numPr>
-          <w:ilvl w:val="0"/>
-          <w:numId w:val="19"/>
-        </w:numPr>
-        <w:spacing w:after="70" w:line="276"/>
-      </w:pPr>
-      <w:r>
-        <w:rPr>
-          <w:rFonts w:ascii="Calibri" w:cs="Calibri" w:eastAsia="Calibri" w:hAnsi="Calibri"/>
-          <w:b/>
-          <w:bCs/>
-        </w:rPr>
-        <w:t xml:space="preserve">Configuración de credenciales</w:t>
-      </w:r>
-      <w:r>
-        <w:rPr>
-          <w:rFonts w:ascii="Calibri" w:cs="Calibri" w:eastAsia="Calibri" w:hAnsi="Calibri"/>
-        </w:rPr>
-        <w:t xml:space="preserve"> ➔ </w:t>
-      </w:r>
-      <w:r>
-        <w:rPr>
-          <w:rFonts w:ascii="Calibri" w:cs="Calibri" w:eastAsia="Calibri" w:hAnsi="Calibri"/>
-          <w:b/>
-          <w:bCs/>
-        </w:rPr>
-        <w:t xml:space="preserve">Nombre de usuario maestro</w:t>
-      </w:r>
-      <w:r>
-        <w:rPr>
-          <w:rFonts w:ascii="Calibri" w:cs="Calibri" w:eastAsia="Calibri" w:hAnsi="Calibri"/>
-        </w:rPr>
-        <w:t xml:space="preserve">: escribe </w:t>
-      </w:r>
-      <w:r>
-        <w:rPr>
-          <w:rFonts w:ascii="Consolas" w:cs="Consolas" w:eastAsia="Consolas" w:hAnsi="Consolas"/>
-          <w:color w:val="9F1239"/>
-          <w:sz w:val="20"/>
-          <w:szCs w:val="20"/>
-          <w:shd w:fill="F3F4F6" w:color="auto" w:val="clear"/>
-        </w:rPr>
-        <w:t xml:space="preserve">postgres</w:t>
-      </w:r>
-      <w:r>
-        <w:rPr>
-          <w:rFonts w:ascii="Calibri" w:cs="Calibri" w:eastAsia="Calibri" w:hAnsi="Calibri"/>
-        </w:rPr>
-        <w:t xml:space="preserve">.</w:t>
-      </w:r>
-    </w:p>
-    <w:p>
-      <w:pPr>
-        <w:pStyle w:val="ListParagraph"/>
-        <w:numPr>
-          <w:ilvl w:val="0"/>
-          <w:numId w:val="19"/>
-        </w:numPr>
-        <w:spacing w:after="70" w:line="276"/>
-      </w:pPr>
-      <w:r>
-        <w:rPr>
-          <w:rFonts w:ascii="Calibri" w:cs="Calibri" w:eastAsia="Calibri" w:hAnsi="Calibri"/>
-          <w:b/>
-          <w:bCs/>
-        </w:rPr>
-        <w:t xml:space="preserve">Administración de credenciales</w:t>
-      </w:r>
-      <w:r>
-        <w:rPr>
-          <w:rFonts w:ascii="Calibri" w:cs="Calibri" w:eastAsia="Calibri" w:hAnsi="Calibri"/>
-        </w:rPr>
-        <w:t xml:space="preserve">: marca </w:t>
-      </w:r>
-      <w:r>
-        <w:rPr>
-          <w:rFonts w:ascii="Calibri" w:cs="Calibri" w:eastAsia="Calibri" w:hAnsi="Calibri"/>
-          <w:b/>
-          <w:bCs/>
-        </w:rPr>
-        <w:t xml:space="preserve">Autoadministrado</w:t>
-      </w:r>
-      <w:r>
-        <w:rPr>
-          <w:rFonts w:ascii="Calibri" w:cs="Calibri" w:eastAsia="Calibri" w:hAnsi="Calibri"/>
-        </w:rPr>
-        <w:t xml:space="preserve"> (no </w:t>
-      </w:r>
-      <w:r>
-        <w:rPr>
-          <w:rFonts w:ascii="Calibri" w:cs="Calibri" w:eastAsia="Calibri" w:hAnsi="Calibri"/>
-          <w:i/>
-          <w:iCs/>
-        </w:rPr>
-        <w:t xml:space="preserve">Administrado en AWS Secrets Manager</w:t>
-      </w:r>
-      <w:r>
-        <w:rPr>
-          <w:rFonts w:ascii="Calibri" w:cs="Calibri" w:eastAsia="Calibri" w:hAnsi="Calibri"/>
-        </w:rPr>
-        <w:t xml:space="preserve">, que cobra aparte).</w:t>
-      </w:r>
-    </w:p>
-    <w:p>
-      <w:pPr>
-        <w:pStyle w:val="ListParagraph"/>
-        <w:numPr>
-          <w:ilvl w:val="0"/>
-          <w:numId w:val="19"/>
-        </w:numPr>
-        <w:spacing w:after="70" w:line="276"/>
-      </w:pPr>
-      <w:r>
-        <w:rPr>
-          <w:rFonts w:ascii="Calibri" w:cs="Calibri" w:eastAsia="Calibri" w:hAnsi="Calibri"/>
-        </w:rPr>
-        <w:t xml:space="preserve">En </w:t>
-      </w:r>
-      <w:r>
-        <w:rPr>
-          <w:rFonts w:ascii="Calibri" w:cs="Calibri" w:eastAsia="Calibri" w:hAnsi="Calibri"/>
-          <w:b/>
-          <w:bCs/>
-        </w:rPr>
-        <w:t xml:space="preserve">Contraseña maestra</w:t>
-      </w:r>
-      <w:r>
-        <w:rPr>
-          <w:rFonts w:ascii="Calibri" w:cs="Calibri" w:eastAsia="Calibri" w:hAnsi="Calibri"/>
-        </w:rPr>
-        <w:t xml:space="preserve"> escribe una clave (ejemplo </w:t>
-      </w:r>
-      <w:r>
-        <w:rPr>
-          <w:rFonts w:ascii="Consolas" w:cs="Consolas" w:eastAsia="Consolas" w:hAnsi="Consolas"/>
-          <w:color w:val="9F1239"/>
-          <w:sz w:val="20"/>
-          <w:szCs w:val="20"/>
-          <w:shd w:fill="F3F4F6" w:color="auto" w:val="clear"/>
-        </w:rPr>
-        <w:t xml:space="preserve">TuClaveSegura2026</w:t>
-      </w:r>
-      <w:r>
-        <w:rPr>
-          <w:rFonts w:ascii="Calibri" w:cs="Calibri" w:eastAsia="Calibri" w:hAnsi="Calibri"/>
-        </w:rPr>
-        <w:t xml:space="preserve">) y repítela en </w:t>
-      </w:r>
-      <w:r>
-        <w:rPr>
-          <w:rFonts w:ascii="Calibri" w:cs="Calibri" w:eastAsia="Calibri" w:hAnsi="Calibri"/>
-          <w:b/>
-          <w:bCs/>
-        </w:rPr>
-        <w:t xml:space="preserve">Confirmar contraseña maestra</w:t>
-      </w:r>
-      <w:r>
-        <w:rPr>
-          <w:rFonts w:ascii="Calibri" w:cs="Calibri" w:eastAsia="Calibri" w:hAnsi="Calibri"/>
-        </w:rPr>
-        <w:t xml:space="preserve">. </w:t>
-      </w:r>
-      <w:r>
-        <w:rPr>
-          <w:rFonts w:ascii="Calibri" w:cs="Calibri" w:eastAsia="Calibri" w:hAnsi="Calibri"/>
-          <w:b/>
-          <w:bCs/>
-        </w:rPr>
-        <w:t xml:space="preserve">Anótala en la hoja de datos.</w:t>
-      </w:r>
-      <w:r>
-        <w:rPr>
-          <w:rFonts w:ascii="Calibri" w:cs="Calibri" w:eastAsia="Calibri" w:hAnsi="Calibri"/>
-        </w:rPr>
-        <w:t xml:space="preserve"> Usa solo letras y números.</w:t>
-      </w:r>
-    </w:p>
-    <w:p>
-      <w:pPr>
-        <w:pStyle w:val="ListParagraph"/>
-        <w:numPr>
-          <w:ilvl w:val="0"/>
-          <w:numId w:val="19"/>
-        </w:numPr>
-        <w:spacing w:after="70" w:line="276"/>
-      </w:pPr>
-      <w:r>
-        <w:rPr>
-          <w:rFonts w:ascii="Calibri" w:cs="Calibri" w:eastAsia="Calibri" w:hAnsi="Calibri"/>
-          <w:b/>
-          <w:bCs/>
-        </w:rPr>
-        <w:t xml:space="preserve">Opciones de autenticación de bases de datos</w:t>
-      </w:r>
-      <w:r>
-        <w:rPr>
-          <w:rFonts w:ascii="Calibri" w:cs="Calibri" w:eastAsia="Calibri" w:hAnsi="Calibri"/>
-        </w:rPr>
-        <w:t xml:space="preserve">: deja </w:t>
-      </w:r>
-      <w:r>
-        <w:rPr>
-          <w:rFonts w:ascii="Calibri" w:cs="Calibri" w:eastAsia="Calibri" w:hAnsi="Calibri"/>
-          <w:b/>
-          <w:bCs/>
-        </w:rPr>
-        <w:t xml:space="preserve">Autenticación con contraseña</w:t>
-      </w:r>
-      <w:r>
-        <w:rPr>
-          <w:rFonts w:ascii="Calibri" w:cs="Calibri" w:eastAsia="Calibri" w:hAnsi="Calibri"/>
-        </w:rPr>
-        <w:t xml:space="preserve">.</w:t>
-      </w:r>
-    </w:p>
-    <w:p>
-      <w:pPr>
-        <w:pStyle w:val="ListParagraph"/>
-        <w:numPr>
-          <w:ilvl w:val="0"/>
-          <w:numId w:val="19"/>
-        </w:numPr>
-        <w:spacing w:after="70" w:line="276"/>
-      </w:pPr>
-      <w:r>
-        <w:rPr>
-          <w:rFonts w:ascii="Calibri" w:cs="Calibri" w:eastAsia="Calibri" w:hAnsi="Calibri"/>
-          <w:b/>
-          <w:bCs/>
-        </w:rPr>
-        <w:t xml:space="preserve">Configuración de la instancia</w:t>
-      </w:r>
-      <w:r>
-        <w:rPr>
-          <w:rFonts w:ascii="Calibri" w:cs="Calibri" w:eastAsia="Calibri" w:hAnsi="Calibri"/>
-        </w:rPr>
-        <w:t xml:space="preserve"> ➔ </w:t>
-      </w:r>
-      <w:r>
-        <w:rPr>
-          <w:rFonts w:ascii="Calibri" w:cs="Calibri" w:eastAsia="Calibri" w:hAnsi="Calibri"/>
-          <w:b/>
-          <w:bCs/>
-        </w:rPr>
-        <w:t xml:space="preserve">Clase de instancia de base de datos</w:t>
-      </w:r>
-      <w:r>
-        <w:rPr>
-          <w:rFonts w:ascii="Calibri" w:cs="Calibri" w:eastAsia="Calibri" w:hAnsi="Calibri"/>
-        </w:rPr>
-        <w:t xml:space="preserve">: marca </w:t>
-      </w:r>
-      <w:r>
-        <w:rPr>
-          <w:rFonts w:ascii="Calibri" w:cs="Calibri" w:eastAsia="Calibri" w:hAnsi="Calibri"/>
-          <w:b/>
-          <w:bCs/>
-        </w:rPr>
-        <w:t xml:space="preserve">Clases ampliables (incluye clases t)</w:t>
-      </w:r>
-      <w:r>
-        <w:rPr>
-          <w:rFonts w:ascii="Calibri" w:cs="Calibri" w:eastAsia="Calibri" w:hAnsi="Calibri"/>
-        </w:rPr>
-        <w:t xml:space="preserve">. Si solo ves </w:t>
-      </w:r>
-      <w:r>
-        <w:rPr>
-          <w:rFonts w:ascii="Calibri" w:cs="Calibri" w:eastAsia="Calibri" w:hAnsi="Calibri"/>
-          <w:i/>
-          <w:iCs/>
-        </w:rPr>
-        <w:t xml:space="preserve">Clases estándar (incluye clases m)</w:t>
-      </w:r>
-      <w:r>
-        <w:rPr>
-          <w:rFonts w:ascii="Calibri" w:cs="Calibri" w:eastAsia="Calibri" w:hAnsi="Calibri"/>
-        </w:rPr>
-        <w:t xml:space="preserve"> sin la opción de clases t, regresa y confirma que la plantilla sea </w:t>
-      </w:r>
-      <w:r>
-        <w:rPr>
-          <w:rFonts w:ascii="Calibri" w:cs="Calibri" w:eastAsia="Calibri" w:hAnsi="Calibri"/>
-          <w:i/>
-          <w:iCs/>
-        </w:rPr>
-        <w:t xml:space="preserve">Entorno de pruebas</w:t>
-      </w:r>
-      <w:r>
-        <w:rPr>
-          <w:rFonts w:ascii="Calibri" w:cs="Calibri" w:eastAsia="Calibri" w:hAnsi="Calibri"/>
-        </w:rPr>
-        <w:t xml:space="preserve">.</w:t>
-      </w:r>
-    </w:p>
-    <w:p>
-      <w:pPr>
-        <w:pStyle w:val="ListParagraph"/>
-        <w:numPr>
-          <w:ilvl w:val="0"/>
-          <w:numId w:val="19"/>
-        </w:numPr>
-        <w:spacing w:after="70" w:line="276"/>
-      </w:pPr>
-      <w:r>
-        <w:rPr>
-          <w:rFonts w:ascii="Calibri" w:cs="Calibri" w:eastAsia="Calibri" w:hAnsi="Calibri"/>
-        </w:rPr>
-        <w:t xml:space="preserve">En </w:t>
-      </w:r>
-      <w:r>
-        <w:rPr>
-          <w:rFonts w:ascii="Calibri" w:cs="Calibri" w:eastAsia="Calibri" w:hAnsi="Calibri"/>
-          <w:b/>
-          <w:bCs/>
-        </w:rPr>
-        <w:t xml:space="preserve">Tipo de instancia</w:t>
-      </w:r>
-      <w:r>
-        <w:rPr>
-          <w:rFonts w:ascii="Calibri" w:cs="Calibri" w:eastAsia="Calibri" w:hAnsi="Calibri"/>
-        </w:rPr>
-        <w:t xml:space="preserve"> elige </w:t>
-      </w:r>
-      <w:r>
-        <w:rPr>
-          <w:rFonts w:ascii="Consolas" w:cs="Consolas" w:eastAsia="Consolas" w:hAnsi="Consolas"/>
-          <w:color w:val="9F1239"/>
-          <w:sz w:val="20"/>
-          <w:szCs w:val="20"/>
-          <w:shd w:fill="F3F4F6" w:color="auto" w:val="clear"/>
-        </w:rPr>
-        <w:t xml:space="preserve">db.t3.micro</w:t>
-      </w:r>
-      <w:r>
-        <w:rPr>
-          <w:rFonts w:ascii="Calibri" w:cs="Calibri" w:eastAsia="Calibri" w:hAnsi="Calibri"/>
-        </w:rPr>
-        <w:t xml:space="preserve"> o </w:t>
-      </w:r>
-      <w:r>
-        <w:rPr>
-          <w:rFonts w:ascii="Consolas" w:cs="Consolas" w:eastAsia="Consolas" w:hAnsi="Consolas"/>
-          <w:color w:val="9F1239"/>
-          <w:sz w:val="20"/>
-          <w:szCs w:val="20"/>
-          <w:shd w:fill="F3F4F6" w:color="auto" w:val="clear"/>
-        </w:rPr>
-        <w:t xml:space="preserve">db.t4g.micro</w:t>
-      </w:r>
-      <w:r>
-        <w:rPr>
-          <w:rFonts w:ascii="Calibri" w:cs="Calibri" w:eastAsia="Calibri" w:hAnsi="Calibri"/>
-        </w:rPr>
-        <w:t xml:space="preserve">. Si no aparece ninguna </w:t>
-      </w:r>
-      <w:r>
-        <w:rPr>
-          <w:rFonts w:ascii="Consolas" w:cs="Consolas" w:eastAsia="Consolas" w:hAnsi="Consolas"/>
-          <w:color w:val="9F1239"/>
-          <w:sz w:val="20"/>
-          <w:szCs w:val="20"/>
-          <w:shd w:fill="F3F4F6" w:color="auto" w:val="clear"/>
-        </w:rPr>
-        <w:t xml:space="preserve">micro</w:t>
-      </w:r>
-      <w:r>
-        <w:rPr>
-          <w:rFonts w:ascii="Calibri" w:cs="Calibri" w:eastAsia="Calibri" w:hAnsi="Calibri"/>
-        </w:rPr>
-        <w:t xml:space="preserve">, elige </w:t>
-      </w:r>
-      <w:r>
-        <w:rPr>
-          <w:rFonts w:ascii="Consolas" w:cs="Consolas" w:eastAsia="Consolas" w:hAnsi="Consolas"/>
-          <w:color w:val="9F1239"/>
-          <w:sz w:val="20"/>
-          <w:szCs w:val="20"/>
-          <w:shd w:fill="F3F4F6" w:color="auto" w:val="clear"/>
-        </w:rPr>
-        <w:t xml:space="preserve">db.t3.small</w:t>
-      </w:r>
-      <w:r>
-        <w:rPr>
-          <w:rFonts w:ascii="Calibri" w:cs="Calibri" w:eastAsia="Calibri" w:hAnsi="Calibri"/>
-        </w:rPr>
-        <w:t xml:space="preserve">.</w:t>
-      </w:r>
-    </w:p>
-    <w:p>
-      <w:pPr>
-        <w:pStyle w:val="ListParagraph"/>
-        <w:numPr>
-          <w:ilvl w:val="0"/>
-          <w:numId w:val="19"/>
-        </w:numPr>
-        <w:spacing w:after="70" w:line="276"/>
-      </w:pPr>
-      <w:r>
-        <w:rPr>
-          <w:rFonts w:ascii="Calibri" w:cs="Calibri" w:eastAsia="Calibri" w:hAnsi="Calibri"/>
-          <w:b/>
-          <w:bCs/>
-        </w:rPr>
-        <w:t xml:space="preserve">Almacenamiento</w:t>
-      </w:r>
-      <w:r>
-        <w:rPr>
-          <w:rFonts w:ascii="Calibri" w:cs="Calibri" w:eastAsia="Calibri" w:hAnsi="Calibri"/>
-        </w:rPr>
-        <w:t xml:space="preserve"> ➔ </w:t>
-      </w:r>
-      <w:r>
-        <w:rPr>
-          <w:rFonts w:ascii="Calibri" w:cs="Calibri" w:eastAsia="Calibri" w:hAnsi="Calibri"/>
-          <w:b/>
-          <w:bCs/>
-        </w:rPr>
-        <w:t xml:space="preserve">Tipo de almacenamiento</w:t>
-      </w:r>
-      <w:r>
-        <w:rPr>
-          <w:rFonts w:ascii="Calibri" w:cs="Calibri" w:eastAsia="Calibri" w:hAnsi="Calibri"/>
-        </w:rPr>
-        <w:t xml:space="preserve">: elige </w:t>
-      </w:r>
-      <w:r>
-        <w:rPr>
-          <w:rFonts w:ascii="Calibri" w:cs="Calibri" w:eastAsia="Calibri" w:hAnsi="Calibri"/>
-          <w:b/>
-          <w:bCs/>
-        </w:rPr>
-        <w:t xml:space="preserve">SSD de uso general (gp3)</w:t>
-      </w:r>
-      <w:r>
-        <w:rPr>
-          <w:rFonts w:ascii="Calibri" w:cs="Calibri" w:eastAsia="Calibri" w:hAnsi="Calibri"/>
-        </w:rPr>
-        <w:t xml:space="preserve">. </w:t>
-      </w:r>
-      <w:r>
-        <w:rPr>
-          <w:rFonts w:ascii="Calibri" w:cs="Calibri" w:eastAsia="Calibri" w:hAnsi="Calibri"/>
-          <w:b/>
-          <w:bCs/>
-        </w:rPr>
-        <w:t xml:space="preserve">No</w:t>
-      </w:r>
-      <w:r>
-        <w:rPr>
-          <w:rFonts w:ascii="Calibri" w:cs="Calibri" w:eastAsia="Calibri" w:hAnsi="Calibri"/>
-        </w:rPr>
-        <w:t xml:space="preserve"> dejes </w:t>
-      </w:r>
-      <w:r>
-        <w:rPr>
-          <w:rFonts w:ascii="Calibri" w:cs="Calibri" w:eastAsia="Calibri" w:hAnsi="Calibri"/>
-          <w:i/>
-          <w:iCs/>
-        </w:rPr>
-        <w:t xml:space="preserve">SSD de IOPS provisionadas (io2)</w:t>
-      </w:r>
-      <w:r>
-        <w:rPr>
-          <w:rFonts w:ascii="Calibri" w:cs="Calibri" w:eastAsia="Calibri" w:hAnsi="Calibri"/>
-        </w:rPr>
-        <w:t xml:space="preserve">: pide mínimo 100 GiB y 1.000 IOPS y es la causa de los 1.477 USD.</w:t>
-      </w:r>
-    </w:p>
-    <w:p>
-      <w:pPr>
-        <w:pStyle w:val="ListParagraph"/>
-        <w:numPr>
-          <w:ilvl w:val="0"/>
-          <w:numId w:val="19"/>
-        </w:numPr>
-        <w:spacing w:after="70" w:line="276"/>
-      </w:pPr>
-      <w:r>
-        <w:rPr>
-          <w:rFonts w:ascii="Calibri" w:cs="Calibri" w:eastAsia="Calibri" w:hAnsi="Calibri"/>
-          <w:b/>
-          <w:bCs/>
-        </w:rPr>
-        <w:t xml:space="preserve">Almacenamiento asignado</w:t>
-      </w:r>
-      <w:r>
-        <w:rPr>
-          <w:rFonts w:ascii="Calibri" w:cs="Calibri" w:eastAsia="Calibri" w:hAnsi="Calibri"/>
-        </w:rPr>
-        <w:t xml:space="preserve">: escribe </w:t>
-      </w:r>
-      <w:r>
-        <w:rPr>
-          <w:rFonts w:ascii="Consolas" w:cs="Consolas" w:eastAsia="Consolas" w:hAnsi="Consolas"/>
-          <w:color w:val="9F1239"/>
-          <w:sz w:val="20"/>
-          <w:szCs w:val="20"/>
-          <w:shd w:fill="F3F4F6" w:color="auto" w:val="clear"/>
-        </w:rPr>
-        <w:t xml:space="preserve">20</w:t>
-      </w:r>
-      <w:r>
-        <w:rPr>
-          <w:rFonts w:ascii="Calibri" w:cs="Calibri" w:eastAsia="Calibri" w:hAnsi="Calibri"/>
-        </w:rPr>
-        <w:t xml:space="preserve"> (GiB).</w:t>
-      </w:r>
-    </w:p>
-    <w:p>
-      <w:pPr>
-        <w:pStyle w:val="ListParagraph"/>
-        <w:numPr>
-          <w:ilvl w:val="0"/>
-          <w:numId w:val="19"/>
-        </w:numPr>
-        <w:spacing w:after="70" w:line="276"/>
-      </w:pPr>
-      <w:r>
-        <w:rPr>
-          <w:rFonts w:ascii="Calibri" w:cs="Calibri" w:eastAsia="Calibri" w:hAnsi="Calibri"/>
-        </w:rPr>
-        <w:t xml:space="preserve">Despliega </w:t>
-      </w:r>
-      <w:r>
-        <w:rPr>
-          <w:rFonts w:ascii="Calibri" w:cs="Calibri" w:eastAsia="Calibri" w:hAnsi="Calibri"/>
-          <w:b/>
-          <w:bCs/>
-        </w:rPr>
-        <w:t xml:space="preserve">Configuración de almacenamiento adicional</w:t>
-      </w:r>
-      <w:r>
-        <w:rPr>
-          <w:rFonts w:ascii="Calibri" w:cs="Calibri" w:eastAsia="Calibri" w:hAnsi="Calibri"/>
-        </w:rPr>
-        <w:t xml:space="preserve"> y </w:t>
-      </w:r>
-      <w:r>
-        <w:rPr>
-          <w:rFonts w:ascii="Calibri" w:cs="Calibri" w:eastAsia="Calibri" w:hAnsi="Calibri"/>
-          <w:b/>
-          <w:bCs/>
-        </w:rPr>
-        <w:t xml:space="preserve">desmarca</w:t>
-      </w:r>
-      <w:r>
-        <w:rPr>
-          <w:rFonts w:ascii="Calibri" w:cs="Calibri" w:eastAsia="Calibri" w:hAnsi="Calibri"/>
-        </w:rPr>
-        <w:t xml:space="preserve"> </w:t>
-      </w:r>
-      <w:r>
-        <w:rPr>
-          <w:rFonts w:ascii="Calibri" w:cs="Calibri" w:eastAsia="Calibri" w:hAnsi="Calibri"/>
-          <w:i/>
-          <w:iCs/>
-        </w:rPr>
-        <w:t xml:space="preserve">Habilitar el escalado automático del almacenamiento</w:t>
-      </w:r>
-      <w:r>
-        <w:rPr>
-          <w:rFonts w:ascii="Calibri" w:cs="Calibri" w:eastAsia="Calibri" w:hAnsi="Calibri"/>
-        </w:rPr>
-        <w:t xml:space="preserve">.</w:t>
-      </w:r>
-    </w:p>
-    <w:p>
-      <w:pPr>
-        <w:pStyle w:val="ListParagraph"/>
-        <w:numPr>
-          <w:ilvl w:val="0"/>
-          <w:numId w:val="19"/>
-        </w:numPr>
-        <w:spacing w:after="70" w:line="276"/>
-      </w:pPr>
-      <w:r>
-        <w:rPr>
-          <w:rFonts w:ascii="Calibri" w:cs="Calibri" w:eastAsia="Calibri" w:hAnsi="Calibri"/>
-          <w:b/>
-          <w:bCs/>
-        </w:rPr>
-        <w:t xml:space="preserve">Conectividad</w:t>
-      </w:r>
-      <w:r>
-        <w:rPr>
-          <w:rFonts w:ascii="Calibri" w:cs="Calibri" w:eastAsia="Calibri" w:hAnsi="Calibri"/>
-        </w:rPr>
-        <w:t xml:space="preserve"> ➔ </w:t>
-      </w:r>
-      <w:r>
-        <w:rPr>
-          <w:rFonts w:ascii="Calibri" w:cs="Calibri" w:eastAsia="Calibri" w:hAnsi="Calibri"/>
-          <w:b/>
-          <w:bCs/>
-        </w:rPr>
-        <w:t xml:space="preserve">Recurso de computación</w:t>
-      </w:r>
-      <w:r>
-        <w:rPr>
-          <w:rFonts w:ascii="Calibri" w:cs="Calibri" w:eastAsia="Calibri" w:hAnsi="Calibri"/>
-        </w:rPr>
-        <w:t xml:space="preserve">: marca </w:t>
-      </w:r>
-      <w:r>
-        <w:rPr>
-          <w:rFonts w:ascii="Calibri" w:cs="Calibri" w:eastAsia="Calibri" w:hAnsi="Calibri"/>
-          <w:b/>
-          <w:bCs/>
-        </w:rPr>
-        <w:t xml:space="preserve">No se conecte a un recurso informático EC2</w:t>
-      </w:r>
-      <w:r>
-        <w:rPr>
-          <w:rFonts w:ascii="Calibri" w:cs="Calibri" w:eastAsia="Calibri" w:hAnsi="Calibri"/>
-        </w:rPr>
-        <w:t xml:space="preserve">.</w:t>
-      </w:r>
-    </w:p>
-    <w:p>
-      <w:pPr>
-        <w:pStyle w:val="ListParagraph"/>
-        <w:numPr>
-          <w:ilvl w:val="0"/>
-          <w:numId w:val="19"/>
-        </w:numPr>
-        <w:spacing w:after="70" w:line="276"/>
-      </w:pPr>
-      <w:r>
-        <w:rPr>
-          <w:rFonts w:ascii="Calibri" w:cs="Calibri" w:eastAsia="Calibri" w:hAnsi="Calibri"/>
-          <w:b/>
-          <w:bCs/>
-        </w:rPr>
-        <w:t xml:space="preserve">Nube privada virtual (VPC)</w:t>
-      </w:r>
-      <w:r>
-        <w:rPr>
-          <w:rFonts w:ascii="Calibri" w:cs="Calibri" w:eastAsia="Calibri" w:hAnsi="Calibri"/>
-        </w:rPr>
-        <w:t xml:space="preserve">: deja </w:t>
-      </w:r>
-      <w:r>
-        <w:rPr>
-          <w:rFonts w:ascii="Calibri" w:cs="Calibri" w:eastAsia="Calibri" w:hAnsi="Calibri"/>
-          <w:b/>
-          <w:bCs/>
-        </w:rPr>
-        <w:t xml:space="preserve">Default VPC</w:t>
-      </w:r>
-      <w:r>
-        <w:rPr>
-          <w:rFonts w:ascii="Calibri" w:cs="Calibri" w:eastAsia="Calibri" w:hAnsi="Calibri"/>
-        </w:rPr>
-        <w:t xml:space="preserve">. </w:t>
-      </w:r>
-      <w:r>
-        <w:rPr>
-          <w:rFonts w:ascii="Calibri" w:cs="Calibri" w:eastAsia="Calibri" w:hAnsi="Calibri"/>
-          <w:b/>
-          <w:bCs/>
-        </w:rPr>
-        <w:t xml:space="preserve">Grupo de subredes de la base de datos</w:t>
-      </w:r>
-      <w:r>
-        <w:rPr>
-          <w:rFonts w:ascii="Calibri" w:cs="Calibri" w:eastAsia="Calibri" w:hAnsi="Calibri"/>
-        </w:rPr>
-        <w:t xml:space="preserve">: deja el que viene (</w:t>
-      </w:r>
-      <w:r>
-        <w:rPr>
-          <w:rFonts w:ascii="Consolas" w:cs="Consolas" w:eastAsia="Consolas" w:hAnsi="Consolas"/>
-          <w:color w:val="9F1239"/>
-          <w:sz w:val="20"/>
-          <w:szCs w:val="20"/>
-          <w:shd w:fill="F3F4F6" w:color="auto" w:val="clear"/>
-        </w:rPr>
-        <w:t xml:space="preserve">default-vpc-...</w:t>
-      </w:r>
-      <w:r>
-        <w:rPr>
-          <w:rFonts w:ascii="Calibri" w:cs="Calibri" w:eastAsia="Calibri" w:hAnsi="Calibri"/>
-        </w:rPr>
-        <w:t xml:space="preserve">).</w:t>
-      </w:r>
-    </w:p>
-    <w:p>
-      <w:pPr>
-        <w:pStyle w:val="ListParagraph"/>
-        <w:numPr>
-          <w:ilvl w:val="0"/>
-          <w:numId w:val="19"/>
-        </w:numPr>
-        <w:spacing w:after="70" w:line="276"/>
-      </w:pPr>
-      <w:r>
-        <w:rPr>
-          <w:rFonts w:ascii="Calibri" w:cs="Calibri" w:eastAsia="Calibri" w:hAnsi="Calibri"/>
-          <w:b/>
-          <w:bCs/>
-        </w:rPr>
-        <w:t xml:space="preserve">Acceso público</w:t>
-      </w:r>
-      <w:r>
-        <w:rPr>
-          <w:rFonts w:ascii="Calibri" w:cs="Calibri" w:eastAsia="Calibri" w:hAnsi="Calibri"/>
-        </w:rPr>
-        <w:t xml:space="preserve">: marca </w:t>
-      </w:r>
-      <w:r>
-        <w:rPr>
-          <w:rFonts w:ascii="Calibri" w:cs="Calibri" w:eastAsia="Calibri" w:hAnsi="Calibri"/>
-          <w:b/>
-          <w:bCs/>
-        </w:rPr>
-        <w:t xml:space="preserve">No</w:t>
-      </w:r>
-      <w:r>
-        <w:rPr>
-          <w:rFonts w:ascii="Calibri" w:cs="Calibri" w:eastAsia="Calibri" w:hAnsi="Calibri"/>
-        </w:rPr>
-        <w:t xml:space="preserve">.</w:t>
-      </w:r>
-    </w:p>
-    <w:p>
-      <w:pPr>
-        <w:pStyle w:val="ListParagraph"/>
-        <w:numPr>
-          <w:ilvl w:val="0"/>
-          <w:numId w:val="19"/>
-        </w:numPr>
-        <w:spacing w:after="70" w:line="276"/>
-      </w:pPr>
-      <w:r>
-        <w:rPr>
-          <w:rFonts w:ascii="Calibri" w:cs="Calibri" w:eastAsia="Calibri" w:hAnsi="Calibri"/>
-          <w:b/>
-          <w:bCs/>
-        </w:rPr>
-        <w:t xml:space="preserve">Grupo de seguridad de VPC (firewall)</w:t>
-      </w:r>
-      <w:r>
-        <w:rPr>
-          <w:rFonts w:ascii="Calibri" w:cs="Calibri" w:eastAsia="Calibri" w:hAnsi="Calibri"/>
-        </w:rPr>
-        <w:t xml:space="preserve">: marca </w:t>
-      </w:r>
-      <w:r>
-        <w:rPr>
-          <w:rFonts w:ascii="Calibri" w:cs="Calibri" w:eastAsia="Calibri" w:hAnsi="Calibri"/>
-          <w:b/>
-          <w:bCs/>
-        </w:rPr>
-        <w:t xml:space="preserve">Elegir existente</w:t>
-      </w:r>
-      <w:r>
-        <w:rPr>
-          <w:rFonts w:ascii="Calibri" w:cs="Calibri" w:eastAsia="Calibri" w:hAnsi="Calibri"/>
-        </w:rPr>
-        <w:t xml:space="preserve">. En </w:t>
-      </w:r>
-      <w:r>
-        <w:rPr>
-          <w:rFonts w:ascii="Calibri" w:cs="Calibri" w:eastAsia="Calibri" w:hAnsi="Calibri"/>
-          <w:b/>
-          <w:bCs/>
-        </w:rPr>
-        <w:t xml:space="preserve">Grupos de seguridad de VPC existentes</w:t>
-      </w:r>
-      <w:r>
-        <w:rPr>
-          <w:rFonts w:ascii="Calibri" w:cs="Calibri" w:eastAsia="Calibri" w:hAnsi="Calibri"/>
-        </w:rPr>
-        <w:t xml:space="preserve"> quita </w:t>
-      </w:r>
-      <w:r>
-        <w:rPr>
-          <w:rFonts w:ascii="Consolas" w:cs="Consolas" w:eastAsia="Consolas" w:hAnsi="Consolas"/>
-          <w:color w:val="9F1239"/>
-          <w:sz w:val="20"/>
-          <w:szCs w:val="20"/>
-          <w:shd w:fill="F3F4F6" w:color="auto" w:val="clear"/>
-        </w:rPr>
-        <w:t xml:space="preserve">default</w:t>
-      </w:r>
-      <w:r>
-        <w:rPr>
-          <w:rFonts w:ascii="Calibri" w:cs="Calibri" w:eastAsia="Calibri" w:hAnsi="Calibri"/>
-        </w:rPr>
-        <w:t xml:space="preserve"> (clic en la X) y agrega </w:t>
-      </w:r>
-      <w:r>
-        <w:rPr>
-          <w:rFonts w:ascii="Calibri" w:cs="Calibri" w:eastAsia="Calibri" w:hAnsi="Calibri"/>
-          <w:b/>
-          <w:bCs/>
-        </w:rPr>
-        <w:t xml:space="preserve">`rds-postgres-sg`</w:t>
-      </w:r>
-      <w:r>
-        <w:rPr>
-          <w:rFonts w:ascii="Calibri" w:cs="Calibri" w:eastAsia="Calibri" w:hAnsi="Calibri"/>
-        </w:rPr>
-        <w:t xml:space="preserve">.</w:t>
-      </w:r>
-    </w:p>
-    <w:p>
-      <w:pPr>
-        <w:pStyle w:val="ListParagraph"/>
-        <w:numPr>
-          <w:ilvl w:val="0"/>
-          <w:numId w:val="19"/>
-        </w:numPr>
-        <w:spacing w:after="70" w:line="276"/>
-      </w:pPr>
-      <w:r>
-        <w:rPr>
-          <w:rFonts w:ascii="Calibri" w:cs="Calibri" w:eastAsia="Calibri" w:hAnsi="Calibri"/>
-          <w:b/>
-          <w:bCs/>
-        </w:rPr>
-        <w:t xml:space="preserve">Proxy de RDS</w:t>
-      </w:r>
-      <w:r>
-        <w:rPr>
-          <w:rFonts w:ascii="Calibri" w:cs="Calibri" w:eastAsia="Calibri" w:hAnsi="Calibri"/>
-        </w:rPr>
-        <w:t xml:space="preserve">: déjalo </w:t>
-      </w:r>
-      <w:r>
-        <w:rPr>
-          <w:rFonts w:ascii="Calibri" w:cs="Calibri" w:eastAsia="Calibri" w:hAnsi="Calibri"/>
-          <w:b/>
-          <w:bCs/>
-        </w:rPr>
-        <w:t xml:space="preserve">sin marcar</w:t>
-      </w:r>
-      <w:r>
-        <w:rPr>
-          <w:rFonts w:ascii="Calibri" w:cs="Calibri" w:eastAsia="Calibri" w:hAnsi="Calibri"/>
-        </w:rPr>
-        <w:t xml:space="preserve"> (tiene costo adicional). </w:t>
-      </w:r>
-      <w:r>
-        <w:rPr>
-          <w:rFonts w:ascii="Calibri" w:cs="Calibri" w:eastAsia="Calibri" w:hAnsi="Calibri"/>
-          <w:b/>
-          <w:bCs/>
-        </w:rPr>
-        <w:t xml:space="preserve">Entidad de certificación</w:t>
-      </w:r>
-      <w:r>
-        <w:rPr>
-          <w:rFonts w:ascii="Calibri" w:cs="Calibri" w:eastAsia="Calibri" w:hAnsi="Calibri"/>
-        </w:rPr>
-        <w:t xml:space="preserve">: deja el valor predeterminado.</w:t>
-      </w:r>
-    </w:p>
-    <w:p>
-      <w:pPr>
-        <w:pStyle w:val="ListParagraph"/>
-        <w:numPr>
-          <w:ilvl w:val="0"/>
-          <w:numId w:val="19"/>
-        </w:numPr>
-        <w:spacing w:after="70" w:line="276"/>
-      </w:pPr>
-      <w:r>
-        <w:rPr>
-          <w:rFonts w:ascii="Calibri" w:cs="Calibri" w:eastAsia="Calibri" w:hAnsi="Calibri"/>
-          <w:b/>
-          <w:bCs/>
-        </w:rPr>
-        <w:t xml:space="preserve">Supervisión</w:t>
-      </w:r>
-      <w:r>
-        <w:rPr>
-          <w:rFonts w:ascii="Calibri" w:cs="Calibri" w:eastAsia="Calibri" w:hAnsi="Calibri"/>
-        </w:rPr>
-        <w:t xml:space="preserve">: elige </w:t>
-      </w:r>
-      <w:r>
-        <w:rPr>
-          <w:rFonts w:ascii="Calibri" w:cs="Calibri" w:eastAsia="Calibri" w:hAnsi="Calibri"/>
-          <w:b/>
-          <w:bCs/>
-        </w:rPr>
-        <w:t xml:space="preserve">Database Insights: estándar</w:t>
-      </w:r>
-      <w:r>
-        <w:rPr>
-          <w:rFonts w:ascii="Calibri" w:cs="Calibri" w:eastAsia="Calibri" w:hAnsi="Calibri"/>
-        </w:rPr>
-        <w:t xml:space="preserve"> (no </w:t>
-      </w:r>
-      <w:r>
-        <w:rPr>
-          <w:rFonts w:ascii="Calibri" w:cs="Calibri" w:eastAsia="Calibri" w:hAnsi="Calibri"/>
-          <w:i/>
-          <w:iCs/>
-        </w:rPr>
-        <w:t xml:space="preserve">avanzado</w:t>
-      </w:r>
-      <w:r>
-        <w:rPr>
-          <w:rFonts w:ascii="Calibri" w:cs="Calibri" w:eastAsia="Calibri" w:hAnsi="Calibri"/>
-        </w:rPr>
-        <w:t xml:space="preserve">). Más abajo, en </w:t>
-      </w:r>
-      <w:r>
-        <w:rPr>
-          <w:rFonts w:ascii="Calibri" w:cs="Calibri" w:eastAsia="Calibri" w:hAnsi="Calibri"/>
-          <w:i/>
-          <w:iCs/>
-        </w:rPr>
-        <w:t xml:space="preserve">Ajustes de monitorización adicional</w:t>
-      </w:r>
-      <w:r>
-        <w:rPr>
-          <w:rFonts w:ascii="Calibri" w:cs="Calibri" w:eastAsia="Calibri" w:hAnsi="Calibri"/>
-        </w:rPr>
-        <w:t xml:space="preserve">, deja </w:t>
-      </w:r>
-      <w:r>
-        <w:rPr>
-          <w:rFonts w:ascii="Calibri" w:cs="Calibri" w:eastAsia="Calibri" w:hAnsi="Calibri"/>
-          <w:b/>
-          <w:bCs/>
-        </w:rPr>
-        <w:t xml:space="preserve">sin marcar</w:t>
-      </w:r>
-      <w:r>
-        <w:rPr>
-          <w:rFonts w:ascii="Calibri" w:cs="Calibri" w:eastAsia="Calibri" w:hAnsi="Calibri"/>
-        </w:rPr>
-        <w:t xml:space="preserve"> </w:t>
-      </w:r>
-      <w:r>
-        <w:rPr>
-          <w:rFonts w:ascii="Calibri" w:cs="Calibri" w:eastAsia="Calibri" w:hAnsi="Calibri"/>
-          <w:i/>
-          <w:iCs/>
-        </w:rPr>
-        <w:t xml:space="preserve">Monitorización mejorada</w:t>
-      </w:r>
-      <w:r>
-        <w:rPr>
-          <w:rFonts w:ascii="Calibri" w:cs="Calibri" w:eastAsia="Calibri" w:hAnsi="Calibri"/>
-        </w:rPr>
-        <w:t xml:space="preserve">, </w:t>
-      </w:r>
-      <w:r>
-        <w:rPr>
-          <w:rFonts w:ascii="Calibri" w:cs="Calibri" w:eastAsia="Calibri" w:hAnsi="Calibri"/>
-          <w:i/>
-          <w:iCs/>
-        </w:rPr>
-        <w:t xml:space="preserve">Exportaciones de registros</w:t>
-      </w:r>
-      <w:r>
-        <w:rPr>
-          <w:rFonts w:ascii="Calibri" w:cs="Calibri" w:eastAsia="Calibri" w:hAnsi="Calibri"/>
-        </w:rPr>
-        <w:t xml:space="preserve"> y </w:t>
-      </w:r>
-      <w:r>
-        <w:rPr>
-          <w:rFonts w:ascii="Calibri" w:cs="Calibri" w:eastAsia="Calibri" w:hAnsi="Calibri"/>
-          <w:i/>
-          <w:iCs/>
-        </w:rPr>
-        <w:t xml:space="preserve">Activar DevOps Guru</w:t>
-      </w:r>
-      <w:r>
-        <w:rPr>
-          <w:rFonts w:ascii="Calibri" w:cs="Calibri" w:eastAsia="Calibri" w:hAnsi="Calibri"/>
-        </w:rPr>
-        <w:t xml:space="preserve">.</w:t>
-      </w:r>
-    </w:p>
-    <w:p>
-      <w:pPr>
-        <w:pStyle w:val="ListParagraph"/>
-        <w:numPr>
-          <w:ilvl w:val="0"/>
-          <w:numId w:val="19"/>
-        </w:numPr>
-        <w:spacing w:after="70" w:line="276"/>
-      </w:pPr>
-      <w:r>
-        <w:rPr>
-          <w:rFonts w:ascii="Calibri" w:cs="Calibri" w:eastAsia="Calibri" w:hAnsi="Calibri"/>
-        </w:rPr>
-        <w:t xml:space="preserve">Abre </w:t>
-      </w:r>
-      <w:r>
-        <w:rPr>
-          <w:rFonts w:ascii="Calibri" w:cs="Calibri" w:eastAsia="Calibri" w:hAnsi="Calibri"/>
-          <w:b/>
-          <w:bCs/>
-        </w:rPr>
-        <w:t xml:space="preserve">Configuración adicional</w:t>
-      </w:r>
-      <w:r>
-        <w:rPr>
-          <w:rFonts w:ascii="Calibri" w:cs="Calibri" w:eastAsia="Calibri" w:hAnsi="Calibri"/>
-        </w:rPr>
-        <w:t xml:space="preserve"> (la sección plegada al final de la página) y llena:</w:t>
-      </w:r>
-    </w:p>
-    <w:p>
-      <w:pPr>
-        <w:pStyle w:val="ListParagraph"/>
-        <w:numPr>
-          <w:ilvl w:val="0"/>
-          <w:numId w:val="2"/>
-        </w:numPr>
-        <w:spacing w:after="70" w:line="276"/>
-      </w:pPr>
-      <w:r>
-        <w:rPr>
-          <w:rFonts w:ascii="Calibri" w:cs="Calibri" w:eastAsia="Calibri" w:hAnsi="Calibri"/>
-          <w:b/>
-          <w:bCs/>
-        </w:rPr>
-        <w:t xml:space="preserve">Nombre de la base de datos inicial</w:t>
-      </w:r>
-      <w:r>
-        <w:rPr>
-          <w:rFonts w:ascii="Calibri" w:cs="Calibri" w:eastAsia="Calibri" w:hAnsi="Calibri"/>
-        </w:rPr>
-        <w:t xml:space="preserve">: escribe exactamente </w:t>
-      </w:r>
-      <w:r>
-        <w:rPr>
-          <w:rFonts w:ascii="Consolas" w:cs="Consolas" w:eastAsia="Consolas" w:hAnsi="Consolas"/>
-          <w:color w:val="9F1239"/>
-          <w:sz w:val="20"/>
-          <w:szCs w:val="20"/>
-          <w:shd w:fill="F3F4F6" w:color="auto" w:val="clear"/>
-        </w:rPr>
-        <w:t xml:space="preserve">tubeyou_db</w:t>
-      </w:r>
-      <w:r>
-        <w:rPr>
-          <w:rFonts w:ascii="Calibri" w:cs="Calibri" w:eastAsia="Calibri" w:hAnsi="Calibri"/>
-        </w:rPr>
-        <w:t xml:space="preserve">.</w:t>
-      </w:r>
-    </w:p>
-    <w:p>
-      <w:pPr>
-        <w:pStyle w:val="ListParagraph"/>
-        <w:numPr>
-          <w:ilvl w:val="0"/>
-          <w:numId w:val="2"/>
-        </w:numPr>
-        <w:spacing w:after="70" w:line="276"/>
-      </w:pPr>
-      <w:r>
-        <w:rPr>
-          <w:rFonts w:ascii="Calibri" w:cs="Calibri" w:eastAsia="Calibri" w:hAnsi="Calibri"/>
-          <w:b/>
-          <w:bCs/>
-        </w:rPr>
-        <w:t xml:space="preserve">Protección contra eliminación</w:t>
-      </w:r>
-      <w:r>
-        <w:rPr>
-          <w:rFonts w:ascii="Calibri" w:cs="Calibri" w:eastAsia="Calibri" w:hAnsi="Calibri"/>
-        </w:rPr>
-        <w:t xml:space="preserve">: </w:t>
-      </w:r>
-      <w:r>
-        <w:rPr>
-          <w:rFonts w:ascii="Calibri" w:cs="Calibri" w:eastAsia="Calibri" w:hAnsi="Calibri"/>
-          <w:b/>
-          <w:bCs/>
-        </w:rPr>
-        <w:t xml:space="preserve">desmarca</w:t>
-      </w:r>
-      <w:r>
-        <w:rPr>
-          <w:rFonts w:ascii="Calibri" w:cs="Calibri" w:eastAsia="Calibri" w:hAnsi="Calibri"/>
-        </w:rPr>
-        <w:t xml:space="preserve"> </w:t>
-      </w:r>
-      <w:r>
-        <w:rPr>
-          <w:rFonts w:ascii="Calibri" w:cs="Calibri" w:eastAsia="Calibri" w:hAnsi="Calibri"/>
-          <w:i/>
-          <w:iCs/>
-        </w:rPr>
-        <w:t xml:space="preserve">Activar la protección contra eliminación</w:t>
-      </w:r>
-      <w:r>
-        <w:rPr>
-          <w:rFonts w:ascii="Calibri" w:cs="Calibri" w:eastAsia="Calibri" w:hAnsi="Calibri"/>
-        </w:rPr>
-        <w:t xml:space="preserve"> (si no, no podrás borrar la base al terminar y el Bloque 0 fallará).</w:t>
-      </w:r>
-    </w:p>
-    <w:p>
-      <w:pPr>
-        <w:pStyle w:val="ListParagraph"/>
-        <w:numPr>
-          <w:ilvl w:val="0"/>
-          <w:numId w:val="2"/>
-        </w:numPr>
-        <w:spacing w:after="70" w:line="276"/>
-      </w:pPr>
-      <w:r>
-        <w:rPr>
-          <w:rFonts w:ascii="Calibri" w:cs="Calibri" w:eastAsia="Calibri" w:hAnsi="Calibri"/>
-        </w:rPr>
-        <w:t xml:space="preserve">Copias de seguridad: puedes dejarlas como vienen.</w:t>
-      </w:r>
-    </w:p>
-    <w:p>
-      <w:pPr>
-        <w:pStyle w:val="ListParagraph"/>
-        <w:numPr>
-          <w:ilvl w:val="0"/>
-          <w:numId w:val="19"/>
-        </w:numPr>
-        <w:spacing w:after="70" w:line="276"/>
-      </w:pPr>
-      <w:r>
-        <w:rPr>
-          <w:rFonts w:ascii="Calibri" w:cs="Calibri" w:eastAsia="Calibri" w:hAnsi="Calibri"/>
-        </w:rPr>
-        <w:t xml:space="preserve">Baja hasta </w:t>
-      </w:r>
-      <w:r>
-        <w:rPr>
-          <w:rFonts w:ascii="Calibri" w:cs="Calibri" w:eastAsia="Calibri" w:hAnsi="Calibri"/>
-          <w:b/>
-          <w:bCs/>
-        </w:rPr>
-        <w:t xml:space="preserve">Costos mensuales estimados</w:t>
-      </w:r>
-      <w:r>
-        <w:rPr>
-          <w:rFonts w:ascii="Calibri" w:cs="Calibri" w:eastAsia="Calibri" w:hAnsi="Calibri"/>
-        </w:rPr>
-        <w:t xml:space="preserve"> y comprueba el </w:t>
-      </w:r>
-      <w:r>
-        <w:rPr>
-          <w:rFonts w:ascii="Calibri" w:cs="Calibri" w:eastAsia="Calibri" w:hAnsi="Calibri"/>
-          <w:b/>
-          <w:bCs/>
-        </w:rPr>
-        <w:t xml:space="preserve">Total</w:t>
-      </w:r>
-      <w:r>
-        <w:rPr>
-          <w:rFonts w:ascii="Calibri" w:cs="Calibri" w:eastAsia="Calibri" w:hAnsi="Calibri"/>
-        </w:rPr>
-        <w:t xml:space="preserve"> (unos 15 USD o menos).</w:t>
-      </w:r>
-    </w:p>
-    <w:p>
-      <w:pPr>
-        <w:pStyle w:val="ListParagraph"/>
-        <w:numPr>
-          <w:ilvl w:val="0"/>
-          <w:numId w:val="19"/>
-        </w:numPr>
-        <w:spacing w:after="70" w:line="276"/>
-      </w:pPr>
-      <w:r>
-        <w:rPr>
-          <w:rFonts w:ascii="Calibri" w:cs="Calibri" w:eastAsia="Calibri" w:hAnsi="Calibri"/>
-        </w:rPr>
-        <w:t xml:space="preserve">Presiona el botón naranja </w:t>
-      </w:r>
-      <w:r>
-        <w:rPr>
-          <w:rFonts w:ascii="Calibri" w:cs="Calibri" w:eastAsia="Calibri" w:hAnsi="Calibri"/>
-          <w:b/>
-          <w:bCs/>
-        </w:rPr>
-        <w:t xml:space="preserve">Crear base de datos</w:t>
-      </w:r>
-      <w:r>
-        <w:rPr>
-          <w:rFonts w:ascii="Calibri" w:cs="Calibri" w:eastAsia="Calibri" w:hAnsi="Calibri"/>
-        </w:rPr>
-        <w:t xml:space="preserve">.</w:t>
       </w:r>
     </w:p>
     <w:tbl>

</xml_diff>